<commit_message>
Reframe report as strategic management alignment
Shift tone to engineering and technical-area leadership: business
impact, ownership, decisions required, and TI training commitment.

Co-authored-by: BossPrime <matheussilva030499-oss@users.noreply.github.com>
</commit_message>
<xml_diff>
--- a/docs/Relatorio_Ofensores_Lentidao_Producao.docx
+++ b/docs/Relatorio_Ofensores_Lentidao_Producao.docx
@@ -13,7 +13,21 @@
           <w:color w:val="1F4E79"/>
           <w:sz w:val="32"/>
         </w:rPr>
-        <w:t>Relatório Técnico — Ofensores de Lentidão na Linha de Produção</w:t>
+        <w:t>Posicionamento Estratégico — Ofensores de Lentidão na Produção</w:t>
+      </w:r>
+    </w:p>
+    <w:p>
+      <w:pPr>
+        <w:jc w:val="center"/>
+      </w:pPr>
+      <w:r>
+        <w:rPr>
+          <w:rFonts w:ascii="Calibri" w:hAnsi="Calibri" w:eastAsia="Calibri"/>
+          <w:b w:val="0"/>
+          <w:color w:val="595959"/>
+          <w:sz w:val="24"/>
+        </w:rPr>
+        <w:t>Alinhamento entre TI, Área Técnica e Engenharia</w:t>
       </w:r>
     </w:p>
     <w:tbl>
@@ -110,7 +124,7 @@
                 <w:b/>
                 <w:sz w:val="20"/>
               </w:rPr>
-              <w:t>Áreas envolvidas</w:t>
+              <w:t>Público</w:t>
             </w:r>
           </w:p>
         </w:tc>
@@ -126,7 +140,7 @@
                 <w:b w:val="0"/>
                 <w:sz w:val="20"/>
               </w:rPr>
-              <w:t>TI · Área Técnica · Engenharia</w:t>
+              <w:t>Gerência de Engenharia · Área Técnica · TI</w:t>
             </w:r>
           </w:p>
         </w:tc>
@@ -143,12 +157,12 @@
           <w:b/>
           <w:sz w:val="30"/>
         </w:rPr>
-        <w:t>1. Objetivo</w:t>
+        <w:t>1. Objetivo desta apresentação</w:t>
       </w:r>
     </w:p>
     <w:p>
       <w:pPr>
-        <w:spacing w:after="120"/>
+        <w:spacing w:after="160"/>
       </w:pPr>
       <w:r>
         <w:rPr>
@@ -156,7 +170,7 @@
           <w:b w:val="0"/>
           <w:sz w:val="22"/>
         </w:rPr>
-        <w:t>Apontar os principais erros e motivos que geram lentidão/interrupção nas linhas de produção, com evidências e área responsável, para alinhar TI, Área Técnica e Engenharia.</w:t>
+        <w:t>Deixar claro, para a gerência de Engenharia e da Área Técnica, quais são os reais ofensores de lentidão na linha — com impacto no resultado, responsabilidade e decisão necessária — evitando que a TI continue sendo tratada como causa padrão sem análise de causa raiz.</w:t>
       </w:r>
     </w:p>
     <w:p>
@@ -169,12 +183,12 @@
           <w:b/>
           <w:sz w:val="30"/>
         </w:rPr>
-        <w:t>2. Contexto</w:t>
+        <w:t>2. Mensagem central</w:t>
       </w:r>
     </w:p>
     <w:p>
       <w:pPr>
-        <w:spacing w:after="120"/>
+        <w:spacing w:after="160"/>
       </w:pPr>
       <w:r>
         <w:rPr>
@@ -182,7 +196,20 @@
           <w:b w:val="0"/>
           <w:sz w:val="22"/>
         </w:rPr>
-        <w:t>A TI tem sido acionada como ofensor principal em várias ocorrências, muitas vezes sem verificação completa da causa raiz. Na prática, boa parte dos problemas está ligada a configuração, equipamento e cabeamento — e não à infraestrutura de TI em si.</w:t>
+        <w:t>A lentidão na produção, na maioria das ocorrências recentes, não nasce de falha estrutural da TI. Os ofensores recorrentes estão em configuração, desempenho de posto/equipamento, cabeamento e disciplina de processo.</w:t>
+      </w:r>
+    </w:p>
+    <w:p>
+      <w:pPr>
+        <w:spacing w:after="160"/>
+      </w:pPr>
+      <w:r>
+        <w:rPr>
+          <w:rFonts w:ascii="Calibri" w:hAnsi="Calibri" w:eastAsia="Calibri"/>
+          <w:b w:val="0"/>
+          <w:sz w:val="22"/>
+        </w:rPr>
+        <w:t>Enquanto isso não for tratado de forma conjunta e com dono claro, o problema se repete, o apontamento continua caindo na TI e o tempo de correção aumenta.</w:t>
       </w:r>
     </w:p>
     <w:p>
@@ -195,7 +222,85 @@
           <w:b/>
           <w:sz w:val="30"/>
         </w:rPr>
-        <w:t>3. Principais ofensores (visão para apresentação)</w:t>
+        <w:t>3. Por que isso é estratégico</w:t>
+      </w:r>
+    </w:p>
+    <w:p>
+      <w:pPr>
+        <w:pStyle w:val="ListBullet"/>
+      </w:pPr>
+      <w:r>
+        <w:rPr>
+          <w:rFonts w:ascii="Calibri" w:hAnsi="Calibri" w:eastAsia="Calibri"/>
+          <w:b w:val="0"/>
+          <w:sz w:val="22"/>
+        </w:rPr>
+        <w:t>Impacto direto em ritmo de linha, disponibilidade e produtividade</w:t>
+      </w:r>
+    </w:p>
+    <w:p>
+      <w:pPr>
+        <w:pStyle w:val="ListBullet"/>
+      </w:pPr>
+      <w:r>
+        <w:rPr>
+          <w:rFonts w:ascii="Calibri" w:hAnsi="Calibri" w:eastAsia="Calibri"/>
+          <w:b w:val="0"/>
+          <w:sz w:val="22"/>
+        </w:rPr>
+        <w:t>Retrabalho operacional e desgaste entre áreas</w:t>
+      </w:r>
+    </w:p>
+    <w:p>
+      <w:pPr>
+        <w:pStyle w:val="ListBullet"/>
+      </w:pPr>
+      <w:r>
+        <w:rPr>
+          <w:rFonts w:ascii="Calibri" w:hAnsi="Calibri" w:eastAsia="Calibri"/>
+          <w:b w:val="0"/>
+          <w:sz w:val="22"/>
+        </w:rPr>
+        <w:t>Diagnóstico lento quando a causa é apontada sem evidência</w:t>
+      </w:r>
+    </w:p>
+    <w:p>
+      <w:pPr>
+        <w:pStyle w:val="ListBullet"/>
+      </w:pPr>
+      <w:r>
+        <w:rPr>
+          <w:rFonts w:ascii="Calibri" w:hAnsi="Calibri" w:eastAsia="Calibri"/>
+          <w:b w:val="0"/>
+          <w:sz w:val="22"/>
+        </w:rPr>
+        <w:t>Risco de decisões erradas (investir em TI quando o ofensor é processo/equipamento)</w:t>
+      </w:r>
+    </w:p>
+    <w:p>
+      <w:pPr>
+        <w:pStyle w:val="ListBullet"/>
+      </w:pPr>
+      <w:r>
+        <w:rPr>
+          <w:rFonts w:ascii="Calibri" w:hAnsi="Calibri" w:eastAsia="Calibri"/>
+          <w:b w:val="0"/>
+          <w:sz w:val="22"/>
+        </w:rPr>
+        <w:t>Necessidade de governança: causa raiz → responsável → ação → prazo</w:t>
+      </w:r>
+    </w:p>
+    <w:p>
+      <w:pPr>
+        <w:pStyle w:val="Heading1"/>
+      </w:pPr>
+      <w:r>
+        <w:rPr>
+          <w:rFonts w:ascii="Calibri" w:hAnsi="Calibri" w:eastAsia="Calibri"/>
+          <w:b/>
+          <w:sz w:val="30"/>
+        </w:rPr>
+        <w:t>4. Ofensores prioritários (visão gerencial)</w:t>
       </w:r>
     </w:p>
     <w:tbl>
@@ -206,15 +311,16 @@
         <w:tblLook w:firstColumn="1" w:firstRow="1" w:lastColumn="0" w:lastRow="0" w:noHBand="0" w:noVBand="1" w:val="04A0"/>
       </w:tblPr>
       <w:tblGrid>
-        <w:gridCol w:w="2436"/>
-        <w:gridCol w:w="2436"/>
-        <w:gridCol w:w="2436"/>
-        <w:gridCol w:w="2436"/>
+        <w:gridCol w:w="1949"/>
+        <w:gridCol w:w="1949"/>
+        <w:gridCol w:w="1949"/>
+        <w:gridCol w:w="1949"/>
+        <w:gridCol w:w="1949"/>
       </w:tblGrid>
       <w:tr>
         <w:tc>
           <w:tcPr>
-            <w:tcW w:type="dxa" w:w="2436"/>
+            <w:tcW w:type="dxa" w:w="1949"/>
             <w:shd w:fill="1F4E79" w:val="clear"/>
           </w:tcPr>
           <w:p>
@@ -232,7 +338,7 @@
         </w:tc>
         <w:tc>
           <w:tcPr>
-            <w:tcW w:type="dxa" w:w="2436"/>
+            <w:tcW w:type="dxa" w:w="1949"/>
             <w:shd w:fill="1F4E79" w:val="clear"/>
           </w:tcPr>
           <w:p>
@@ -244,13 +350,13 @@
                 <w:color w:val="FFFFFF"/>
                 <w:sz w:val="18"/>
               </w:rPr>
-              <w:t>Problema / Ofensor</w:t>
+              <w:t>Ofensor</w:t>
             </w:r>
           </w:p>
         </w:tc>
         <w:tc>
           <w:tcPr>
-            <w:tcW w:type="dxa" w:w="2436"/>
+            <w:tcW w:type="dxa" w:w="1949"/>
             <w:shd w:fill="1F4E79" w:val="clear"/>
           </w:tcPr>
           <w:p>
@@ -262,13 +368,13 @@
                 <w:color w:val="FFFFFF"/>
                 <w:sz w:val="18"/>
               </w:rPr>
-              <w:t>Por que causa lentidão</w:t>
+              <w:t>Impacto no negócio</w:t>
             </w:r>
           </w:p>
         </w:tc>
         <w:tc>
           <w:tcPr>
-            <w:tcW w:type="dxa" w:w="2436"/>
+            <w:tcW w:type="dxa" w:w="1949"/>
             <w:shd w:fill="1F4E79" w:val="clear"/>
           </w:tcPr>
           <w:p>
@@ -280,7 +386,25 @@
                 <w:color w:val="FFFFFF"/>
                 <w:sz w:val="18"/>
               </w:rPr>
-              <w:t>Área responsável</w:t>
+              <w:t>Responsabilidade primária</w:t>
+            </w:r>
+          </w:p>
+        </w:tc>
+        <w:tc>
+          <w:tcPr>
+            <w:tcW w:type="dxa" w:w="1949"/>
+            <w:shd w:fill="1F4E79" w:val="clear"/>
+          </w:tcPr>
+          <w:p>
+            <w:r/>
+            <w:r>
+              <w:rPr>
+                <w:rFonts w:ascii="Calibri" w:hAnsi="Calibri" w:eastAsia="Calibri"/>
+                <w:b/>
+                <w:color w:val="FFFFFF"/>
+                <w:sz w:val="18"/>
+              </w:rPr>
+              <w:t>Decisão necessária</w:t>
             </w:r>
           </w:p>
         </w:tc>
@@ -288,7 +412,7 @@
       <w:tr>
         <w:tc>
           <w:tcPr>
-            <w:tcW w:type="dxa" w:w="2436"/>
+            <w:tcW w:type="dxa" w:w="1949"/>
           </w:tcPr>
           <w:p>
             <w:r/>
@@ -304,7 +428,7 @@
         </w:tc>
         <w:tc>
           <w:tcPr>
-            <w:tcW w:type="dxa" w:w="2436"/>
+            <w:tcW w:type="dxa" w:w="1949"/>
           </w:tcPr>
           <w:p>
             <w:r/>
@@ -320,7 +444,7 @@
         </w:tc>
         <w:tc>
           <w:tcPr>
-            <w:tcW w:type="dxa" w:w="2436"/>
+            <w:tcW w:type="dxa" w:w="1949"/>
           </w:tcPr>
           <w:p>
             <w:r/>
@@ -330,13 +454,13 @@
                 <w:b w:val="0"/>
                 <w:sz w:val="18"/>
               </w:rPr>
-              <w:t>Posto lento, timeout e fila no ciclo da linha</w:t>
+              <w:t>Perda de ciclo, fila e falsa percepção de “sistema lento”</w:t>
             </w:r>
           </w:p>
         </w:tc>
         <w:tc>
           <w:tcPr>
-            <w:tcW w:type="dxa" w:w="2436"/>
+            <w:tcW w:type="dxa" w:w="1949"/>
           </w:tcPr>
           <w:p>
             <w:r/>
@@ -350,11 +474,27 @@
             </w:r>
           </w:p>
         </w:tc>
+        <w:tc>
+          <w:tcPr>
+            <w:tcW w:type="dxa" w:w="1949"/>
+          </w:tcPr>
+          <w:p>
+            <w:r/>
+            <w:r>
+              <w:rPr>
+                <w:rFonts w:ascii="Calibri" w:hAnsi="Calibri" w:eastAsia="Calibri"/>
+                <w:b w:val="0"/>
+                <w:sz w:val="18"/>
+              </w:rPr>
+              <w:t>Definir spec mínima e plano de upgrade/substituição</w:t>
+            </w:r>
+          </w:p>
+        </w:tc>
       </w:tr>
       <w:tr>
         <w:tc>
           <w:tcPr>
-            <w:tcW w:type="dxa" w:w="2436"/>
+            <w:tcW w:type="dxa" w:w="1949"/>
           </w:tcPr>
           <w:p>
             <w:r/>
@@ -370,7 +510,7 @@
         </w:tc>
         <w:tc>
           <w:tcPr>
-            <w:tcW w:type="dxa" w:w="2436"/>
+            <w:tcW w:type="dxa" w:w="1949"/>
           </w:tcPr>
           <w:p>
             <w:r/>
@@ -386,7 +526,7 @@
         </w:tc>
         <w:tc>
           <w:tcPr>
-            <w:tcW w:type="dxa" w:w="2436"/>
+            <w:tcW w:type="dxa" w:w="1949"/>
           </w:tcPr>
           <w:p>
             <w:r/>
@@ -396,13 +536,13 @@
                 <w:b w:val="0"/>
                 <w:sz w:val="18"/>
               </w:rPr>
-              <w:t>Queda de link, retransmissão e comunicação instável</w:t>
+              <w:t>Instabilidade de comunicação e paradas intermitentes</w:t>
             </w:r>
           </w:p>
         </w:tc>
         <w:tc>
           <w:tcPr>
-            <w:tcW w:type="dxa" w:w="2436"/>
+            <w:tcW w:type="dxa" w:w="1949"/>
           </w:tcPr>
           <w:p>
             <w:r/>
@@ -416,11 +556,27 @@
             </w:r>
           </w:p>
         </w:tc>
+        <w:tc>
+          <w:tcPr>
+            <w:tcW w:type="dxa" w:w="1949"/>
+          </w:tcPr>
+          <w:p>
+            <w:r/>
+            <w:r>
+              <w:rPr>
+                <w:rFonts w:ascii="Calibri" w:hAnsi="Calibri" w:eastAsia="Calibri"/>
+                <w:b w:val="0"/>
+                <w:sz w:val="18"/>
+              </w:rPr>
+              <w:t>Padronizar e substituir trechos críticos</w:t>
+            </w:r>
+          </w:p>
+        </w:tc>
       </w:tr>
       <w:tr>
         <w:tc>
           <w:tcPr>
-            <w:tcW w:type="dxa" w:w="2436"/>
+            <w:tcW w:type="dxa" w:w="1949"/>
           </w:tcPr>
           <w:p>
             <w:r/>
@@ -436,7 +592,7 @@
         </w:tc>
         <w:tc>
           <w:tcPr>
-            <w:tcW w:type="dxa" w:w="2436"/>
+            <w:tcW w:type="dxa" w:w="1949"/>
           </w:tcPr>
           <w:p>
             <w:r/>
@@ -452,7 +608,7 @@
         </w:tc>
         <w:tc>
           <w:tcPr>
-            <w:tcW w:type="dxa" w:w="2436"/>
+            <w:tcW w:type="dxa" w:w="1949"/>
           </w:tcPr>
           <w:p>
             <w:r/>
@@ -462,13 +618,13 @@
                 <w:b w:val="0"/>
                 <w:sz w:val="18"/>
               </w:rPr>
-              <w:t>Modelo/postos/IPs errados param ou travam o fluxo</w:t>
+              <w:t>Parada imediata, retrabalho e atraso de liberação</w:t>
             </w:r>
           </w:p>
         </w:tc>
         <w:tc>
           <w:tcPr>
-            <w:tcW w:type="dxa" w:w="2436"/>
+            <w:tcW w:type="dxa" w:w="1949"/>
           </w:tcPr>
           <w:p>
             <w:r/>
@@ -482,11 +638,27 @@
             </w:r>
           </w:p>
         </w:tc>
+        <w:tc>
+          <w:tcPr>
+            <w:tcW w:type="dxa" w:w="1949"/>
+          </w:tcPr>
+          <w:p>
+            <w:r/>
+            <w:r>
+              <w:rPr>
+                <w:rFonts w:ascii="Calibri" w:hAnsi="Calibri" w:eastAsia="Calibri"/>
+                <w:b w:val="0"/>
+                <w:sz w:val="18"/>
+              </w:rPr>
+              <w:t>Controle de liberação (checklist + dupla verificação)</w:t>
+            </w:r>
+          </w:p>
+        </w:tc>
       </w:tr>
       <w:tr>
         <w:tc>
           <w:tcPr>
-            <w:tcW w:type="dxa" w:w="2436"/>
+            <w:tcW w:type="dxa" w:w="1949"/>
           </w:tcPr>
           <w:p>
             <w:r/>
@@ -502,7 +674,7 @@
         </w:tc>
         <w:tc>
           <w:tcPr>
-            <w:tcW w:type="dxa" w:w="2436"/>
+            <w:tcW w:type="dxa" w:w="1949"/>
           </w:tcPr>
           <w:p>
             <w:r/>
@@ -518,7 +690,7 @@
         </w:tc>
         <w:tc>
           <w:tcPr>
-            <w:tcW w:type="dxa" w:w="2436"/>
+            <w:tcW w:type="dxa" w:w="1949"/>
           </w:tcPr>
           <w:p>
             <w:r/>
@@ -528,13 +700,13 @@
                 <w:b w:val="0"/>
                 <w:sz w:val="18"/>
               </w:rPr>
-              <w:t>Conflito de rede: posto some ou perde conexão</w:t>
+              <w:t>Queda de comunicação e interrupção crítica</w:t>
             </w:r>
           </w:p>
         </w:tc>
         <w:tc>
           <w:tcPr>
-            <w:tcW w:type="dxa" w:w="2436"/>
+            <w:tcW w:type="dxa" w:w="1949"/>
           </w:tcPr>
           <w:p>
             <w:r/>
@@ -548,11 +720,27 @@
             </w:r>
           </w:p>
         </w:tc>
+        <w:tc>
+          <w:tcPr>
+            <w:tcW w:type="dxa" w:w="1949"/>
+          </w:tcPr>
+          <w:p>
+            <w:r/>
+            <w:r>
+              <w:rPr>
+                <w:rFonts w:ascii="Calibri" w:hAnsi="Calibri" w:eastAsia="Calibri"/>
+                <w:b w:val="0"/>
+                <w:sz w:val="18"/>
+              </w:rPr>
+              <w:t>Plano de endereçamento e bloqueio de alteração informal</w:t>
+            </w:r>
+          </w:p>
+        </w:tc>
       </w:tr>
       <w:tr>
         <w:tc>
           <w:tcPr>
-            <w:tcW w:type="dxa" w:w="2436"/>
+            <w:tcW w:type="dxa" w:w="1949"/>
           </w:tcPr>
           <w:p>
             <w:r/>
@@ -568,7 +756,7 @@
         </w:tc>
         <w:tc>
           <w:tcPr>
-            <w:tcW w:type="dxa" w:w="2436"/>
+            <w:tcW w:type="dxa" w:w="1949"/>
           </w:tcPr>
           <w:p>
             <w:r/>
@@ -584,7 +772,7 @@
         </w:tc>
         <w:tc>
           <w:tcPr>
-            <w:tcW w:type="dxa" w:w="2436"/>
+            <w:tcW w:type="dxa" w:w="1949"/>
           </w:tcPr>
           <w:p>
             <w:r/>
@@ -594,13 +782,13 @@
                 <w:b w:val="0"/>
                 <w:sz w:val="18"/>
               </w:rPr>
-              <w:t>Travamento e demora na tela/aplicação do posto</w:t>
+              <w:t>Travamento de posto e perda de produtividade</w:t>
             </w:r>
           </w:p>
         </w:tc>
         <w:tc>
           <w:tcPr>
-            <w:tcW w:type="dxa" w:w="2436"/>
+            <w:tcW w:type="dxa" w:w="1949"/>
           </w:tcPr>
           <w:p>
             <w:r/>
@@ -614,11 +802,27 @@
             </w:r>
           </w:p>
         </w:tc>
+        <w:tc>
+          <w:tcPr>
+            <w:tcW w:type="dxa" w:w="1949"/>
+          </w:tcPr>
+          <w:p>
+            <w:r/>
+            <w:r>
+              <w:rPr>
+                <w:rFonts w:ascii="Calibri" w:hAnsi="Calibri" w:eastAsia="Calibri"/>
+                <w:b w:val="0"/>
+                <w:sz w:val="18"/>
+              </w:rPr>
+              <w:t>Adequar hardware ao software/processo atual</w:t>
+            </w:r>
+          </w:p>
+        </w:tc>
       </w:tr>
       <w:tr>
         <w:tc>
           <w:tcPr>
-            <w:tcW w:type="dxa" w:w="2436"/>
+            <w:tcW w:type="dxa" w:w="1949"/>
           </w:tcPr>
           <w:p>
             <w:r/>
@@ -634,7 +838,7 @@
         </w:tc>
         <w:tc>
           <w:tcPr>
-            <w:tcW w:type="dxa" w:w="2436"/>
+            <w:tcW w:type="dxa" w:w="1949"/>
           </w:tcPr>
           <w:p>
             <w:r/>
@@ -644,13 +848,13 @@
                 <w:b w:val="0"/>
                 <w:sz w:val="18"/>
               </w:rPr>
-              <w:t>Desorganização do que passou/não passou</w:t>
+              <w:t>Desorganização passou/não passou</w:t>
             </w:r>
           </w:p>
         </w:tc>
         <w:tc>
           <w:tcPr>
-            <w:tcW w:type="dxa" w:w="2436"/>
+            <w:tcW w:type="dxa" w:w="1949"/>
           </w:tcPr>
           <w:p>
             <w:r/>
@@ -660,13 +864,13 @@
                 <w:b w:val="0"/>
                 <w:sz w:val="18"/>
               </w:rPr>
-              <w:t>Retrabalho, parada para conferência e perda de ritmo</w:t>
+              <w:t>Retrabalho, perda de rastreabilidade e tempo improdutivo</w:t>
             </w:r>
           </w:p>
         </w:tc>
         <w:tc>
           <w:tcPr>
-            <w:tcW w:type="dxa" w:w="2436"/>
+            <w:tcW w:type="dxa" w:w="1949"/>
           </w:tcPr>
           <w:p>
             <w:r/>
@@ -677,6 +881,22 @@
                 <w:sz w:val="18"/>
               </w:rPr>
               <w:t>Engenharia / Área Técnica</w:t>
+            </w:r>
+          </w:p>
+        </w:tc>
+        <w:tc>
+          <w:tcPr>
+            <w:tcW w:type="dxa" w:w="1949"/>
+          </w:tcPr>
+          <w:p>
+            <w:r/>
+            <w:r>
+              <w:rPr>
+                <w:rFonts w:ascii="Calibri" w:hAnsi="Calibri" w:eastAsia="Calibri"/>
+                <w:b w:val="0"/>
+                <w:sz w:val="18"/>
+              </w:rPr>
+              <w:t>Padronizar status e disciplina de apontamento</w:t>
             </w:r>
           </w:p>
         </w:tc>
@@ -693,25 +913,12 @@
           <w:b/>
           <w:sz w:val="30"/>
         </w:rPr>
-        <w:t>4. Detalhamento dos ofensores</w:t>
+        <w:t>5. Evidências (anexos)</w:t>
       </w:r>
     </w:p>
     <w:p>
       <w:pPr>
-        <w:pStyle w:val="Heading2"/>
-      </w:pPr>
-      <w:r>
-        <w:rPr>
-          <w:rFonts w:ascii="Calibri" w:hAnsi="Calibri" w:eastAsia="Calibri"/>
-          <w:b/>
-          <w:sz w:val="24"/>
-        </w:rPr>
-        <w:t>4.1 RAPs com baixa eficiência</w:t>
-      </w:r>
-    </w:p>
-    <w:p>
-      <w:pPr>
-        <w:spacing w:after="120"/>
+        <w:spacing w:after="160"/>
       </w:pPr>
       <w:r>
         <w:rPr>
@@ -719,20 +926,569 @@
           <w:b w:val="0"/>
           <w:sz w:val="22"/>
         </w:rPr>
-        <w:t>Hardware/desempenho abaixo do necessário para o ciclo.</w:t>
+        <w:t>As evidências (prints/fotos) serão anexadas para comprovar cada ofensor e sustentar a discussão gerencial:</w:t>
       </w:r>
     </w:p>
+    <w:tbl>
+      <w:tblPr>
+        <w:tblStyle w:val="TableGrid"/>
+        <w:tblW w:type="auto" w:w="0"/>
+        <w:jc w:val="center"/>
+        <w:tblLook w:firstColumn="1" w:firstRow="1" w:lastColumn="0" w:lastRow="0" w:noHBand="0" w:noVBand="1" w:val="04A0"/>
+      </w:tblPr>
+      <w:tblGrid>
+        <w:gridCol w:w="3249"/>
+        <w:gridCol w:w="3249"/>
+        <w:gridCol w:w="3249"/>
+      </w:tblGrid>
+      <w:tr>
+        <w:tc>
+          <w:tcPr>
+            <w:tcW w:type="dxa" w:w="3249"/>
+            <w:shd w:fill="1F4E79" w:val="clear"/>
+          </w:tcPr>
+          <w:p>
+            <w:r/>
+            <w:r>
+              <w:rPr>
+                <w:rFonts w:ascii="Calibri" w:hAnsi="Calibri" w:eastAsia="Calibri"/>
+                <w:b/>
+                <w:color w:val="FFFFFF"/>
+                <w:sz w:val="18"/>
+              </w:rPr>
+              <w:t>Anexo</w:t>
+            </w:r>
+          </w:p>
+        </w:tc>
+        <w:tc>
+          <w:tcPr>
+            <w:tcW w:type="dxa" w:w="3249"/>
+            <w:shd w:fill="1F4E79" w:val="clear"/>
+          </w:tcPr>
+          <w:p>
+            <w:r/>
+            <w:r>
+              <w:rPr>
+                <w:rFonts w:ascii="Calibri" w:hAnsi="Calibri" w:eastAsia="Calibri"/>
+                <w:b/>
+                <w:color w:val="FFFFFF"/>
+                <w:sz w:val="18"/>
+              </w:rPr>
+              <w:t>Ofensor</w:t>
+            </w:r>
+          </w:p>
+        </w:tc>
+        <w:tc>
+          <w:tcPr>
+            <w:tcW w:type="dxa" w:w="3249"/>
+            <w:shd w:fill="1F4E79" w:val="clear"/>
+          </w:tcPr>
+          <w:p>
+            <w:r/>
+            <w:r>
+              <w:rPr>
+                <w:rFonts w:ascii="Calibri" w:hAnsi="Calibri" w:eastAsia="Calibri"/>
+                <w:b/>
+                <w:color w:val="FFFFFF"/>
+                <w:sz w:val="18"/>
+              </w:rPr>
+              <w:t>Evidência</w:t>
+            </w:r>
+          </w:p>
+        </w:tc>
+      </w:tr>
+      <w:tr>
+        <w:tc>
+          <w:tcPr>
+            <w:tcW w:type="dxa" w:w="3249"/>
+          </w:tcPr>
+          <w:p>
+            <w:r/>
+            <w:r>
+              <w:rPr>
+                <w:rFonts w:ascii="Calibri" w:hAnsi="Calibri" w:eastAsia="Calibri"/>
+                <w:b w:val="0"/>
+                <w:sz w:val="18"/>
+              </w:rPr>
+              <w:t>A</w:t>
+            </w:r>
+          </w:p>
+        </w:tc>
+        <w:tc>
+          <w:tcPr>
+            <w:tcW w:type="dxa" w:w="3249"/>
+          </w:tcPr>
+          <w:p>
+            <w:r/>
+            <w:r>
+              <w:rPr>
+                <w:rFonts w:ascii="Calibri" w:hAnsi="Calibri" w:eastAsia="Calibri"/>
+                <w:b w:val="0"/>
+                <w:sz w:val="18"/>
+              </w:rPr>
+              <w:t>RAPs baixa eficiência</w:t>
+            </w:r>
+          </w:p>
+        </w:tc>
+        <w:tc>
+          <w:tcPr>
+            <w:tcW w:type="dxa" w:w="3249"/>
+          </w:tcPr>
+          <w:p>
+            <w:r/>
+            <w:r>
+              <w:rPr>
+                <w:rFonts w:ascii="Calibri" w:hAnsi="Calibri" w:eastAsia="Calibri"/>
+                <w:b w:val="0"/>
+                <w:sz w:val="18"/>
+              </w:rPr>
+              <w:t>[ ] Print/foto</w:t>
+            </w:r>
+          </w:p>
+        </w:tc>
+      </w:tr>
+      <w:tr>
+        <w:tc>
+          <w:tcPr>
+            <w:tcW w:type="dxa" w:w="3249"/>
+          </w:tcPr>
+          <w:p>
+            <w:r/>
+            <w:r>
+              <w:rPr>
+                <w:rFonts w:ascii="Calibri" w:hAnsi="Calibri" w:eastAsia="Calibri"/>
+                <w:b w:val="0"/>
+                <w:sz w:val="18"/>
+              </w:rPr>
+              <w:t>B</w:t>
+            </w:r>
+          </w:p>
+        </w:tc>
+        <w:tc>
+          <w:tcPr>
+            <w:tcW w:type="dxa" w:w="3249"/>
+          </w:tcPr>
+          <w:p>
+            <w:r/>
+            <w:r>
+              <w:rPr>
+                <w:rFonts w:ascii="Calibri" w:hAnsi="Calibri" w:eastAsia="Calibri"/>
+                <w:b w:val="0"/>
+                <w:sz w:val="18"/>
+              </w:rPr>
+              <w:t>Cabos Cat5</w:t>
+            </w:r>
+          </w:p>
+        </w:tc>
+        <w:tc>
+          <w:tcPr>
+            <w:tcW w:type="dxa" w:w="3249"/>
+          </w:tcPr>
+          <w:p>
+            <w:r/>
+            <w:r>
+              <w:rPr>
+                <w:rFonts w:ascii="Calibri" w:hAnsi="Calibri" w:eastAsia="Calibri"/>
+                <w:b w:val="0"/>
+                <w:sz w:val="18"/>
+              </w:rPr>
+              <w:t>[ ] Print/foto</w:t>
+            </w:r>
+          </w:p>
+        </w:tc>
+      </w:tr>
+      <w:tr>
+        <w:tc>
+          <w:tcPr>
+            <w:tcW w:type="dxa" w:w="3249"/>
+          </w:tcPr>
+          <w:p>
+            <w:r/>
+            <w:r>
+              <w:rPr>
+                <w:rFonts w:ascii="Calibri" w:hAnsi="Calibri" w:eastAsia="Calibri"/>
+                <w:b w:val="0"/>
+                <w:sz w:val="18"/>
+              </w:rPr>
+              <w:t>C</w:t>
+            </w:r>
+          </w:p>
+        </w:tc>
+        <w:tc>
+          <w:tcPr>
+            <w:tcW w:type="dxa" w:w="3249"/>
+          </w:tcPr>
+          <w:p>
+            <w:r/>
+            <w:r>
+              <w:rPr>
+                <w:rFonts w:ascii="Calibri" w:hAnsi="Calibri" w:eastAsia="Calibri"/>
+                <w:b w:val="0"/>
+                <w:sz w:val="18"/>
+              </w:rPr>
+              <w:t>Erro de roteiro</w:t>
+            </w:r>
+          </w:p>
+        </w:tc>
+        <w:tc>
+          <w:tcPr>
+            <w:tcW w:type="dxa" w:w="3249"/>
+          </w:tcPr>
+          <w:p>
+            <w:r/>
+            <w:r>
+              <w:rPr>
+                <w:rFonts w:ascii="Calibri" w:hAnsi="Calibri" w:eastAsia="Calibri"/>
+                <w:b w:val="0"/>
+                <w:sz w:val="18"/>
+              </w:rPr>
+              <w:t>[ ] Print/foto</w:t>
+            </w:r>
+          </w:p>
+        </w:tc>
+      </w:tr>
+      <w:tr>
+        <w:tc>
+          <w:tcPr>
+            <w:tcW w:type="dxa" w:w="3249"/>
+          </w:tcPr>
+          <w:p>
+            <w:r/>
+            <w:r>
+              <w:rPr>
+                <w:rFonts w:ascii="Calibri" w:hAnsi="Calibri" w:eastAsia="Calibri"/>
+                <w:b w:val="0"/>
+                <w:sz w:val="18"/>
+              </w:rPr>
+              <w:t>D</w:t>
+            </w:r>
+          </w:p>
+        </w:tc>
+        <w:tc>
+          <w:tcPr>
+            <w:tcW w:type="dxa" w:w="3249"/>
+          </w:tcPr>
+          <w:p>
+            <w:r/>
+            <w:r>
+              <w:rPr>
+                <w:rFonts w:ascii="Calibri" w:hAnsi="Calibri" w:eastAsia="Calibri"/>
+                <w:b w:val="0"/>
+                <w:sz w:val="18"/>
+              </w:rPr>
+              <w:t>IP duplicado</w:t>
+            </w:r>
+          </w:p>
+        </w:tc>
+        <w:tc>
+          <w:tcPr>
+            <w:tcW w:type="dxa" w:w="3249"/>
+          </w:tcPr>
+          <w:p>
+            <w:r/>
+            <w:r>
+              <w:rPr>
+                <w:rFonts w:ascii="Calibri" w:hAnsi="Calibri" w:eastAsia="Calibri"/>
+                <w:b w:val="0"/>
+                <w:sz w:val="18"/>
+              </w:rPr>
+              <w:t>[ ] Print/foto</w:t>
+            </w:r>
+          </w:p>
+        </w:tc>
+      </w:tr>
+      <w:tr>
+        <w:tc>
+          <w:tcPr>
+            <w:tcW w:type="dxa" w:w="3249"/>
+          </w:tcPr>
+          <w:p>
+            <w:r/>
+            <w:r>
+              <w:rPr>
+                <w:rFonts w:ascii="Calibri" w:hAnsi="Calibri" w:eastAsia="Calibri"/>
+                <w:b w:val="0"/>
+                <w:sz w:val="18"/>
+              </w:rPr>
+              <w:t>E</w:t>
+            </w:r>
+          </w:p>
+        </w:tc>
+        <w:tc>
+          <w:tcPr>
+            <w:tcW w:type="dxa" w:w="3249"/>
+          </w:tcPr>
+          <w:p>
+            <w:r/>
+            <w:r>
+              <w:rPr>
+                <w:rFonts w:ascii="Calibri" w:hAnsi="Calibri" w:eastAsia="Calibri"/>
+                <w:b w:val="0"/>
+                <w:sz w:val="18"/>
+              </w:rPr>
+              <w:t>PCs baixa performance</w:t>
+            </w:r>
+          </w:p>
+        </w:tc>
+        <w:tc>
+          <w:tcPr>
+            <w:tcW w:type="dxa" w:w="3249"/>
+          </w:tcPr>
+          <w:p>
+            <w:r/>
+            <w:r>
+              <w:rPr>
+                <w:rFonts w:ascii="Calibri" w:hAnsi="Calibri" w:eastAsia="Calibri"/>
+                <w:b w:val="0"/>
+                <w:sz w:val="18"/>
+              </w:rPr>
+              <w:t>[ ] Print/foto</w:t>
+            </w:r>
+          </w:p>
+        </w:tc>
+      </w:tr>
+      <w:tr>
+        <w:tc>
+          <w:tcPr>
+            <w:tcW w:type="dxa" w:w="3249"/>
+          </w:tcPr>
+          <w:p>
+            <w:r/>
+            <w:r>
+              <w:rPr>
+                <w:rFonts w:ascii="Calibri" w:hAnsi="Calibri" w:eastAsia="Calibri"/>
+                <w:b w:val="0"/>
+                <w:sz w:val="18"/>
+              </w:rPr>
+              <w:t>F</w:t>
+            </w:r>
+          </w:p>
+        </w:tc>
+        <w:tc>
+          <w:tcPr>
+            <w:tcW w:type="dxa" w:w="3249"/>
+          </w:tcPr>
+          <w:p>
+            <w:r/>
+            <w:r>
+              <w:rPr>
+                <w:rFonts w:ascii="Calibri" w:hAnsi="Calibri" w:eastAsia="Calibri"/>
+                <w:b w:val="0"/>
+                <w:sz w:val="18"/>
+              </w:rPr>
+              <w:t>Passou / não passou</w:t>
+            </w:r>
+          </w:p>
+        </w:tc>
+        <w:tc>
+          <w:tcPr>
+            <w:tcW w:type="dxa" w:w="3249"/>
+          </w:tcPr>
+          <w:p>
+            <w:r/>
+            <w:r>
+              <w:rPr>
+                <w:rFonts w:ascii="Calibri" w:hAnsi="Calibri" w:eastAsia="Calibri"/>
+                <w:b w:val="0"/>
+                <w:sz w:val="18"/>
+              </w:rPr>
+              <w:t>[ ] Print/foto</w:t>
+            </w:r>
+          </w:p>
+        </w:tc>
+      </w:tr>
+    </w:tbl>
+    <w:p/>
     <w:p>
       <w:pPr>
-        <w:spacing w:after="40"/>
+        <w:pStyle w:val="Heading1"/>
       </w:pPr>
       <w:r>
         <w:rPr>
           <w:rFonts w:ascii="Calibri" w:hAnsi="Calibri" w:eastAsia="Calibri"/>
           <w:b/>
+          <w:sz w:val="30"/>
+        </w:rPr>
+        <w:t>6. Papéis e responsabilidades</w:t>
+      </w:r>
+    </w:p>
+    <w:tbl>
+      <w:tblPr>
+        <w:tblStyle w:val="TableGrid"/>
+        <w:tblW w:type="auto" w:w="0"/>
+        <w:jc w:val="center"/>
+        <w:tblLook w:firstColumn="1" w:firstRow="1" w:lastColumn="0" w:lastRow="0" w:noHBand="0" w:noVBand="1" w:val="04A0"/>
+      </w:tblPr>
+      <w:tblGrid>
+        <w:gridCol w:w="4873"/>
+        <w:gridCol w:w="4873"/>
+      </w:tblGrid>
+      <w:tr>
+        <w:tc>
+          <w:tcPr>
+            <w:tcW w:type="dxa" w:w="4873"/>
+            <w:shd w:fill="1F4E79" w:val="clear"/>
+          </w:tcPr>
+          <w:p>
+            <w:r/>
+            <w:r>
+              <w:rPr>
+                <w:rFonts w:ascii="Calibri" w:hAnsi="Calibri" w:eastAsia="Calibri"/>
+                <w:b/>
+                <w:color w:val="FFFFFF"/>
+                <w:sz w:val="18"/>
+              </w:rPr>
+              <w:t>Área</w:t>
+            </w:r>
+          </w:p>
+        </w:tc>
+        <w:tc>
+          <w:tcPr>
+            <w:tcW w:type="dxa" w:w="4873"/>
+            <w:shd w:fill="1F4E79" w:val="clear"/>
+          </w:tcPr>
+          <w:p>
+            <w:r/>
+            <w:r>
+              <w:rPr>
+                <w:rFonts w:ascii="Calibri" w:hAnsi="Calibri" w:eastAsia="Calibri"/>
+                <w:b/>
+                <w:color w:val="FFFFFF"/>
+                <w:sz w:val="18"/>
+              </w:rPr>
+              <w:t>Papel estratégico</w:t>
+            </w:r>
+          </w:p>
+        </w:tc>
+      </w:tr>
+      <w:tr>
+        <w:tc>
+          <w:tcPr>
+            <w:tcW w:type="dxa" w:w="4873"/>
+          </w:tcPr>
+          <w:p>
+            <w:r/>
+            <w:r>
+              <w:rPr>
+                <w:rFonts w:ascii="Calibri" w:hAnsi="Calibri" w:eastAsia="Calibri"/>
+                <w:b w:val="0"/>
+                <w:sz w:val="18"/>
+              </w:rPr>
+              <w:t>Engenharia</w:t>
+            </w:r>
+          </w:p>
+        </w:tc>
+        <w:tc>
+          <w:tcPr>
+            <w:tcW w:type="dxa" w:w="4873"/>
+          </w:tcPr>
+          <w:p>
+            <w:r/>
+            <w:r>
+              <w:rPr>
+                <w:rFonts w:ascii="Calibri" w:hAnsi="Calibri" w:eastAsia="Calibri"/>
+                <w:b w:val="0"/>
+                <w:sz w:val="18"/>
+              </w:rPr>
+              <w:t>Garantir configuração correta de roteiro/modelo/postos e padronização de processo</w:t>
+            </w:r>
+          </w:p>
+        </w:tc>
+      </w:tr>
+      <w:tr>
+        <w:tc>
+          <w:tcPr>
+            <w:tcW w:type="dxa" w:w="4873"/>
+          </w:tcPr>
+          <w:p>
+            <w:r/>
+            <w:r>
+              <w:rPr>
+                <w:rFonts w:ascii="Calibri" w:hAnsi="Calibri" w:eastAsia="Calibri"/>
+                <w:b w:val="0"/>
+                <w:sz w:val="18"/>
+              </w:rPr>
+              <w:t>Área Técnica</w:t>
+            </w:r>
+          </w:p>
+        </w:tc>
+        <w:tc>
+          <w:tcPr>
+            <w:tcW w:type="dxa" w:w="4873"/>
+          </w:tcPr>
+          <w:p>
+            <w:r/>
+            <w:r>
+              <w:rPr>
+                <w:rFonts w:ascii="Calibri" w:hAnsi="Calibri" w:eastAsia="Calibri"/>
+                <w:b w:val="0"/>
+                <w:sz w:val="18"/>
+              </w:rPr>
+              <w:t>Garantir condição do posto (equipamento, cabo, IP, desempenho) e disciplina operacional</w:t>
+            </w:r>
+          </w:p>
+        </w:tc>
+      </w:tr>
+      <w:tr>
+        <w:tc>
+          <w:tcPr>
+            <w:tcW w:type="dxa" w:w="4873"/>
+          </w:tcPr>
+          <w:p>
+            <w:r/>
+            <w:r>
+              <w:rPr>
+                <w:rFonts w:ascii="Calibri" w:hAnsi="Calibri" w:eastAsia="Calibri"/>
+                <w:b w:val="0"/>
+                <w:sz w:val="18"/>
+              </w:rPr>
+              <w:t>TI</w:t>
+            </w:r>
+          </w:p>
+        </w:tc>
+        <w:tc>
+          <w:tcPr>
+            <w:tcW w:type="dxa" w:w="4873"/>
+          </w:tcPr>
+          <w:p>
+            <w:r/>
+            <w:r>
+              <w:rPr>
+                <w:rFonts w:ascii="Calibri" w:hAnsi="Calibri" w:eastAsia="Calibri"/>
+                <w:b w:val="0"/>
+                <w:sz w:val="18"/>
+              </w:rPr>
+              <w:t>Apoiar diagnóstico com evidência, mapear conflitos de rede/sistema e capacitar as áreas</w:t>
+            </w:r>
+          </w:p>
+        </w:tc>
+      </w:tr>
+    </w:tbl>
+    <w:p/>
+    <w:p>
+      <w:pPr>
+        <w:pStyle w:val="Heading1"/>
+      </w:pPr>
+      <w:r>
+        <w:rPr>
+          <w:rFonts w:ascii="Calibri" w:hAnsi="Calibri" w:eastAsia="Calibri"/>
+          <w:b/>
+          <w:sz w:val="30"/>
+        </w:rPr>
+        <w:t>7. Compromisso da TI — Treinamento</w:t>
+      </w:r>
+    </w:p>
+    <w:p>
+      <w:pPr>
+        <w:spacing w:after="160"/>
+      </w:pPr>
+      <w:r>
+        <w:rPr>
+          <w:rFonts w:ascii="Calibri" w:hAnsi="Calibri" w:eastAsia="Calibri"/>
+          <w:b w:val="0"/>
           <w:sz w:val="22"/>
         </w:rPr>
-        <w:t>Sintomas:</w:t>
+        <w:t>Para reduzir reincidência e melhorar a qualidade do primeiro diagnóstico, a TI realizará treinamento direcionado à Área Técnica e Engenharia, cobrindo:</w:t>
       </w:r>
     </w:p>
     <w:p>
@@ -745,678 +1501,7 @@
           <w:b w:val="0"/>
           <w:sz w:val="22"/>
         </w:rPr>
-        <w:t>Demora para carregar/confirmar</w:t>
-      </w:r>
-    </w:p>
-    <w:p>
-      <w:pPr>
-        <w:pStyle w:val="ListBullet"/>
-      </w:pPr>
-      <w:r>
-        <w:rPr>
-          <w:rFonts w:ascii="Calibri" w:hAnsi="Calibri" w:eastAsia="Calibri"/>
-          <w:b w:val="0"/>
-          <w:sz w:val="22"/>
-        </w:rPr>
-        <w:t>Timeouts</w:t>
-      </w:r>
-    </w:p>
-    <w:p>
-      <w:pPr>
-        <w:pStyle w:val="ListBullet"/>
-      </w:pPr>
-      <w:r>
-        <w:rPr>
-          <w:rFonts w:ascii="Calibri" w:hAnsi="Calibri" w:eastAsia="Calibri"/>
-          <w:b w:val="0"/>
-          <w:sz w:val="22"/>
-        </w:rPr>
-        <w:t>Fila no posto</w:t>
-      </w:r>
-    </w:p>
-    <w:p>
-      <w:r>
-        <w:rPr>
-          <w:rFonts w:ascii="Calibri" w:hAnsi="Calibri" w:eastAsia="Calibri"/>
-          <w:b/>
-          <w:sz w:val="22"/>
-        </w:rPr>
-        <w:t xml:space="preserve">Responsável: </w:t>
-      </w:r>
-      <w:r>
-        <w:rPr>
-          <w:rFonts w:ascii="Calibri" w:hAnsi="Calibri" w:eastAsia="Calibri"/>
-          <w:b w:val="0"/>
-          <w:sz w:val="22"/>
-        </w:rPr>
-        <w:t>Área Técnica / Engenharia — apoio TI no diagnóstico</w:t>
-      </w:r>
-    </w:p>
-    <w:p>
-      <w:r>
-        <w:rPr>
-          <w:rFonts w:ascii="Calibri" w:hAnsi="Calibri" w:eastAsia="Calibri"/>
-          <w:b/>
-          <w:sz w:val="22"/>
-        </w:rPr>
-        <w:t xml:space="preserve">Evidência: </w:t>
-      </w:r>
-      <w:r>
-        <w:rPr>
-          <w:rFonts w:ascii="Calibri" w:hAnsi="Calibri" w:eastAsia="Calibri"/>
-          <w:b w:val="0"/>
-          <w:sz w:val="22"/>
-        </w:rPr>
-        <w:t>[ ] Print/foto — Anexo A</w:t>
-      </w:r>
-    </w:p>
-    <w:p>
-      <w:pPr>
-        <w:pStyle w:val="Heading2"/>
-      </w:pPr>
-      <w:r>
-        <w:rPr>
-          <w:rFonts w:ascii="Calibri" w:hAnsi="Calibri" w:eastAsia="Calibri"/>
-          <w:b/>
-          <w:sz w:val="24"/>
-        </w:rPr>
-        <w:t>4.2 Uso de cabos Categoria 5</w:t>
-      </w:r>
-    </w:p>
-    <w:p>
-      <w:pPr>
-        <w:spacing w:after="120"/>
-      </w:pPr>
-      <w:r>
-        <w:rPr>
-          <w:rFonts w:ascii="Calibri" w:hAnsi="Calibri" w:eastAsia="Calibri"/>
-          <w:b w:val="0"/>
-          <w:sz w:val="22"/>
-        </w:rPr>
-        <w:t>Cabo inadequado ou degradado gera perda de pacotes e lentidão de rede.</w:t>
-      </w:r>
-    </w:p>
-    <w:p>
-      <w:pPr>
-        <w:spacing w:after="40"/>
-      </w:pPr>
-      <w:r>
-        <w:rPr>
-          <w:rFonts w:ascii="Calibri" w:hAnsi="Calibri" w:eastAsia="Calibri"/>
-          <w:b/>
-          <w:sz w:val="22"/>
-        </w:rPr>
-        <w:t>Sintomas:</w:t>
-      </w:r>
-    </w:p>
-    <w:p>
-      <w:pPr>
-        <w:pStyle w:val="ListBullet"/>
-      </w:pPr>
-      <w:r>
-        <w:rPr>
-          <w:rFonts w:ascii="Calibri" w:hAnsi="Calibri" w:eastAsia="Calibri"/>
-          <w:b w:val="0"/>
-          <w:sz w:val="22"/>
-        </w:rPr>
-        <w:t>Quedas intermitentes</w:t>
-      </w:r>
-    </w:p>
-    <w:p>
-      <w:pPr>
-        <w:pStyle w:val="ListBullet"/>
-      </w:pPr>
-      <w:r>
-        <w:rPr>
-          <w:rFonts w:ascii="Calibri" w:hAnsi="Calibri" w:eastAsia="Calibri"/>
-          <w:b w:val="0"/>
-          <w:sz w:val="22"/>
-        </w:rPr>
-        <w:t>Lentidão “vai e volta”</w:t>
-      </w:r>
-    </w:p>
-    <w:p>
-      <w:pPr>
-        <w:pStyle w:val="ListBullet"/>
-      </w:pPr>
-      <w:r>
-        <w:rPr>
-          <w:rFonts w:ascii="Calibri" w:hAnsi="Calibri" w:eastAsia="Calibri"/>
-          <w:b w:val="0"/>
-          <w:sz w:val="22"/>
-        </w:rPr>
-        <w:t>Posto perde conexão</w:t>
-      </w:r>
-    </w:p>
-    <w:p>
-      <w:r>
-        <w:rPr>
-          <w:rFonts w:ascii="Calibri" w:hAnsi="Calibri" w:eastAsia="Calibri"/>
-          <w:b/>
-          <w:sz w:val="22"/>
-        </w:rPr>
-        <w:t xml:space="preserve">Responsável: </w:t>
-      </w:r>
-      <w:r>
-        <w:rPr>
-          <w:rFonts w:ascii="Calibri" w:hAnsi="Calibri" w:eastAsia="Calibri"/>
-          <w:b w:val="0"/>
-          <w:sz w:val="22"/>
-        </w:rPr>
-        <w:t>Área Técnica / Engenharia — apoio TI na validação de link</w:t>
-      </w:r>
-    </w:p>
-    <w:p>
-      <w:r>
-        <w:rPr>
-          <w:rFonts w:ascii="Calibri" w:hAnsi="Calibri" w:eastAsia="Calibri"/>
-          <w:b/>
-          <w:sz w:val="22"/>
-        </w:rPr>
-        <w:t xml:space="preserve">Evidência: </w:t>
-      </w:r>
-      <w:r>
-        <w:rPr>
-          <w:rFonts w:ascii="Calibri" w:hAnsi="Calibri" w:eastAsia="Calibri"/>
-          <w:b w:val="0"/>
-          <w:sz w:val="22"/>
-        </w:rPr>
-        <w:t>[ ] Print/foto — Anexo B</w:t>
-      </w:r>
-    </w:p>
-    <w:p>
-      <w:pPr>
-        <w:pStyle w:val="Heading2"/>
-      </w:pPr>
-      <w:r>
-        <w:rPr>
-          <w:rFonts w:ascii="Calibri" w:hAnsi="Calibri" w:eastAsia="Calibri"/>
-          <w:b/>
-          <w:sz w:val="24"/>
-        </w:rPr>
-        <w:t>4.3 Erros de configuração de roteiro</w:t>
-      </w:r>
-    </w:p>
-    <w:p>
-      <w:pPr>
-        <w:spacing w:after="120"/>
-      </w:pPr>
-      <w:r>
-        <w:rPr>
-          <w:rFonts w:ascii="Calibri" w:hAnsi="Calibri" w:eastAsia="Calibri"/>
-          <w:b w:val="0"/>
-          <w:sz w:val="22"/>
-        </w:rPr>
-        <w:t>Configuração incorreta de modelo, postos ou IPs no roteiro.</w:t>
-      </w:r>
-    </w:p>
-    <w:p>
-      <w:pPr>
-        <w:spacing w:after="40"/>
-      </w:pPr>
-      <w:r>
-        <w:rPr>
-          <w:rFonts w:ascii="Calibri" w:hAnsi="Calibri" w:eastAsia="Calibri"/>
-          <w:b/>
-          <w:sz w:val="22"/>
-        </w:rPr>
-        <w:t>Sintomas:</w:t>
-      </w:r>
-    </w:p>
-    <w:p>
-      <w:pPr>
-        <w:pStyle w:val="ListBullet"/>
-      </w:pPr>
-      <w:r>
-        <w:rPr>
-          <w:rFonts w:ascii="Calibri" w:hAnsi="Calibri" w:eastAsia="Calibri"/>
-          <w:b w:val="0"/>
-          <w:sz w:val="22"/>
-        </w:rPr>
-        <w:t>Modelo não reconhecido</w:t>
-      </w:r>
-    </w:p>
-    <w:p>
-      <w:pPr>
-        <w:pStyle w:val="ListBullet"/>
-      </w:pPr>
-      <w:r>
-        <w:rPr>
-          <w:rFonts w:ascii="Calibri" w:hAnsi="Calibri" w:eastAsia="Calibri"/>
-          <w:b w:val="0"/>
-          <w:sz w:val="22"/>
-        </w:rPr>
-        <w:t>Sequência inconsistente</w:t>
-      </w:r>
-    </w:p>
-    <w:p>
-      <w:pPr>
-        <w:pStyle w:val="ListBullet"/>
-      </w:pPr>
-      <w:r>
-        <w:rPr>
-          <w:rFonts w:ascii="Calibri" w:hAnsi="Calibri" w:eastAsia="Calibri"/>
-          <w:b w:val="0"/>
-          <w:sz w:val="22"/>
-        </w:rPr>
-        <w:t>Ajuste emergencial no turno</w:t>
-      </w:r>
-    </w:p>
-    <w:p>
-      <w:r>
-        <w:rPr>
-          <w:rFonts w:ascii="Calibri" w:hAnsi="Calibri" w:eastAsia="Calibri"/>
-          <w:b/>
-          <w:sz w:val="22"/>
-        </w:rPr>
-        <w:t xml:space="preserve">Responsável: </w:t>
-      </w:r>
-      <w:r>
-        <w:rPr>
-          <w:rFonts w:ascii="Calibri" w:hAnsi="Calibri" w:eastAsia="Calibri"/>
-          <w:b w:val="0"/>
-          <w:sz w:val="22"/>
-        </w:rPr>
-        <w:t>Engenharia / Área Técnica</w:t>
-      </w:r>
-    </w:p>
-    <w:p>
-      <w:r>
-        <w:rPr>
-          <w:rFonts w:ascii="Calibri" w:hAnsi="Calibri" w:eastAsia="Calibri"/>
-          <w:b/>
-          <w:sz w:val="22"/>
-        </w:rPr>
-        <w:t xml:space="preserve">Evidência: </w:t>
-      </w:r>
-      <w:r>
-        <w:rPr>
-          <w:rFonts w:ascii="Calibri" w:hAnsi="Calibri" w:eastAsia="Calibri"/>
-          <w:b w:val="0"/>
-          <w:sz w:val="22"/>
-        </w:rPr>
-        <w:t>[ ] Print/foto — Anexo C</w:t>
-      </w:r>
-    </w:p>
-    <w:p>
-      <w:pPr>
-        <w:pStyle w:val="Heading2"/>
-      </w:pPr>
-      <w:r>
-        <w:rPr>
-          <w:rFonts w:ascii="Calibri" w:hAnsi="Calibri" w:eastAsia="Calibri"/>
-          <w:b/>
-          <w:sz w:val="24"/>
-        </w:rPr>
-        <w:t>4.4 IP duplicado na linha</w:t>
-      </w:r>
-    </w:p>
-    <w:p>
-      <w:pPr>
-        <w:spacing w:after="120"/>
-      </w:pPr>
-      <w:r>
-        <w:rPr>
-          <w:rFonts w:ascii="Calibri" w:hAnsi="Calibri" w:eastAsia="Calibri"/>
-          <w:b w:val="0"/>
-          <w:sz w:val="22"/>
-        </w:rPr>
-        <w:t>Dois dispositivos com o mesmo IP geram conflito de comunicação.</w:t>
-      </w:r>
-    </w:p>
-    <w:p>
-      <w:pPr>
-        <w:spacing w:after="40"/>
-      </w:pPr>
-      <w:r>
-        <w:rPr>
-          <w:rFonts w:ascii="Calibri" w:hAnsi="Calibri" w:eastAsia="Calibri"/>
-          <w:b/>
-          <w:sz w:val="22"/>
-        </w:rPr>
-        <w:t>Sintomas:</w:t>
-      </w:r>
-    </w:p>
-    <w:p>
-      <w:pPr>
-        <w:pStyle w:val="ListBullet"/>
-      </w:pPr>
-      <w:r>
-        <w:rPr>
-          <w:rFonts w:ascii="Calibri" w:hAnsi="Calibri" w:eastAsia="Calibri"/>
-          <w:b w:val="0"/>
-          <w:sz w:val="22"/>
-        </w:rPr>
-        <w:t>Posto some da rede</w:t>
-      </w:r>
-    </w:p>
-    <w:p>
-      <w:pPr>
-        <w:pStyle w:val="ListBullet"/>
-      </w:pPr>
-      <w:r>
-        <w:rPr>
-          <w:rFonts w:ascii="Calibri" w:hAnsi="Calibri" w:eastAsia="Calibri"/>
-          <w:b w:val="0"/>
-          <w:sz w:val="22"/>
-        </w:rPr>
-        <w:t>Erro de conexão intermitente</w:t>
-      </w:r>
-    </w:p>
-    <w:p>
-      <w:pPr>
-        <w:pStyle w:val="ListBullet"/>
-      </w:pPr>
-      <w:r>
-        <w:rPr>
-          <w:rFonts w:ascii="Calibri" w:hAnsi="Calibri" w:eastAsia="Calibri"/>
-          <w:b w:val="0"/>
-          <w:sz w:val="22"/>
-        </w:rPr>
-        <w:t>Problema “troca de posto” após reinício</w:t>
-      </w:r>
-    </w:p>
-    <w:p>
-      <w:r>
-        <w:rPr>
-          <w:rFonts w:ascii="Calibri" w:hAnsi="Calibri" w:eastAsia="Calibri"/>
-          <w:b/>
-          <w:sz w:val="22"/>
-        </w:rPr>
-        <w:t xml:space="preserve">Responsável: </w:t>
-      </w:r>
-      <w:r>
-        <w:rPr>
-          <w:rFonts w:ascii="Calibri" w:hAnsi="Calibri" w:eastAsia="Calibri"/>
-          <w:b w:val="0"/>
-          <w:sz w:val="22"/>
-        </w:rPr>
-        <w:t>Área Técnica / Engenharia — apoio TI na detecção</w:t>
-      </w:r>
-    </w:p>
-    <w:p>
-      <w:r>
-        <w:rPr>
-          <w:rFonts w:ascii="Calibri" w:hAnsi="Calibri" w:eastAsia="Calibri"/>
-          <w:b/>
-          <w:sz w:val="22"/>
-        </w:rPr>
-        <w:t xml:space="preserve">Evidência: </w:t>
-      </w:r>
-      <w:r>
-        <w:rPr>
-          <w:rFonts w:ascii="Calibri" w:hAnsi="Calibri" w:eastAsia="Calibri"/>
-          <w:b w:val="0"/>
-          <w:sz w:val="22"/>
-        </w:rPr>
-        <w:t>[ ] Print/foto — Anexo D</w:t>
-      </w:r>
-    </w:p>
-    <w:p>
-      <w:pPr>
-        <w:pStyle w:val="Heading2"/>
-      </w:pPr>
-      <w:r>
-        <w:rPr>
-          <w:rFonts w:ascii="Calibri" w:hAnsi="Calibri" w:eastAsia="Calibri"/>
-          <w:b/>
-          <w:sz w:val="24"/>
-        </w:rPr>
-        <w:t>4.5 PCs com baixa memória e processamento</w:t>
-      </w:r>
-    </w:p>
-    <w:p>
-      <w:pPr>
-        <w:spacing w:after="120"/>
-      </w:pPr>
-      <w:r>
-        <w:rPr>
-          <w:rFonts w:ascii="Calibri" w:hAnsi="Calibri" w:eastAsia="Calibri"/>
-          <w:b w:val="0"/>
-          <w:sz w:val="22"/>
-        </w:rPr>
-        <w:t>Estação saturada (RAM/CPU) causa travamento e lentidão.</w:t>
-      </w:r>
-    </w:p>
-    <w:p>
-      <w:pPr>
-        <w:spacing w:after="40"/>
-      </w:pPr>
-      <w:r>
-        <w:rPr>
-          <w:rFonts w:ascii="Calibri" w:hAnsi="Calibri" w:eastAsia="Calibri"/>
-          <w:b/>
-          <w:sz w:val="22"/>
-        </w:rPr>
-        <w:t>Sintomas:</w:t>
-      </w:r>
-    </w:p>
-    <w:p>
-      <w:pPr>
-        <w:pStyle w:val="ListBullet"/>
-      </w:pPr>
-      <w:r>
-        <w:rPr>
-          <w:rFonts w:ascii="Calibri" w:hAnsi="Calibri" w:eastAsia="Calibri"/>
-          <w:b w:val="0"/>
-          <w:sz w:val="22"/>
-        </w:rPr>
-        <w:t>Tela lenta</w:t>
-      </w:r>
-    </w:p>
-    <w:p>
-      <w:pPr>
-        <w:pStyle w:val="ListBullet"/>
-      </w:pPr>
-      <w:r>
-        <w:rPr>
-          <w:rFonts w:ascii="Calibri" w:hAnsi="Calibri" w:eastAsia="Calibri"/>
-          <w:b w:val="0"/>
-          <w:sz w:val="22"/>
-        </w:rPr>
-        <w:t>Reinício frequente</w:t>
-      </w:r>
-    </w:p>
-    <w:p>
-      <w:pPr>
-        <w:pStyle w:val="ListBullet"/>
-      </w:pPr>
-      <w:r>
-        <w:rPr>
-          <w:rFonts w:ascii="Calibri" w:hAnsi="Calibri" w:eastAsia="Calibri"/>
-          <w:b w:val="0"/>
-          <w:sz w:val="22"/>
-        </w:rPr>
-        <w:t>Confusão com “rede lenta”</w:t>
-      </w:r>
-    </w:p>
-    <w:p>
-      <w:r>
-        <w:rPr>
-          <w:rFonts w:ascii="Calibri" w:hAnsi="Calibri" w:eastAsia="Calibri"/>
-          <w:b/>
-          <w:sz w:val="22"/>
-        </w:rPr>
-        <w:t xml:space="preserve">Responsável: </w:t>
-      </w:r>
-      <w:r>
-        <w:rPr>
-          <w:rFonts w:ascii="Calibri" w:hAnsi="Calibri" w:eastAsia="Calibri"/>
-          <w:b w:val="0"/>
-          <w:sz w:val="22"/>
-        </w:rPr>
-        <w:t>Área Técnica / Engenharia — apoio TI no diagnóstico</w:t>
-      </w:r>
-    </w:p>
-    <w:p>
-      <w:r>
-        <w:rPr>
-          <w:rFonts w:ascii="Calibri" w:hAnsi="Calibri" w:eastAsia="Calibri"/>
-          <w:b/>
-          <w:sz w:val="22"/>
-        </w:rPr>
-        <w:t xml:space="preserve">Evidência: </w:t>
-      </w:r>
-      <w:r>
-        <w:rPr>
-          <w:rFonts w:ascii="Calibri" w:hAnsi="Calibri" w:eastAsia="Calibri"/>
-          <w:b w:val="0"/>
-          <w:sz w:val="22"/>
-        </w:rPr>
-        <w:t>[ ] Print/foto — Anexo E</w:t>
-      </w:r>
-    </w:p>
-    <w:p>
-      <w:pPr>
-        <w:pStyle w:val="Heading2"/>
-      </w:pPr>
-      <w:r>
-        <w:rPr>
-          <w:rFonts w:ascii="Calibri" w:hAnsi="Calibri" w:eastAsia="Calibri"/>
-          <w:b/>
-          <w:sz w:val="24"/>
-        </w:rPr>
-        <w:t>4.6 Desorganização do que passou / não passou</w:t>
-      </w:r>
-    </w:p>
-    <w:p>
-      <w:pPr>
-        <w:spacing w:after="120"/>
-      </w:pPr>
-      <w:r>
-        <w:rPr>
-          <w:rFonts w:ascii="Calibri" w:hAnsi="Calibri" w:eastAsia="Calibri"/>
-          <w:b w:val="0"/>
-          <w:sz w:val="22"/>
-        </w:rPr>
-        <w:t>Falta de controle claro do status gera retrabalho e parada.</w:t>
-      </w:r>
-    </w:p>
-    <w:p>
-      <w:pPr>
-        <w:spacing w:after="40"/>
-      </w:pPr>
-      <w:r>
-        <w:rPr>
-          <w:rFonts w:ascii="Calibri" w:hAnsi="Calibri" w:eastAsia="Calibri"/>
-          <w:b/>
-          <w:sz w:val="22"/>
-        </w:rPr>
-        <w:t>Sintomas:</w:t>
-      </w:r>
-    </w:p>
-    <w:p>
-      <w:pPr>
-        <w:pStyle w:val="ListBullet"/>
-      </w:pPr>
-      <w:r>
-        <w:rPr>
-          <w:rFonts w:ascii="Calibri" w:hAnsi="Calibri" w:eastAsia="Calibri"/>
-          <w:b w:val="0"/>
-          <w:sz w:val="22"/>
-        </w:rPr>
-        <w:t>Dúvida se já passou no posto</w:t>
-      </w:r>
-    </w:p>
-    <w:p>
-      <w:pPr>
-        <w:pStyle w:val="ListBullet"/>
-      </w:pPr>
-      <w:r>
-        <w:rPr>
-          <w:rFonts w:ascii="Calibri" w:hAnsi="Calibri" w:eastAsia="Calibri"/>
-          <w:b w:val="0"/>
-          <w:sz w:val="22"/>
-        </w:rPr>
-        <w:t>Conferência manual</w:t>
-      </w:r>
-    </w:p>
-    <w:p>
-      <w:pPr>
-        <w:pStyle w:val="ListBullet"/>
-      </w:pPr>
-      <w:r>
-        <w:rPr>
-          <w:rFonts w:ascii="Calibri" w:hAnsi="Calibri" w:eastAsia="Calibri"/>
-          <w:b w:val="0"/>
-          <w:sz w:val="22"/>
-        </w:rPr>
-        <w:t>Risco de rastreabilidade</w:t>
-      </w:r>
-    </w:p>
-    <w:p>
-      <w:r>
-        <w:rPr>
-          <w:rFonts w:ascii="Calibri" w:hAnsi="Calibri" w:eastAsia="Calibri"/>
-          <w:b/>
-          <w:sz w:val="22"/>
-        </w:rPr>
-        <w:t xml:space="preserve">Responsável: </w:t>
-      </w:r>
-      <w:r>
-        <w:rPr>
-          <w:rFonts w:ascii="Calibri" w:hAnsi="Calibri" w:eastAsia="Calibri"/>
-          <w:b w:val="0"/>
-          <w:sz w:val="22"/>
-        </w:rPr>
-        <w:t>Engenharia / Área Técnica</w:t>
-      </w:r>
-    </w:p>
-    <w:p>
-      <w:r>
-        <w:rPr>
-          <w:rFonts w:ascii="Calibri" w:hAnsi="Calibri" w:eastAsia="Calibri"/>
-          <w:b/>
-          <w:sz w:val="22"/>
-        </w:rPr>
-        <w:t xml:space="preserve">Evidência: </w:t>
-      </w:r>
-      <w:r>
-        <w:rPr>
-          <w:rFonts w:ascii="Calibri" w:hAnsi="Calibri" w:eastAsia="Calibri"/>
-          <w:b w:val="0"/>
-          <w:sz w:val="22"/>
-        </w:rPr>
-        <w:t>[ ] Print/foto — Anexo F</w:t>
-      </w:r>
-    </w:p>
-    <w:p>
-      <w:pPr>
-        <w:pStyle w:val="Heading1"/>
-      </w:pPr>
-      <w:r>
-        <w:rPr>
-          <w:rFonts w:ascii="Calibri" w:hAnsi="Calibri" w:eastAsia="Calibri"/>
-          <w:b/>
-          <w:sz w:val="30"/>
-        </w:rPr>
-        <w:t>5. Ação da TI — Treinamento</w:t>
-      </w:r>
-    </w:p>
-    <w:p>
-      <w:pPr>
-        <w:spacing w:after="120"/>
-      </w:pPr>
-      <w:r>
-        <w:rPr>
-          <w:rFonts w:ascii="Calibri" w:hAnsi="Calibri" w:eastAsia="Calibri"/>
-          <w:b w:val="0"/>
-          <w:sz w:val="22"/>
-        </w:rPr>
-        <w:t>A TI irá realizar treinamento dos pontos críticos de configuração e operação, para reduzir reincidência e chamados indevidos. Escopo inicial:</w:t>
-      </w:r>
-    </w:p>
-    <w:p>
-      <w:pPr>
-        <w:pStyle w:val="ListBullet"/>
-      </w:pPr>
-      <w:r>
-        <w:rPr>
-          <w:rFonts w:ascii="Calibri" w:hAnsi="Calibri" w:eastAsia="Calibri"/>
-          <w:b w:val="0"/>
-          <w:sz w:val="22"/>
-        </w:rPr>
-        <w:t>Configuração de IP em RAPs (padronização, validação e prevenção de IP duplicado)</w:t>
+        <w:t>Configuração de IP em RAPs (padronização e prevenção de IP duplicado)</w:t>
       </w:r>
     </w:p>
     <w:p>
@@ -1442,25 +1527,12 @@
           <w:b w:val="0"/>
           <w:sz w:val="22"/>
         </w:rPr>
-        <w:t>Checklist básico de verificação antes de escalar ocorrência como “falha de TI”</w:t>
+        <w:t>Checklist mínimo antes de classificar a ocorrência como “falha de TI”</w:t>
       </w:r>
     </w:p>
     <w:p>
       <w:pPr>
-        <w:spacing w:after="120"/>
-      </w:pPr>
-      <w:r>
-        <w:rPr>
-          <w:rFonts w:ascii="Calibri" w:hAnsi="Calibri" w:eastAsia="Calibri"/>
-          <w:b w:val="0"/>
-          <w:sz w:val="22"/>
-        </w:rPr>
-        <w:t>Público sugerido: Área Técnica e Engenharia (quem configura e opera os postos).</w:t>
-      </w:r>
-    </w:p>
-    <w:p>
-      <w:pPr>
-        <w:spacing w:after="120"/>
+        <w:spacing w:after="160"/>
       </w:pPr>
       <w:r>
         <w:rPr>
@@ -1481,7 +1553,85 @@
           <w:b/>
           <w:sz w:val="30"/>
         </w:rPr>
-        <w:t>6. Plano de ação resumido</w:t>
+        <w:t>8. Decisões solicitadas à gerência</w:t>
+      </w:r>
+    </w:p>
+    <w:p>
+      <w:pPr>
+        <w:spacing w:after="160"/>
+      </w:pPr>
+      <w:r>
+        <w:rPr>
+          <w:rFonts w:ascii="Calibri" w:hAnsi="Calibri" w:eastAsia="Calibri"/>
+          <w:b w:val="0"/>
+          <w:sz w:val="22"/>
+        </w:rPr>
+        <w:t>Para sair do empasse e reduzir a lentidão de forma sustentável, solicitamos alinhamento formal sobre:</w:t>
+      </w:r>
+    </w:p>
+    <w:p>
+      <w:pPr>
+        <w:pStyle w:val="ListBullet"/>
+      </w:pPr>
+      <w:r>
+        <w:rPr>
+          <w:rFonts w:ascii="Calibri" w:hAnsi="Calibri" w:eastAsia="Calibri"/>
+          <w:b w:val="0"/>
+          <w:sz w:val="22"/>
+        </w:rPr>
+        <w:t>Reconhecer os ofensores acima como prioritários de Engenharia e Área Técnica</w:t>
+      </w:r>
+    </w:p>
+    <w:p>
+      <w:pPr>
+        <w:pStyle w:val="ListBullet"/>
+      </w:pPr>
+      <w:r>
+        <w:rPr>
+          <w:rFonts w:ascii="Calibri" w:hAnsi="Calibri" w:eastAsia="Calibri"/>
+          <w:b w:val="0"/>
+          <w:sz w:val="22"/>
+        </w:rPr>
+        <w:t>Definir dono e prazo para cada ação do plano abaixo</w:t>
+      </w:r>
+    </w:p>
+    <w:p>
+      <w:pPr>
+        <w:pStyle w:val="ListBullet"/>
+      </w:pPr>
+      <w:r>
+        <w:rPr>
+          <w:rFonts w:ascii="Calibri" w:hAnsi="Calibri" w:eastAsia="Calibri"/>
+          <w:b w:val="0"/>
+          <w:sz w:val="22"/>
+        </w:rPr>
+        <w:t>Adotar triagem por causa raiz (com evidência) antes de escalar para TI</w:t>
+      </w:r>
+    </w:p>
+    <w:p>
+      <w:pPr>
+        <w:pStyle w:val="ListBullet"/>
+      </w:pPr>
+      <w:r>
+        <w:rPr>
+          <w:rFonts w:ascii="Calibri" w:hAnsi="Calibri" w:eastAsia="Calibri"/>
+          <w:b w:val="0"/>
+          <w:sz w:val="22"/>
+        </w:rPr>
+        <w:t>Apoiar o treinamento da TI e a padronização de IP/Filebeat nos postos</w:t>
+      </w:r>
+    </w:p>
+    <w:p>
+      <w:pPr>
+        <w:pStyle w:val="Heading1"/>
+      </w:pPr>
+      <w:r>
+        <w:rPr>
+          <w:rFonts w:ascii="Calibri" w:hAnsi="Calibri" w:eastAsia="Calibri"/>
+          <w:b/>
+          <w:sz w:val="30"/>
+        </w:rPr>
+        <w:t>9. Plano de ação (para acompanhamento gerencial)</w:t>
       </w:r>
     </w:p>
     <w:tbl>
@@ -1549,7 +1699,7 @@
                 <w:color w:val="FFFFFF"/>
                 <w:sz w:val="18"/>
               </w:rPr>
-              <w:t>Responsável</w:t>
+              <w:t>Dono</w:t>
             </w:r>
           </w:p>
         </w:tc>
@@ -1619,7 +1769,7 @@
                 <w:b w:val="0"/>
                 <w:sz w:val="18"/>
               </w:rPr>
-              <w:t>Corrigir/substituir cabos Cat5 nos trechos críticos</w:t>
+              <w:t>Substituir/padronizar cabos Cat5 nos trechos críticos</w:t>
             </w:r>
           </w:p>
         </w:tc>
@@ -1701,7 +1851,7 @@
                 <w:b w:val="0"/>
                 <w:sz w:val="18"/>
               </w:rPr>
-              <w:t>Eliminar IPs duplicados e padronizar endereçamento</w:t>
+              <w:t>Eliminar IPs duplicados e oficializar endereçamento</w:t>
             </w:r>
           </w:p>
         </w:tc>
@@ -1783,7 +1933,7 @@
                 <w:b w:val="0"/>
                 <w:sz w:val="18"/>
               </w:rPr>
-              <w:t>Revisar e validar configurações de roteiro antes da liberação</w:t>
+              <w:t>Implantar controle de liberação de roteiro</w:t>
             </w:r>
           </w:p>
         </w:tc>
@@ -1865,7 +2015,7 @@
                 <w:b w:val="0"/>
                 <w:sz w:val="18"/>
               </w:rPr>
-              <w:t>Avaliar/upgrade de RAPs e PCs com baixa performance</w:t>
+              <w:t>Plano de adequação de RAPs/PCs abaixo da spec</w:t>
             </w:r>
           </w:p>
         </w:tc>
@@ -1947,7 +2097,7 @@
                 <w:b w:val="0"/>
                 <w:sz w:val="18"/>
               </w:rPr>
-              <w:t>Padronizar controle do que passou/não passou</w:t>
+              <w:t>Padronizar status passou/não passou</w:t>
             </w:r>
           </w:p>
         </w:tc>
@@ -2029,7 +2179,7 @@
                 <w:b w:val="0"/>
                 <w:sz w:val="18"/>
               </w:rPr>
-              <w:t>Treinamento TI: IP de RAP + Filebeat + checklist</w:t>
+              <w:t>Executar treinamento TI (IP RAP + Filebeat + checklist)</w:t>
             </w:r>
           </w:p>
         </w:tc>
@@ -2094,12 +2244,12 @@
           <w:b/>
           <w:sz w:val="30"/>
         </w:rPr>
-        <w:t>7. Conclusão</w:t>
+        <w:t>10. Conclusão</w:t>
       </w:r>
     </w:p>
     <w:p>
       <w:pPr>
-        <w:spacing w:after="120"/>
+        <w:spacing w:after="160"/>
       </w:pPr>
       <w:r>
         <w:rPr>
@@ -2107,7 +2257,7 @@
           <w:b w:val="0"/>
           <w:sz w:val="22"/>
         </w:rPr>
-        <w:t>A lentidão na produção não se resume a “problema de TI”. Os ofensores principais observados são desempenho de RAP/PC, cabo Cat5, erro de roteiro, IP duplicado e falha de organização do fluxo. A TI apoiará no diagnóstico e no treinamento; a correção definitiva depende principalmente da Área Técnica e da Engenharia.</w:t>
+        <w:t>Este não é um relatório operacional de chamado: é um posicionamento estratégico para alinhar as áreas. A TI continuará apoiando com diagnóstico e capacitação, mas a correção definitiva dos principais ofensores depende de decisão e execução da Engenharia e da Área Técnica.</w:t>
       </w:r>
     </w:p>
     <w:p>
@@ -2120,7 +2270,7 @@
           <w:b/>
           <w:sz w:val="30"/>
         </w:rPr>
-        <w:t>8. Aprovações</w:t>
+        <w:t>11. Aprovações</w:t>
       </w:r>
     </w:p>
     <w:tbl>
@@ -2398,396 +2548,6 @@
                 <w:sz w:val="18"/>
               </w:rPr>
               <w:t>__/__/____</w:t>
-            </w:r>
-          </w:p>
-        </w:tc>
-      </w:tr>
-    </w:tbl>
-    <w:p/>
-    <w:p>
-      <w:pPr>
-        <w:pStyle w:val="Heading1"/>
-      </w:pPr>
-      <w:r>
-        <w:rPr>
-          <w:rFonts w:ascii="Calibri" w:hAnsi="Calibri" w:eastAsia="Calibri"/>
-          <w:b/>
-          <w:sz w:val="30"/>
-        </w:rPr>
-        <w:t>9. Anexos (evidências)</w:t>
-      </w:r>
-    </w:p>
-    <w:p>
-      <w:pPr>
-        <w:spacing w:after="120"/>
-      </w:pPr>
-      <w:r>
-        <w:rPr>
-          <w:rFonts w:ascii="Calibri" w:hAnsi="Calibri" w:eastAsia="Calibri"/>
-          <w:b w:val="0"/>
-          <w:sz w:val="22"/>
-        </w:rPr>
-        <w:t>Inserir prints/fotos abaixo (ou anexar ao final do arquivo):</w:t>
-      </w:r>
-    </w:p>
-    <w:tbl>
-      <w:tblPr>
-        <w:tblStyle w:val="TableGrid"/>
-        <w:tblW w:type="auto" w:w="0"/>
-        <w:jc w:val="center"/>
-        <w:tblLook w:firstColumn="1" w:firstRow="1" w:lastColumn="0" w:lastRow="0" w:noHBand="0" w:noVBand="1" w:val="04A0"/>
-      </w:tblPr>
-      <w:tblGrid>
-        <w:gridCol w:w="3249"/>
-        <w:gridCol w:w="3249"/>
-        <w:gridCol w:w="3249"/>
-      </w:tblGrid>
-      <w:tr>
-        <w:tc>
-          <w:tcPr>
-            <w:tcW w:type="dxa" w:w="3249"/>
-            <w:shd w:fill="1F4E79" w:val="clear"/>
-          </w:tcPr>
-          <w:p>
-            <w:r/>
-            <w:r>
-              <w:rPr>
-                <w:rFonts w:ascii="Calibri" w:hAnsi="Calibri" w:eastAsia="Calibri"/>
-                <w:b/>
-                <w:color w:val="FFFFFF"/>
-                <w:sz w:val="18"/>
-              </w:rPr>
-              <w:t>Anexo</w:t>
-            </w:r>
-          </w:p>
-        </w:tc>
-        <w:tc>
-          <w:tcPr>
-            <w:tcW w:type="dxa" w:w="3249"/>
-            <w:shd w:fill="1F4E79" w:val="clear"/>
-          </w:tcPr>
-          <w:p>
-            <w:r/>
-            <w:r>
-              <w:rPr>
-                <w:rFonts w:ascii="Calibri" w:hAnsi="Calibri" w:eastAsia="Calibri"/>
-                <w:b/>
-                <w:color w:val="FFFFFF"/>
-                <w:sz w:val="18"/>
-              </w:rPr>
-              <w:t>Ofensor</w:t>
-            </w:r>
-          </w:p>
-        </w:tc>
-        <w:tc>
-          <w:tcPr>
-            <w:tcW w:type="dxa" w:w="3249"/>
-            <w:shd w:fill="1F4E79" w:val="clear"/>
-          </w:tcPr>
-          <w:p>
-            <w:r/>
-            <w:r>
-              <w:rPr>
-                <w:rFonts w:ascii="Calibri" w:hAnsi="Calibri" w:eastAsia="Calibri"/>
-                <w:b/>
-                <w:color w:val="FFFFFF"/>
-                <w:sz w:val="18"/>
-              </w:rPr>
-              <w:t>Arquivo / descrição</w:t>
-            </w:r>
-          </w:p>
-        </w:tc>
-      </w:tr>
-      <w:tr>
-        <w:tc>
-          <w:tcPr>
-            <w:tcW w:type="dxa" w:w="3249"/>
-          </w:tcPr>
-          <w:p>
-            <w:r/>
-            <w:r>
-              <w:rPr>
-                <w:rFonts w:ascii="Calibri" w:hAnsi="Calibri" w:eastAsia="Calibri"/>
-                <w:b w:val="0"/>
-                <w:sz w:val="18"/>
-              </w:rPr>
-              <w:t>A</w:t>
-            </w:r>
-          </w:p>
-        </w:tc>
-        <w:tc>
-          <w:tcPr>
-            <w:tcW w:type="dxa" w:w="3249"/>
-          </w:tcPr>
-          <w:p>
-            <w:r/>
-            <w:r>
-              <w:rPr>
-                <w:rFonts w:ascii="Calibri" w:hAnsi="Calibri" w:eastAsia="Calibri"/>
-                <w:b w:val="0"/>
-                <w:sz w:val="18"/>
-              </w:rPr>
-              <w:t>RAPs baixa eficiência</w:t>
-            </w:r>
-          </w:p>
-        </w:tc>
-        <w:tc>
-          <w:tcPr>
-            <w:tcW w:type="dxa" w:w="3249"/>
-          </w:tcPr>
-          <w:p>
-            <w:r/>
-            <w:r>
-              <w:rPr>
-                <w:rFonts w:ascii="Calibri" w:hAnsi="Calibri" w:eastAsia="Calibri"/>
-                <w:b w:val="0"/>
-                <w:sz w:val="18"/>
-              </w:rPr>
-            </w:r>
-          </w:p>
-        </w:tc>
-      </w:tr>
-      <w:tr>
-        <w:tc>
-          <w:tcPr>
-            <w:tcW w:type="dxa" w:w="3249"/>
-          </w:tcPr>
-          <w:p>
-            <w:r/>
-            <w:r>
-              <w:rPr>
-                <w:rFonts w:ascii="Calibri" w:hAnsi="Calibri" w:eastAsia="Calibri"/>
-                <w:b w:val="0"/>
-                <w:sz w:val="18"/>
-              </w:rPr>
-              <w:t>B</w:t>
-            </w:r>
-          </w:p>
-        </w:tc>
-        <w:tc>
-          <w:tcPr>
-            <w:tcW w:type="dxa" w:w="3249"/>
-          </w:tcPr>
-          <w:p>
-            <w:r/>
-            <w:r>
-              <w:rPr>
-                <w:rFonts w:ascii="Calibri" w:hAnsi="Calibri" w:eastAsia="Calibri"/>
-                <w:b w:val="0"/>
-                <w:sz w:val="18"/>
-              </w:rPr>
-              <w:t>Cabos Cat5</w:t>
-            </w:r>
-          </w:p>
-        </w:tc>
-        <w:tc>
-          <w:tcPr>
-            <w:tcW w:type="dxa" w:w="3249"/>
-          </w:tcPr>
-          <w:p>
-            <w:r/>
-            <w:r>
-              <w:rPr>
-                <w:rFonts w:ascii="Calibri" w:hAnsi="Calibri" w:eastAsia="Calibri"/>
-                <w:b w:val="0"/>
-                <w:sz w:val="18"/>
-              </w:rPr>
-            </w:r>
-          </w:p>
-        </w:tc>
-      </w:tr>
-      <w:tr>
-        <w:tc>
-          <w:tcPr>
-            <w:tcW w:type="dxa" w:w="3249"/>
-          </w:tcPr>
-          <w:p>
-            <w:r/>
-            <w:r>
-              <w:rPr>
-                <w:rFonts w:ascii="Calibri" w:hAnsi="Calibri" w:eastAsia="Calibri"/>
-                <w:b w:val="0"/>
-                <w:sz w:val="18"/>
-              </w:rPr>
-              <w:t>C</w:t>
-            </w:r>
-          </w:p>
-        </w:tc>
-        <w:tc>
-          <w:tcPr>
-            <w:tcW w:type="dxa" w:w="3249"/>
-          </w:tcPr>
-          <w:p>
-            <w:r/>
-            <w:r>
-              <w:rPr>
-                <w:rFonts w:ascii="Calibri" w:hAnsi="Calibri" w:eastAsia="Calibri"/>
-                <w:b w:val="0"/>
-                <w:sz w:val="18"/>
-              </w:rPr>
-              <w:t>Erro de roteiro</w:t>
-            </w:r>
-          </w:p>
-        </w:tc>
-        <w:tc>
-          <w:tcPr>
-            <w:tcW w:type="dxa" w:w="3249"/>
-          </w:tcPr>
-          <w:p>
-            <w:r/>
-            <w:r>
-              <w:rPr>
-                <w:rFonts w:ascii="Calibri" w:hAnsi="Calibri" w:eastAsia="Calibri"/>
-                <w:b w:val="0"/>
-                <w:sz w:val="18"/>
-              </w:rPr>
-            </w:r>
-          </w:p>
-        </w:tc>
-      </w:tr>
-      <w:tr>
-        <w:tc>
-          <w:tcPr>
-            <w:tcW w:type="dxa" w:w="3249"/>
-          </w:tcPr>
-          <w:p>
-            <w:r/>
-            <w:r>
-              <w:rPr>
-                <w:rFonts w:ascii="Calibri" w:hAnsi="Calibri" w:eastAsia="Calibri"/>
-                <w:b w:val="0"/>
-                <w:sz w:val="18"/>
-              </w:rPr>
-              <w:t>D</w:t>
-            </w:r>
-          </w:p>
-        </w:tc>
-        <w:tc>
-          <w:tcPr>
-            <w:tcW w:type="dxa" w:w="3249"/>
-          </w:tcPr>
-          <w:p>
-            <w:r/>
-            <w:r>
-              <w:rPr>
-                <w:rFonts w:ascii="Calibri" w:hAnsi="Calibri" w:eastAsia="Calibri"/>
-                <w:b w:val="0"/>
-                <w:sz w:val="18"/>
-              </w:rPr>
-              <w:t>IP duplicado</w:t>
-            </w:r>
-          </w:p>
-        </w:tc>
-        <w:tc>
-          <w:tcPr>
-            <w:tcW w:type="dxa" w:w="3249"/>
-          </w:tcPr>
-          <w:p>
-            <w:r/>
-            <w:r>
-              <w:rPr>
-                <w:rFonts w:ascii="Calibri" w:hAnsi="Calibri" w:eastAsia="Calibri"/>
-                <w:b w:val="0"/>
-                <w:sz w:val="18"/>
-              </w:rPr>
-            </w:r>
-          </w:p>
-        </w:tc>
-      </w:tr>
-      <w:tr>
-        <w:tc>
-          <w:tcPr>
-            <w:tcW w:type="dxa" w:w="3249"/>
-          </w:tcPr>
-          <w:p>
-            <w:r/>
-            <w:r>
-              <w:rPr>
-                <w:rFonts w:ascii="Calibri" w:hAnsi="Calibri" w:eastAsia="Calibri"/>
-                <w:b w:val="0"/>
-                <w:sz w:val="18"/>
-              </w:rPr>
-              <w:t>E</w:t>
-            </w:r>
-          </w:p>
-        </w:tc>
-        <w:tc>
-          <w:tcPr>
-            <w:tcW w:type="dxa" w:w="3249"/>
-          </w:tcPr>
-          <w:p>
-            <w:r/>
-            <w:r>
-              <w:rPr>
-                <w:rFonts w:ascii="Calibri" w:hAnsi="Calibri" w:eastAsia="Calibri"/>
-                <w:b w:val="0"/>
-                <w:sz w:val="18"/>
-              </w:rPr>
-              <w:t>PCs baixa performance</w:t>
-            </w:r>
-          </w:p>
-        </w:tc>
-        <w:tc>
-          <w:tcPr>
-            <w:tcW w:type="dxa" w:w="3249"/>
-          </w:tcPr>
-          <w:p>
-            <w:r/>
-            <w:r>
-              <w:rPr>
-                <w:rFonts w:ascii="Calibri" w:hAnsi="Calibri" w:eastAsia="Calibri"/>
-                <w:b w:val="0"/>
-                <w:sz w:val="18"/>
-              </w:rPr>
-            </w:r>
-          </w:p>
-        </w:tc>
-      </w:tr>
-      <w:tr>
-        <w:tc>
-          <w:tcPr>
-            <w:tcW w:type="dxa" w:w="3249"/>
-          </w:tcPr>
-          <w:p>
-            <w:r/>
-            <w:r>
-              <w:rPr>
-                <w:rFonts w:ascii="Calibri" w:hAnsi="Calibri" w:eastAsia="Calibri"/>
-                <w:b w:val="0"/>
-                <w:sz w:val="18"/>
-              </w:rPr>
-              <w:t>F</w:t>
-            </w:r>
-          </w:p>
-        </w:tc>
-        <w:tc>
-          <w:tcPr>
-            <w:tcW w:type="dxa" w:w="3249"/>
-          </w:tcPr>
-          <w:p>
-            <w:r/>
-            <w:r>
-              <w:rPr>
-                <w:rFonts w:ascii="Calibri" w:hAnsi="Calibri" w:eastAsia="Calibri"/>
-                <w:b w:val="0"/>
-                <w:sz w:val="18"/>
-              </w:rPr>
-              <w:t>Passou / não passou</w:t>
-            </w:r>
-          </w:p>
-        </w:tc>
-        <w:tc>
-          <w:tcPr>
-            <w:tcW w:type="dxa" w:w="3249"/>
-          </w:tcPr>
-          <w:p>
-            <w:r/>
-            <w:r>
-              <w:rPr>
-                <w:rFonts w:ascii="Calibri" w:hAnsi="Calibri" w:eastAsia="Calibri"/>
-                <w:b w:val="0"/>
-                <w:sz w:val="18"/>
-              </w:rPr>
             </w:r>
           </w:p>
         </w:tc>

</xml_diff>

<commit_message>
Redesign both reports with concise professional layout
Tighten strategic briefing and evidence annex for managerial
presentation: cleaner cover, navy visual system, shorter copy.

Co-authored-by: BossPrime <matheussilva030499-oss@users.noreply.github.com>
</commit_message>
<xml_diff>
--- a/docs/Relatorio_Ofensores_Lentidao_Producao.docx
+++ b/docs/Relatorio_Ofensores_Lentidao_Producao.docx
@@ -2,49 +2,150 @@
 <file path=word/document.xml><?xml version="1.0" encoding="utf-8"?>
 <w:document xmlns:wpc="http://schemas.microsoft.com/office/word/2010/wordprocessingCanvas" xmlns:mo="http://schemas.microsoft.com/office/mac/office/2008/main" xmlns:mc="http://schemas.openxmlformats.org/markup-compatibility/2006" xmlns:mv="urn:schemas-microsoft-com:mac:vml" xmlns:o="urn:schemas-microsoft-com:office:office" xmlns:r="http://schemas.openxmlformats.org/officeDocument/2006/relationships" xmlns:m="http://schemas.openxmlformats.org/officeDocument/2006/math" xmlns:v="urn:schemas-microsoft-com:vml" xmlns:wp14="http://schemas.microsoft.com/office/word/2010/wordprocessingDrawing" xmlns:wp="http://schemas.openxmlformats.org/drawingml/2006/wordprocessingDrawing" xmlns:w10="urn:schemas-microsoft-com:office:word" xmlns:w="http://schemas.openxmlformats.org/wordprocessingml/2006/main" xmlns:w14="http://schemas.microsoft.com/office/word/2010/wordml" xmlns:wpg="http://schemas.microsoft.com/office/word/2010/wordprocessingGroup" xmlns:wpi="http://schemas.microsoft.com/office/word/2010/wordprocessingInk" xmlns:wne="http://schemas.microsoft.com/office/word/2006/wordml" xmlns:wps="http://schemas.microsoft.com/office/word/2010/wordprocessingShape" mc:Ignorable="w14 wp14">
   <w:body>
-    <w:p>
-      <w:pPr>
-        <w:jc w:val="center"/>
-      </w:pPr>
-      <w:r>
-        <w:rPr>
-          <w:rFonts w:ascii="Calibri" w:hAnsi="Calibri" w:eastAsia="Calibri"/>
-          <w:b/>
-          <w:color w:val="1F4E79"/>
-          <w:sz w:val="32"/>
-        </w:rPr>
-        <w:t>Posicionamento Estratégico — Ofensores de Lentidão na Produção</w:t>
-      </w:r>
-    </w:p>
-    <w:p>
-      <w:pPr>
-        <w:jc w:val="center"/>
-      </w:pPr>
-      <w:r>
-        <w:rPr>
-          <w:rFonts w:ascii="Calibri" w:hAnsi="Calibri" w:eastAsia="Calibri"/>
-          <w:b w:val="0"/>
-          <w:color w:val="595959"/>
-          <w:sz w:val="24"/>
-        </w:rPr>
-        <w:t>Alinhamento entre TI, Área Técnica e Engenharia</w:t>
-      </w:r>
-    </w:p>
     <w:tbl>
       <w:tblPr>
-        <w:tblStyle w:val="TableGrid"/>
         <w:tblW w:type="auto" w:w="0"/>
         <w:tblLook w:firstColumn="1" w:firstRow="1" w:lastColumn="0" w:lastRow="0" w:noHBand="0" w:noVBand="1" w:val="04A0"/>
+        <w:tblBorders>
+          <w:top w:val="single" w:sz="0" w:color="0F2C59"/>
+          <w:left w:val="single" w:sz="0" w:color="0F2C59"/>
+          <w:bottom w:val="single" w:sz="0" w:color="0F2C59"/>
+          <w:right w:val="single" w:sz="0" w:color="0F2C59"/>
+          <w:insideH w:val="single" w:sz="0" w:color="0F2C59"/>
+          <w:insideV w:val="single" w:sz="0" w:color="0F2C59"/>
+        </w:tblBorders>
       </w:tblPr>
       <w:tblGrid>
-        <w:gridCol w:w="4873"/>
-        <w:gridCol w:w="4873"/>
+        <w:gridCol w:w="9866"/>
       </w:tblGrid>
       <w:tr>
         <w:tc>
           <w:tcPr>
-            <w:tcW w:type="dxa" w:w="4873"/>
-            <w:shd w:fill="D6E3F0" w:val="clear"/>
+            <w:tcW w:type="dxa" w:w="9866"/>
+            <w:shd w:fill="0F2C59" w:val="clear"/>
+          </w:tcPr>
+          <w:p>
+            <w:pPr>
+              <w:jc w:val="center"/>
+            </w:pPr>
+            <w:r/>
+            <w:r>
+              <w:rPr>
+                <w:rFonts w:ascii="Calibri" w:hAnsi="Calibri" w:eastAsia="Calibri"/>
+                <w:b/>
+                <w:color w:val="9BC9E0"/>
+                <w:sz w:val="22"/>
+              </w:rPr>
+              <w:br/>
+              <w:t>POSICIONAMENTO ESTRATÉGICO</w:t>
+            </w:r>
+          </w:p>
+          <w:p>
+            <w:pPr>
+              <w:jc w:val="center"/>
+            </w:pPr>
+            <w:r>
+              <w:rPr>
+                <w:rFonts w:ascii="Calibri" w:hAnsi="Calibri" w:eastAsia="Calibri"/>
+                <w:b/>
+                <w:color w:val="FFFFFF"/>
+                <w:sz w:val="36"/>
+              </w:rPr>
+              <w:t>Ofensores de Lentidão na Linha de Produção</w:t>
+            </w:r>
+          </w:p>
+          <w:p>
+            <w:pPr>
+              <w:jc w:val="center"/>
+            </w:pPr>
+            <w:r>
+              <w:rPr>
+                <w:rFonts w:ascii="Calibri" w:hAnsi="Calibri" w:eastAsia="Calibri"/>
+                <w:b w:val="0"/>
+                <w:color w:val="D6E3F0"/>
+                <w:sz w:val="22"/>
+              </w:rPr>
+              <w:t>Alinhamento TI  ·  Área Técnica  ·  Engenharia</w:t>
+              <w:br/>
+            </w:r>
+          </w:p>
+        </w:tc>
+      </w:tr>
+      <w:tr>
+        <w:tc>
+          <w:tcPr>
+            <w:tcW w:type="dxa" w:w="9866"/>
+            <w:shd w:fill="1B6B93" w:val="clear"/>
+            <w:vAlign w:val="center"/>
+          </w:tcPr>
+          <w:p>
+            <w:pPr>
+              <w:jc w:val="center"/>
+            </w:pPr>
+            <w:r/>
+            <w:r>
+              <w:rPr>
+                <w:rFonts w:ascii="Calibri" w:hAnsi="Calibri" w:eastAsia="Calibri"/>
+                <w:b/>
+                <w:color w:val="FFFFFF"/>
+                <w:sz w:val="18"/>
+              </w:rPr>
+              <w:t xml:space="preserve">  Causa raiz antes de culpado  ·  Evidência antes de apontamento  ·  Dono e prazo claros</w:t>
+            </w:r>
+          </w:p>
+        </w:tc>
+      </w:tr>
+      <w:tr>
+        <w:tc>
+          <w:tcPr>
+            <w:tcW w:type="dxa" w:w="9866"/>
+            <w:shd w:fill="F7F9FC" w:val="clear"/>
+            <w:vAlign w:val="center"/>
+          </w:tcPr>
+          <w:p>
+            <w:pPr>
+              <w:jc w:val="center"/>
+            </w:pPr>
+            <w:r/>
+            <w:r>
+              <w:rPr>
+                <w:rFonts w:ascii="Calibri" w:hAnsi="Calibri" w:eastAsia="Calibri"/>
+                <w:b w:val="0"/>
+                <w:color w:val="4A4A4A"/>
+                <w:sz w:val="18"/>
+              </w:rPr>
+              <w:t xml:space="preserve">  Documento REL-TI-PROD-001  |  Data ____/____/________  |  Uso: apresentação gerencial</w:t>
+            </w:r>
+          </w:p>
+        </w:tc>
+      </w:tr>
+    </w:tbl>
+    <w:p>
+      <w:pPr>
+        <w:spacing w:after="160"/>
+      </w:pPr>
+    </w:p>
+    <w:tbl>
+      <w:tblPr>
+        <w:tblW w:type="auto" w:w="0"/>
+        <w:tblLayout w:type="autofit"/>
+        <w:tblLook w:firstColumn="1" w:firstRow="1" w:lastColumn="0" w:lastRow="0" w:noHBand="0" w:noVBand="1" w:val="04A0"/>
+      </w:tblPr>
+      <w:tblGrid>
+        <w:gridCol w:w="9866"/>
+      </w:tblGrid>
+      <w:tr>
+        <w:tc>
+          <w:tcPr>
+            <w:tcW w:type="dxa" w:w="9866"/>
+            <w:shd w:fill="0F2C59" w:val="clear"/>
+            <w:vAlign w:val="center"/>
+            <w:tcBorders>
+              <w:top w:val="nil" w:sz="0" w:color="0F2C59"/>
+              <w:left w:val="nil" w:sz="0" w:color="0F2C59"/>
+              <w:bottom w:val="nil" w:sz="0" w:color="0F2C59"/>
+              <w:right w:val="nil" w:sz="0" w:color="0F2C59"/>
+            </w:tcBorders>
           </w:tcPr>
           <w:p>
             <w:r/>
@@ -52,15 +153,97 @@
               <w:rPr>
                 <w:rFonts w:ascii="Calibri" w:hAnsi="Calibri" w:eastAsia="Calibri"/>
                 <w:b/>
-                <w:sz w:val="20"/>
+                <w:color w:val="FFFFFF"/>
+                <w:sz w:val="24"/>
               </w:rPr>
-              <w:t>Documento</w:t>
+              <w:t xml:space="preserve">  1. Objetivo</w:t>
             </w:r>
           </w:p>
         </w:tc>
+      </w:tr>
+    </w:tbl>
+    <w:p>
+      <w:pPr>
+        <w:spacing w:before="40" w:after="80"/>
+      </w:pPr>
+    </w:p>
+    <w:p>
+      <w:pPr>
+        <w:spacing w:after="120" w:before="0"/>
+      </w:pPr>
+      <w:r>
+        <w:rPr>
+          <w:rFonts w:ascii="Calibri" w:hAnsi="Calibri" w:eastAsia="Calibri"/>
+          <w:b w:val="0"/>
+          <w:color w:val="4A4A4A"/>
+          <w:sz w:val="21"/>
+        </w:rPr>
+        <w:t>Deixar claro à gerência de Engenharia e Área Técnica quais são os reais ofensores de lentidão — com impacto, responsabilidade e decisão — evitando que a TI continue sendo tratada como causa padrão sem análise de causa raiz.</w:t>
+      </w:r>
+    </w:p>
+    <w:tbl>
+      <w:tblPr>
+        <w:tblW w:type="auto" w:w="0"/>
+        <w:tblLayout w:type="autofit"/>
+        <w:tblLook w:firstColumn="1" w:firstRow="1" w:lastColumn="0" w:lastRow="0" w:noHBand="0" w:noVBand="1" w:val="04A0"/>
+      </w:tblPr>
+      <w:tblGrid>
+        <w:gridCol w:w="9866"/>
+      </w:tblGrid>
+      <w:tr>
         <w:tc>
           <w:tcPr>
-            <w:tcW w:type="dxa" w:w="4873"/>
+            <w:tcW w:type="dxa" w:w="9866"/>
+            <w:shd w:fill="0F2C59" w:val="clear"/>
+            <w:vAlign w:val="center"/>
+            <w:tcBorders>
+              <w:top w:val="nil" w:sz="0" w:color="0F2C59"/>
+              <w:left w:val="nil" w:sz="0" w:color="0F2C59"/>
+              <w:bottom w:val="nil" w:sz="0" w:color="0F2C59"/>
+              <w:right w:val="nil" w:sz="0" w:color="0F2C59"/>
+            </w:tcBorders>
+          </w:tcPr>
+          <w:p>
+            <w:r/>
+            <w:r>
+              <w:rPr>
+                <w:rFonts w:ascii="Calibri" w:hAnsi="Calibri" w:eastAsia="Calibri"/>
+                <w:b/>
+                <w:color w:val="FFFFFF"/>
+                <w:sz w:val="24"/>
+              </w:rPr>
+              <w:t xml:space="preserve">  2. Mensagem central</w:t>
+            </w:r>
+          </w:p>
+        </w:tc>
+      </w:tr>
+    </w:tbl>
+    <w:p>
+      <w:pPr>
+        <w:spacing w:before="40" w:after="80"/>
+      </w:pPr>
+    </w:p>
+    <w:tbl>
+      <w:tblPr>
+        <w:tblW w:type="auto" w:w="0"/>
+        <w:tblLook w:firstColumn="1" w:firstRow="1" w:lastColumn="0" w:lastRow="0" w:noHBand="0" w:noVBand="1" w:val="04A0"/>
+        <w:tblBorders>
+          <w:top w:val="single" w:sz="12" w:color="1B6B93"/>
+          <w:left w:val="single" w:sz="12" w:color="1B6B93"/>
+          <w:bottom w:val="single" w:sz="12" w:color="1B6B93"/>
+          <w:right w:val="single" w:sz="12" w:color="1B6B93"/>
+          <w:insideH w:val="single" w:sz="12" w:color="1B6B93"/>
+          <w:insideV w:val="single" w:sz="12" w:color="1B6B93"/>
+        </w:tblBorders>
+      </w:tblPr>
+      <w:tblGrid>
+        <w:gridCol w:w="9866"/>
+      </w:tblGrid>
+      <w:tr>
+        <w:tc>
+          <w:tcPr>
+            <w:tcW w:type="dxa" w:w="9866"/>
+            <w:shd w:fill="F0F7FB" w:val="clear"/>
           </w:tcPr>
           <w:p>
             <w:r/>
@@ -68,18 +251,50 @@
               <w:rPr>
                 <w:rFonts w:ascii="Calibri" w:hAnsi="Calibri" w:eastAsia="Calibri"/>
                 <w:b w:val="0"/>
-                <w:sz w:val="20"/>
+                <w:color w:val="4A4A4A"/>
+                <w:sz w:val="21"/>
               </w:rPr>
-              <w:t>REL-TI-PROD-001</w:t>
+              <w:t xml:space="preserve">A lentidão, na maioria das ocorrências, não nasce de falha estrutural da TI. </w:t>
+            </w:r>
+            <w:r>
+              <w:rPr>
+                <w:rFonts w:ascii="Calibri" w:hAnsi="Calibri" w:eastAsia="Calibri"/>
+                <w:b/>
+                <w:color w:val="0F2C59"/>
+                <w:sz w:val="21"/>
+              </w:rPr>
+              <w:t>Os ofensores recorrentes estão em configuração, desempenho de posto, cabeamento e disciplina de processo.</w:t>
             </w:r>
           </w:p>
         </w:tc>
       </w:tr>
+    </w:tbl>
+    <w:p>
+      <w:pPr>
+        <w:spacing w:after="120"/>
+      </w:pPr>
+    </w:p>
+    <w:tbl>
+      <w:tblPr>
+        <w:tblW w:type="auto" w:w="0"/>
+        <w:tblLayout w:type="autofit"/>
+        <w:tblLook w:firstColumn="1" w:firstRow="1" w:lastColumn="0" w:lastRow="0" w:noHBand="0" w:noVBand="1" w:val="04A0"/>
+      </w:tblPr>
+      <w:tblGrid>
+        <w:gridCol w:w="9866"/>
+      </w:tblGrid>
       <w:tr>
         <w:tc>
           <w:tcPr>
-            <w:tcW w:type="dxa" w:w="4873"/>
-            <w:shd w:fill="D6E3F0" w:val="clear"/>
+            <w:tcW w:type="dxa" w:w="9866"/>
+            <w:shd w:fill="0F2C59" w:val="clear"/>
+            <w:vAlign w:val="center"/>
+            <w:tcBorders>
+              <w:top w:val="nil" w:sz="0" w:color="0F2C59"/>
+              <w:left w:val="nil" w:sz="0" w:color="0F2C59"/>
+              <w:bottom w:val="nil" w:sz="0" w:color="0F2C59"/>
+              <w:right w:val="nil" w:sz="0" w:color="0F2C59"/>
+            </w:tcBorders>
           </w:tcPr>
           <w:p>
             <w:r/>
@@ -87,243 +302,51 @@
               <w:rPr>
                 <w:rFonts w:ascii="Calibri" w:hAnsi="Calibri" w:eastAsia="Calibri"/>
                 <w:b/>
-                <w:sz w:val="20"/>
+                <w:color w:val="FFFFFF"/>
+                <w:sz w:val="24"/>
               </w:rPr>
-              <w:t>Data</w:t>
-            </w:r>
-          </w:p>
-        </w:tc>
-        <w:tc>
-          <w:tcPr>
-            <w:tcW w:type="dxa" w:w="4873"/>
-          </w:tcPr>
-          <w:p>
-            <w:r/>
-            <w:r>
-              <w:rPr>
-                <w:rFonts w:ascii="Calibri" w:hAnsi="Calibri" w:eastAsia="Calibri"/>
-                <w:b w:val="0"/>
-                <w:sz w:val="20"/>
-              </w:rPr>
-              <w:t>____/____/________</w:t>
-            </w:r>
-          </w:p>
-        </w:tc>
-      </w:tr>
-      <w:tr>
-        <w:tc>
-          <w:tcPr>
-            <w:tcW w:type="dxa" w:w="4873"/>
-            <w:shd w:fill="D6E3F0" w:val="clear"/>
-          </w:tcPr>
-          <w:p>
-            <w:r/>
-            <w:r>
-              <w:rPr>
-                <w:rFonts w:ascii="Calibri" w:hAnsi="Calibri" w:eastAsia="Calibri"/>
-                <w:b/>
-                <w:sz w:val="20"/>
-              </w:rPr>
-              <w:t>Público</w:t>
-            </w:r>
-          </w:p>
-        </w:tc>
-        <w:tc>
-          <w:tcPr>
-            <w:tcW w:type="dxa" w:w="4873"/>
-          </w:tcPr>
-          <w:p>
-            <w:r/>
-            <w:r>
-              <w:rPr>
-                <w:rFonts w:ascii="Calibri" w:hAnsi="Calibri" w:eastAsia="Calibri"/>
-                <w:b w:val="0"/>
-                <w:sz w:val="20"/>
-              </w:rPr>
-              <w:t>Gerência de Engenharia · Área Técnica · TI</w:t>
+              <w:t xml:space="preserve">  3. Ofensores prioritários</w:t>
             </w:r>
           </w:p>
         </w:tc>
       </w:tr>
     </w:tbl>
-    <w:p/>
     <w:p>
       <w:pPr>
-        <w:pStyle w:val="Heading1"/>
+        <w:spacing w:before="40" w:after="80"/>
       </w:pPr>
-      <w:r>
-        <w:rPr>
-          <w:rFonts w:ascii="Calibri" w:hAnsi="Calibri" w:eastAsia="Calibri"/>
-          <w:b/>
-          <w:sz w:val="30"/>
-        </w:rPr>
-        <w:t>1. Objetivo desta apresentação</w:t>
-      </w:r>
-    </w:p>
-    <w:p>
-      <w:pPr>
-        <w:spacing w:after="160"/>
-      </w:pPr>
-      <w:r>
-        <w:rPr>
-          <w:rFonts w:ascii="Calibri" w:hAnsi="Calibri" w:eastAsia="Calibri"/>
-          <w:b w:val="0"/>
-          <w:sz w:val="22"/>
-        </w:rPr>
-        <w:t>Deixar claro, para a gerência de Engenharia e da Área Técnica, quais são os reais ofensores de lentidão na linha — com impacto no resultado, responsabilidade e decisão necessária — evitando que a TI continue sendo tratada como causa padrão sem análise de causa raiz.</w:t>
-      </w:r>
-    </w:p>
-    <w:p>
-      <w:pPr>
-        <w:pStyle w:val="Heading1"/>
-      </w:pPr>
-      <w:r>
-        <w:rPr>
-          <w:rFonts w:ascii="Calibri" w:hAnsi="Calibri" w:eastAsia="Calibri"/>
-          <w:b/>
-          <w:sz w:val="30"/>
-        </w:rPr>
-        <w:t>2. Mensagem central</w:t>
-      </w:r>
-    </w:p>
-    <w:p>
-      <w:pPr>
-        <w:spacing w:after="160"/>
-      </w:pPr>
-      <w:r>
-        <w:rPr>
-          <w:rFonts w:ascii="Calibri" w:hAnsi="Calibri" w:eastAsia="Calibri"/>
-          <w:b w:val="0"/>
-          <w:sz w:val="22"/>
-        </w:rPr>
-        <w:t>A lentidão na produção, na maioria das ocorrências recentes, não nasce de falha estrutural da TI. Os ofensores recorrentes estão em configuração, desempenho de posto/equipamento, cabeamento e disciplina de processo.</w:t>
-      </w:r>
-    </w:p>
-    <w:p>
-      <w:pPr>
-        <w:spacing w:after="160"/>
-      </w:pPr>
-      <w:r>
-        <w:rPr>
-          <w:rFonts w:ascii="Calibri" w:hAnsi="Calibri" w:eastAsia="Calibri"/>
-          <w:b w:val="0"/>
-          <w:sz w:val="22"/>
-        </w:rPr>
-        <w:t>Enquanto isso não for tratado de forma conjunta e com dono claro, o problema se repete, o apontamento continua caindo na TI e o tempo de correção aumenta.</w:t>
-      </w:r>
-    </w:p>
-    <w:p>
-      <w:pPr>
-        <w:pStyle w:val="Heading1"/>
-      </w:pPr>
-      <w:r>
-        <w:rPr>
-          <w:rFonts w:ascii="Calibri" w:hAnsi="Calibri" w:eastAsia="Calibri"/>
-          <w:b/>
-          <w:sz w:val="30"/>
-        </w:rPr>
-        <w:t>3. Por que isso é estratégico</w:t>
-      </w:r>
-    </w:p>
-    <w:p>
-      <w:pPr>
-        <w:pStyle w:val="ListBullet"/>
-      </w:pPr>
-      <w:r>
-        <w:rPr>
-          <w:rFonts w:ascii="Calibri" w:hAnsi="Calibri" w:eastAsia="Calibri"/>
-          <w:b w:val="0"/>
-          <w:sz w:val="22"/>
-        </w:rPr>
-        <w:t>Impacto direto em ritmo de linha, disponibilidade e produtividade</w:t>
-      </w:r>
-    </w:p>
-    <w:p>
-      <w:pPr>
-        <w:pStyle w:val="ListBullet"/>
-      </w:pPr>
-      <w:r>
-        <w:rPr>
-          <w:rFonts w:ascii="Calibri" w:hAnsi="Calibri" w:eastAsia="Calibri"/>
-          <w:b w:val="0"/>
-          <w:sz w:val="22"/>
-        </w:rPr>
-        <w:t>Retrabalho operacional e desgaste entre áreas</w:t>
-      </w:r>
-    </w:p>
-    <w:p>
-      <w:pPr>
-        <w:pStyle w:val="ListBullet"/>
-      </w:pPr>
-      <w:r>
-        <w:rPr>
-          <w:rFonts w:ascii="Calibri" w:hAnsi="Calibri" w:eastAsia="Calibri"/>
-          <w:b w:val="0"/>
-          <w:sz w:val="22"/>
-        </w:rPr>
-        <w:t>Diagnóstico lento quando a causa é apontada sem evidência</w:t>
-      </w:r>
-    </w:p>
-    <w:p>
-      <w:pPr>
-        <w:pStyle w:val="ListBullet"/>
-      </w:pPr>
-      <w:r>
-        <w:rPr>
-          <w:rFonts w:ascii="Calibri" w:hAnsi="Calibri" w:eastAsia="Calibri"/>
-          <w:b w:val="0"/>
-          <w:sz w:val="22"/>
-        </w:rPr>
-        <w:t>Risco de decisões erradas (investir em TI quando o ofensor é processo/equipamento)</w:t>
-      </w:r>
-    </w:p>
-    <w:p>
-      <w:pPr>
-        <w:pStyle w:val="ListBullet"/>
-      </w:pPr>
-      <w:r>
-        <w:rPr>
-          <w:rFonts w:ascii="Calibri" w:hAnsi="Calibri" w:eastAsia="Calibri"/>
-          <w:b w:val="0"/>
-          <w:sz w:val="22"/>
-        </w:rPr>
-        <w:t>Necessidade de governança: causa raiz → responsável → ação → prazo</w:t>
-      </w:r>
-    </w:p>
-    <w:p>
-      <w:pPr>
-        <w:pStyle w:val="Heading1"/>
-      </w:pPr>
-      <w:r>
-        <w:rPr>
-          <w:rFonts w:ascii="Calibri" w:hAnsi="Calibri" w:eastAsia="Calibri"/>
-          <w:b/>
-          <w:sz w:val="30"/>
-        </w:rPr>
-        <w:t>4. Ofensores prioritários (visão gerencial)</w:t>
-      </w:r>
     </w:p>
     <w:tbl>
       <w:tblPr>
-        <w:tblStyle w:val="TableGrid"/>
         <w:tblW w:type="auto" w:w="0"/>
-        <w:jc w:val="center"/>
         <w:tblLook w:firstColumn="1" w:firstRow="1" w:lastColumn="0" w:lastRow="0" w:noHBand="0" w:noVBand="1" w:val="04A0"/>
+        <w:tblBorders>
+          <w:top w:val="single" w:sz="4" w:color="D0D7DE"/>
+          <w:left w:val="single" w:sz="4" w:color="D0D7DE"/>
+          <w:bottom w:val="single" w:sz="4" w:color="D0D7DE"/>
+          <w:right w:val="single" w:sz="4" w:color="D0D7DE"/>
+          <w:insideH w:val="single" w:sz="4" w:color="D0D7DE"/>
+          <w:insideV w:val="single" w:sz="4" w:color="D0D7DE"/>
+        </w:tblBorders>
       </w:tblPr>
       <w:tblGrid>
-        <w:gridCol w:w="1949"/>
-        <w:gridCol w:w="1949"/>
-        <w:gridCol w:w="1949"/>
-        <w:gridCol w:w="1949"/>
-        <w:gridCol w:w="1949"/>
+        <w:gridCol w:w="1973"/>
+        <w:gridCol w:w="1973"/>
+        <w:gridCol w:w="1973"/>
+        <w:gridCol w:w="1973"/>
+        <w:gridCol w:w="1973"/>
       </w:tblGrid>
       <w:tr>
         <w:tc>
           <w:tcPr>
-            <w:tcW w:type="dxa" w:w="1949"/>
-            <w:shd w:fill="1F4E79" w:val="clear"/>
+            <w:tcW w:type="dxa" w:w="1973"/>
+            <w:vAlign w:val="center"/>
+            <w:shd w:fill="0F2C59" w:val="clear"/>
           </w:tcPr>
           <w:p>
+            <w:pPr>
+              <w:jc w:val="center"/>
+            </w:pPr>
             <w:r/>
             <w:r>
               <w:rPr>
@@ -338,10 +361,14 @@
         </w:tc>
         <w:tc>
           <w:tcPr>
-            <w:tcW w:type="dxa" w:w="1949"/>
-            <w:shd w:fill="1F4E79" w:val="clear"/>
+            <w:tcW w:type="dxa" w:w="1973"/>
+            <w:vAlign w:val="center"/>
+            <w:shd w:fill="0F2C59" w:val="clear"/>
           </w:tcPr>
           <w:p>
+            <w:pPr>
+              <w:jc w:val="center"/>
+            </w:pPr>
             <w:r/>
             <w:r>
               <w:rPr>
@@ -356,8 +383,698 @@
         </w:tc>
         <w:tc>
           <w:tcPr>
-            <w:tcW w:type="dxa" w:w="1949"/>
-            <w:shd w:fill="1F4E79" w:val="clear"/>
+            <w:tcW w:type="dxa" w:w="1973"/>
+            <w:vAlign w:val="center"/>
+            <w:shd w:fill="0F2C59" w:val="clear"/>
+          </w:tcPr>
+          <w:p>
+            <w:pPr>
+              <w:jc w:val="center"/>
+            </w:pPr>
+            <w:r/>
+            <w:r>
+              <w:rPr>
+                <w:rFonts w:ascii="Calibri" w:hAnsi="Calibri" w:eastAsia="Calibri"/>
+                <w:b/>
+                <w:color w:val="FFFFFF"/>
+                <w:sz w:val="18"/>
+              </w:rPr>
+              <w:t>Impacto</w:t>
+            </w:r>
+          </w:p>
+        </w:tc>
+        <w:tc>
+          <w:tcPr>
+            <w:tcW w:type="dxa" w:w="1973"/>
+            <w:vAlign w:val="center"/>
+            <w:shd w:fill="0F2C59" w:val="clear"/>
+          </w:tcPr>
+          <w:p>
+            <w:pPr>
+              <w:jc w:val="center"/>
+            </w:pPr>
+            <w:r/>
+            <w:r>
+              <w:rPr>
+                <w:rFonts w:ascii="Calibri" w:hAnsi="Calibri" w:eastAsia="Calibri"/>
+                <w:b/>
+                <w:color w:val="FFFFFF"/>
+                <w:sz w:val="18"/>
+              </w:rPr>
+              <w:t>Dono</w:t>
+            </w:r>
+          </w:p>
+        </w:tc>
+        <w:tc>
+          <w:tcPr>
+            <w:tcW w:type="dxa" w:w="1973"/>
+            <w:vAlign w:val="center"/>
+            <w:shd w:fill="0F2C59" w:val="clear"/>
+          </w:tcPr>
+          <w:p>
+            <w:pPr>
+              <w:jc w:val="center"/>
+            </w:pPr>
+            <w:r/>
+            <w:r>
+              <w:rPr>
+                <w:rFonts w:ascii="Calibri" w:hAnsi="Calibri" w:eastAsia="Calibri"/>
+                <w:b/>
+                <w:color w:val="FFFFFF"/>
+                <w:sz w:val="18"/>
+              </w:rPr>
+              <w:t>Decisão</w:t>
+            </w:r>
+          </w:p>
+        </w:tc>
+      </w:tr>
+      <w:tr>
+        <w:tc>
+          <w:tcPr>
+            <w:tcW w:type="dxa" w:w="1973"/>
+            <w:vAlign w:val="center"/>
+            <w:shd w:fill="F7F9FC" w:val="clear"/>
+          </w:tcPr>
+          <w:p>
+            <w:pPr>
+              <w:jc w:val="center"/>
+            </w:pPr>
+            <w:r/>
+            <w:r>
+              <w:rPr>
+                <w:rFonts w:ascii="Calibri" w:hAnsi="Calibri" w:eastAsia="Calibri"/>
+                <w:b w:val="0"/>
+                <w:color w:val="4A4A4A"/>
+                <w:sz w:val="18"/>
+              </w:rPr>
+              <w:t>01</w:t>
+            </w:r>
+          </w:p>
+        </w:tc>
+        <w:tc>
+          <w:tcPr>
+            <w:tcW w:type="dxa" w:w="1973"/>
+            <w:vAlign w:val="center"/>
+            <w:shd w:fill="F7F9FC" w:val="clear"/>
+          </w:tcPr>
+          <w:p>
+            <w:r/>
+            <w:r>
+              <w:rPr>
+                <w:rFonts w:ascii="Calibri" w:hAnsi="Calibri" w:eastAsia="Calibri"/>
+                <w:b w:val="0"/>
+                <w:color w:val="4A4A4A"/>
+                <w:sz w:val="18"/>
+              </w:rPr>
+              <w:t>RAPs com baixa eficiência</w:t>
+            </w:r>
+          </w:p>
+        </w:tc>
+        <w:tc>
+          <w:tcPr>
+            <w:tcW w:type="dxa" w:w="1973"/>
+            <w:vAlign w:val="center"/>
+            <w:shd w:fill="F7F9FC" w:val="clear"/>
+          </w:tcPr>
+          <w:p>
+            <w:r/>
+            <w:r>
+              <w:rPr>
+                <w:rFonts w:ascii="Calibri" w:hAnsi="Calibri" w:eastAsia="Calibri"/>
+                <w:b w:val="0"/>
+                <w:color w:val="4A4A4A"/>
+                <w:sz w:val="18"/>
+              </w:rPr>
+              <w:t>Fila, timeout e falsa lentidão de sistema</w:t>
+            </w:r>
+          </w:p>
+        </w:tc>
+        <w:tc>
+          <w:tcPr>
+            <w:tcW w:type="dxa" w:w="1973"/>
+            <w:vAlign w:val="center"/>
+            <w:shd w:fill="F7F9FC" w:val="clear"/>
+          </w:tcPr>
+          <w:p>
+            <w:r/>
+            <w:r>
+              <w:rPr>
+                <w:rFonts w:ascii="Calibri" w:hAnsi="Calibri" w:eastAsia="Calibri"/>
+                <w:b w:val="0"/>
+                <w:color w:val="4A4A4A"/>
+                <w:sz w:val="18"/>
+              </w:rPr>
+              <w:t>Área Técnica / Engenharia</w:t>
+            </w:r>
+          </w:p>
+        </w:tc>
+        <w:tc>
+          <w:tcPr>
+            <w:tcW w:type="dxa" w:w="1973"/>
+            <w:vAlign w:val="center"/>
+            <w:shd w:fill="F7F9FC" w:val="clear"/>
+          </w:tcPr>
+          <w:p>
+            <w:r/>
+            <w:r>
+              <w:rPr>
+                <w:rFonts w:ascii="Calibri" w:hAnsi="Calibri" w:eastAsia="Calibri"/>
+                <w:b w:val="0"/>
+                <w:color w:val="4A4A4A"/>
+                <w:sz w:val="18"/>
+              </w:rPr>
+              <w:t>Spec mínima + upgrade</w:t>
+            </w:r>
+          </w:p>
+        </w:tc>
+      </w:tr>
+      <w:tr>
+        <w:tc>
+          <w:tcPr>
+            <w:tcW w:type="dxa" w:w="1973"/>
+            <w:vAlign w:val="center"/>
+            <w:shd w:fill="FFFFFF" w:val="clear"/>
+          </w:tcPr>
+          <w:p>
+            <w:pPr>
+              <w:jc w:val="center"/>
+            </w:pPr>
+            <w:r/>
+            <w:r>
+              <w:rPr>
+                <w:rFonts w:ascii="Calibri" w:hAnsi="Calibri" w:eastAsia="Calibri"/>
+                <w:b w:val="0"/>
+                <w:color w:val="4A4A4A"/>
+                <w:sz w:val="18"/>
+              </w:rPr>
+              <w:t>02</w:t>
+            </w:r>
+          </w:p>
+        </w:tc>
+        <w:tc>
+          <w:tcPr>
+            <w:tcW w:type="dxa" w:w="1973"/>
+            <w:vAlign w:val="center"/>
+            <w:shd w:fill="FFFFFF" w:val="clear"/>
+          </w:tcPr>
+          <w:p>
+            <w:r/>
+            <w:r>
+              <w:rPr>
+                <w:rFonts w:ascii="Calibri" w:hAnsi="Calibri" w:eastAsia="Calibri"/>
+                <w:b w:val="0"/>
+                <w:color w:val="4A4A4A"/>
+                <w:sz w:val="18"/>
+              </w:rPr>
+              <w:t>Cabos Cat.5 / Cat.5e</w:t>
+            </w:r>
+          </w:p>
+        </w:tc>
+        <w:tc>
+          <w:tcPr>
+            <w:tcW w:type="dxa" w:w="1973"/>
+            <w:vAlign w:val="center"/>
+            <w:shd w:fill="FFFFFF" w:val="clear"/>
+          </w:tcPr>
+          <w:p>
+            <w:r/>
+            <w:r>
+              <w:rPr>
+                <w:rFonts w:ascii="Calibri" w:hAnsi="Calibri" w:eastAsia="Calibri"/>
+                <w:b w:val="0"/>
+                <w:color w:val="4A4A4A"/>
+                <w:sz w:val="18"/>
+              </w:rPr>
+              <w:t>Instabilidade e paradas intermitentes</w:t>
+            </w:r>
+          </w:p>
+        </w:tc>
+        <w:tc>
+          <w:tcPr>
+            <w:tcW w:type="dxa" w:w="1973"/>
+            <w:vAlign w:val="center"/>
+            <w:shd w:fill="FFFFFF" w:val="clear"/>
+          </w:tcPr>
+          <w:p>
+            <w:r/>
+            <w:r>
+              <w:rPr>
+                <w:rFonts w:ascii="Calibri" w:hAnsi="Calibri" w:eastAsia="Calibri"/>
+                <w:b w:val="0"/>
+                <w:color w:val="4A4A4A"/>
+                <w:sz w:val="18"/>
+              </w:rPr>
+              <w:t>Área Técnica / Engenharia</w:t>
+            </w:r>
+          </w:p>
+        </w:tc>
+        <w:tc>
+          <w:tcPr>
+            <w:tcW w:type="dxa" w:w="1973"/>
+            <w:vAlign w:val="center"/>
+            <w:shd w:fill="FFFFFF" w:val="clear"/>
+          </w:tcPr>
+          <w:p>
+            <w:r/>
+            <w:r>
+              <w:rPr>
+                <w:rFonts w:ascii="Calibri" w:hAnsi="Calibri" w:eastAsia="Calibri"/>
+                <w:b w:val="0"/>
+                <w:color w:val="4A4A4A"/>
+                <w:sz w:val="18"/>
+              </w:rPr>
+              <w:t>Padronizar e substituir</w:t>
+            </w:r>
+          </w:p>
+        </w:tc>
+      </w:tr>
+      <w:tr>
+        <w:tc>
+          <w:tcPr>
+            <w:tcW w:type="dxa" w:w="1973"/>
+            <w:vAlign w:val="center"/>
+            <w:shd w:fill="F7F9FC" w:val="clear"/>
+          </w:tcPr>
+          <w:p>
+            <w:pPr>
+              <w:jc w:val="center"/>
+            </w:pPr>
+            <w:r/>
+            <w:r>
+              <w:rPr>
+                <w:rFonts w:ascii="Calibri" w:hAnsi="Calibri" w:eastAsia="Calibri"/>
+                <w:b w:val="0"/>
+                <w:color w:val="4A4A4A"/>
+                <w:sz w:val="18"/>
+              </w:rPr>
+              <w:t>03</w:t>
+            </w:r>
+          </w:p>
+        </w:tc>
+        <w:tc>
+          <w:tcPr>
+            <w:tcW w:type="dxa" w:w="1973"/>
+            <w:vAlign w:val="center"/>
+            <w:shd w:fill="F7F9FC" w:val="clear"/>
+          </w:tcPr>
+          <w:p>
+            <w:r/>
+            <w:r>
+              <w:rPr>
+                <w:rFonts w:ascii="Calibri" w:hAnsi="Calibri" w:eastAsia="Calibri"/>
+                <w:b w:val="0"/>
+                <w:color w:val="4A4A4A"/>
+                <w:sz w:val="18"/>
+              </w:rPr>
+              <w:t>Erro de configuração de roteiro</w:t>
+            </w:r>
+          </w:p>
+        </w:tc>
+        <w:tc>
+          <w:tcPr>
+            <w:tcW w:type="dxa" w:w="1973"/>
+            <w:vAlign w:val="center"/>
+            <w:shd w:fill="F7F9FC" w:val="clear"/>
+          </w:tcPr>
+          <w:p>
+            <w:r/>
+            <w:r>
+              <w:rPr>
+                <w:rFonts w:ascii="Calibri" w:hAnsi="Calibri" w:eastAsia="Calibri"/>
+                <w:b w:val="0"/>
+                <w:color w:val="4A4A4A"/>
+                <w:sz w:val="18"/>
+              </w:rPr>
+              <w:t>Parada imediata e retrabalho</w:t>
+            </w:r>
+          </w:p>
+        </w:tc>
+        <w:tc>
+          <w:tcPr>
+            <w:tcW w:type="dxa" w:w="1973"/>
+            <w:vAlign w:val="center"/>
+            <w:shd w:fill="F7F9FC" w:val="clear"/>
+          </w:tcPr>
+          <w:p>
+            <w:r/>
+            <w:r>
+              <w:rPr>
+                <w:rFonts w:ascii="Calibri" w:hAnsi="Calibri" w:eastAsia="Calibri"/>
+                <w:b w:val="0"/>
+                <w:color w:val="4A4A4A"/>
+                <w:sz w:val="18"/>
+              </w:rPr>
+              <w:t>Engenharia / Área Técnica</w:t>
+            </w:r>
+          </w:p>
+        </w:tc>
+        <w:tc>
+          <w:tcPr>
+            <w:tcW w:type="dxa" w:w="1973"/>
+            <w:vAlign w:val="center"/>
+            <w:shd w:fill="F7F9FC" w:val="clear"/>
+          </w:tcPr>
+          <w:p>
+            <w:r/>
+            <w:r>
+              <w:rPr>
+                <w:rFonts w:ascii="Calibri" w:hAnsi="Calibri" w:eastAsia="Calibri"/>
+                <w:b w:val="0"/>
+                <w:color w:val="4A4A4A"/>
+                <w:sz w:val="18"/>
+              </w:rPr>
+              <w:t>Checklist de liberação</w:t>
+            </w:r>
+          </w:p>
+        </w:tc>
+      </w:tr>
+      <w:tr>
+        <w:tc>
+          <w:tcPr>
+            <w:tcW w:type="dxa" w:w="1973"/>
+            <w:vAlign w:val="center"/>
+            <w:shd w:fill="FFFFFF" w:val="clear"/>
+          </w:tcPr>
+          <w:p>
+            <w:pPr>
+              <w:jc w:val="center"/>
+            </w:pPr>
+            <w:r/>
+            <w:r>
+              <w:rPr>
+                <w:rFonts w:ascii="Calibri" w:hAnsi="Calibri" w:eastAsia="Calibri"/>
+                <w:b w:val="0"/>
+                <w:color w:val="4A4A4A"/>
+                <w:sz w:val="18"/>
+              </w:rPr>
+              <w:t>04</w:t>
+            </w:r>
+          </w:p>
+        </w:tc>
+        <w:tc>
+          <w:tcPr>
+            <w:tcW w:type="dxa" w:w="1973"/>
+            <w:vAlign w:val="center"/>
+            <w:shd w:fill="FFFFFF" w:val="clear"/>
+          </w:tcPr>
+          <w:p>
+            <w:r/>
+            <w:r>
+              <w:rPr>
+                <w:rFonts w:ascii="Calibri" w:hAnsi="Calibri" w:eastAsia="Calibri"/>
+                <w:b w:val="0"/>
+                <w:color w:val="4A4A4A"/>
+                <w:sz w:val="18"/>
+              </w:rPr>
+              <w:t>IP duplicado / conexão física ruim</w:t>
+            </w:r>
+          </w:p>
+        </w:tc>
+        <w:tc>
+          <w:tcPr>
+            <w:tcW w:type="dxa" w:w="1973"/>
+            <w:vAlign w:val="center"/>
+            <w:shd w:fill="FFFFFF" w:val="clear"/>
+          </w:tcPr>
+          <w:p>
+            <w:r/>
+            <w:r>
+              <w:rPr>
+                <w:rFonts w:ascii="Calibri" w:hAnsi="Calibri" w:eastAsia="Calibri"/>
+                <w:b w:val="0"/>
+                <w:color w:val="4A4A4A"/>
+                <w:sz w:val="18"/>
+              </w:rPr>
+              <w:t>Queda de comunicação do posto</w:t>
+            </w:r>
+          </w:p>
+        </w:tc>
+        <w:tc>
+          <w:tcPr>
+            <w:tcW w:type="dxa" w:w="1973"/>
+            <w:vAlign w:val="center"/>
+            <w:shd w:fill="FFFFFF" w:val="clear"/>
+          </w:tcPr>
+          <w:p>
+            <w:r/>
+            <w:r>
+              <w:rPr>
+                <w:rFonts w:ascii="Calibri" w:hAnsi="Calibri" w:eastAsia="Calibri"/>
+                <w:b w:val="0"/>
+                <w:color w:val="4A4A4A"/>
+                <w:sz w:val="18"/>
+              </w:rPr>
+              <w:t>Área Técnica / Engenharia</w:t>
+            </w:r>
+          </w:p>
+        </w:tc>
+        <w:tc>
+          <w:tcPr>
+            <w:tcW w:type="dxa" w:w="1973"/>
+            <w:vAlign w:val="center"/>
+            <w:shd w:fill="FFFFFF" w:val="clear"/>
+          </w:tcPr>
+          <w:p>
+            <w:r/>
+            <w:r>
+              <w:rPr>
+                <w:rFonts w:ascii="Calibri" w:hAnsi="Calibri" w:eastAsia="Calibri"/>
+                <w:b w:val="0"/>
+                <w:color w:val="4A4A4A"/>
+                <w:sz w:val="18"/>
+              </w:rPr>
+              <w:t>Governança de IP + cabo</w:t>
+            </w:r>
+          </w:p>
+        </w:tc>
+      </w:tr>
+      <w:tr>
+        <w:tc>
+          <w:tcPr>
+            <w:tcW w:type="dxa" w:w="1973"/>
+            <w:vAlign w:val="center"/>
+            <w:shd w:fill="F7F9FC" w:val="clear"/>
+          </w:tcPr>
+          <w:p>
+            <w:pPr>
+              <w:jc w:val="center"/>
+            </w:pPr>
+            <w:r/>
+            <w:r>
+              <w:rPr>
+                <w:rFonts w:ascii="Calibri" w:hAnsi="Calibri" w:eastAsia="Calibri"/>
+                <w:b w:val="0"/>
+                <w:color w:val="4A4A4A"/>
+                <w:sz w:val="18"/>
+              </w:rPr>
+              <w:t>05</w:t>
+            </w:r>
+          </w:p>
+        </w:tc>
+        <w:tc>
+          <w:tcPr>
+            <w:tcW w:type="dxa" w:w="1973"/>
+            <w:vAlign w:val="center"/>
+            <w:shd w:fill="F7F9FC" w:val="clear"/>
+          </w:tcPr>
+          <w:p>
+            <w:r/>
+            <w:r>
+              <w:rPr>
+                <w:rFonts w:ascii="Calibri" w:hAnsi="Calibri" w:eastAsia="Calibri"/>
+                <w:b w:val="0"/>
+                <w:color w:val="4A4A4A"/>
+                <w:sz w:val="18"/>
+              </w:rPr>
+              <w:t>PCs/RASPs com CPU saturada</w:t>
+            </w:r>
+          </w:p>
+        </w:tc>
+        <w:tc>
+          <w:tcPr>
+            <w:tcW w:type="dxa" w:w="1973"/>
+            <w:vAlign w:val="center"/>
+            <w:shd w:fill="F7F9FC" w:val="clear"/>
+          </w:tcPr>
+          <w:p>
+            <w:r/>
+            <w:r>
+              <w:rPr>
+                <w:rFonts w:ascii="Calibri" w:hAnsi="Calibri" w:eastAsia="Calibri"/>
+                <w:b w:val="0"/>
+                <w:color w:val="4A4A4A"/>
+                <w:sz w:val="18"/>
+              </w:rPr>
+              <w:t>Travamento e perda de ciclo</w:t>
+            </w:r>
+          </w:p>
+        </w:tc>
+        <w:tc>
+          <w:tcPr>
+            <w:tcW w:type="dxa" w:w="1973"/>
+            <w:vAlign w:val="center"/>
+            <w:shd w:fill="F7F9FC" w:val="clear"/>
+          </w:tcPr>
+          <w:p>
+            <w:r/>
+            <w:r>
+              <w:rPr>
+                <w:rFonts w:ascii="Calibri" w:hAnsi="Calibri" w:eastAsia="Calibri"/>
+                <w:b w:val="0"/>
+                <w:color w:val="4A4A4A"/>
+                <w:sz w:val="18"/>
+              </w:rPr>
+              <w:t>Área Técnica / Engenharia</w:t>
+            </w:r>
+          </w:p>
+        </w:tc>
+        <w:tc>
+          <w:tcPr>
+            <w:tcW w:type="dxa" w:w="1973"/>
+            <w:vAlign w:val="center"/>
+            <w:shd w:fill="F7F9FC" w:val="clear"/>
+          </w:tcPr>
+          <w:p>
+            <w:r/>
+            <w:r>
+              <w:rPr>
+                <w:rFonts w:ascii="Calibri" w:hAnsi="Calibri" w:eastAsia="Calibri"/>
+                <w:b w:val="0"/>
+                <w:color w:val="4A4A4A"/>
+                <w:sz w:val="18"/>
+              </w:rPr>
+              <w:t>Adequar hardware/processo</w:t>
+            </w:r>
+          </w:p>
+        </w:tc>
+      </w:tr>
+      <w:tr>
+        <w:tc>
+          <w:tcPr>
+            <w:tcW w:type="dxa" w:w="1973"/>
+            <w:vAlign w:val="center"/>
+            <w:shd w:fill="FFFFFF" w:val="clear"/>
+          </w:tcPr>
+          <w:p>
+            <w:pPr>
+              <w:jc w:val="center"/>
+            </w:pPr>
+            <w:r/>
+            <w:r>
+              <w:rPr>
+                <w:rFonts w:ascii="Calibri" w:hAnsi="Calibri" w:eastAsia="Calibri"/>
+                <w:b w:val="0"/>
+                <w:color w:val="4A4A4A"/>
+                <w:sz w:val="18"/>
+              </w:rPr>
+              <w:t>06</w:t>
+            </w:r>
+          </w:p>
+        </w:tc>
+        <w:tc>
+          <w:tcPr>
+            <w:tcW w:type="dxa" w:w="1973"/>
+            <w:vAlign w:val="center"/>
+            <w:shd w:fill="FFFFFF" w:val="clear"/>
+          </w:tcPr>
+          <w:p>
+            <w:r/>
+            <w:r>
+              <w:rPr>
+                <w:rFonts w:ascii="Calibri" w:hAnsi="Calibri" w:eastAsia="Calibri"/>
+                <w:b w:val="0"/>
+                <w:color w:val="4A4A4A"/>
+                <w:sz w:val="18"/>
+              </w:rPr>
+              <w:t>Passou / não passou desorganizado</w:t>
+            </w:r>
+          </w:p>
+        </w:tc>
+        <w:tc>
+          <w:tcPr>
+            <w:tcW w:type="dxa" w:w="1973"/>
+            <w:vAlign w:val="center"/>
+            <w:shd w:fill="FFFFFF" w:val="clear"/>
+          </w:tcPr>
+          <w:p>
+            <w:r/>
+            <w:r>
+              <w:rPr>
+                <w:rFonts w:ascii="Calibri" w:hAnsi="Calibri" w:eastAsia="Calibri"/>
+                <w:b w:val="0"/>
+                <w:color w:val="4A4A4A"/>
+                <w:sz w:val="18"/>
+              </w:rPr>
+              <w:t>Retrabalho e perda de rastreio</w:t>
+            </w:r>
+          </w:p>
+        </w:tc>
+        <w:tc>
+          <w:tcPr>
+            <w:tcW w:type="dxa" w:w="1973"/>
+            <w:vAlign w:val="center"/>
+            <w:shd w:fill="FFFFFF" w:val="clear"/>
+          </w:tcPr>
+          <w:p>
+            <w:r/>
+            <w:r>
+              <w:rPr>
+                <w:rFonts w:ascii="Calibri" w:hAnsi="Calibri" w:eastAsia="Calibri"/>
+                <w:b w:val="0"/>
+                <w:color w:val="4A4A4A"/>
+                <w:sz w:val="18"/>
+              </w:rPr>
+              <w:t>Engenharia / Área Técnica</w:t>
+            </w:r>
+          </w:p>
+        </w:tc>
+        <w:tc>
+          <w:tcPr>
+            <w:tcW w:type="dxa" w:w="1973"/>
+            <w:vAlign w:val="center"/>
+            <w:shd w:fill="FFFFFF" w:val="clear"/>
+          </w:tcPr>
+          <w:p>
+            <w:r/>
+            <w:r>
+              <w:rPr>
+                <w:rFonts w:ascii="Calibri" w:hAnsi="Calibri" w:eastAsia="Calibri"/>
+                <w:b w:val="0"/>
+                <w:color w:val="4A4A4A"/>
+                <w:sz w:val="18"/>
+              </w:rPr>
+              <w:t>Status padronizado</w:t>
+            </w:r>
+          </w:p>
+        </w:tc>
+      </w:tr>
+    </w:tbl>
+    <w:p>
+      <w:pPr>
+        <w:spacing w:after="120"/>
+      </w:pPr>
+    </w:p>
+    <w:tbl>
+      <w:tblPr>
+        <w:tblW w:type="auto" w:w="0"/>
+        <w:tblLayout w:type="autofit"/>
+        <w:tblLook w:firstColumn="1" w:firstRow="1" w:lastColumn="0" w:lastRow="0" w:noHBand="0" w:noVBand="1" w:val="04A0"/>
+      </w:tblPr>
+      <w:tblGrid>
+        <w:gridCol w:w="9866"/>
+      </w:tblGrid>
+      <w:tr>
+        <w:tc>
+          <w:tcPr>
+            <w:tcW w:type="dxa" w:w="9866"/>
+            <w:shd w:fill="0F2C59" w:val="clear"/>
+            <w:vAlign w:val="center"/>
+            <w:tcBorders>
+              <w:top w:val="nil" w:sz="0" w:color="0F2C59"/>
+              <w:left w:val="nil" w:sz="0" w:color="0F2C59"/>
+              <w:bottom w:val="nil" w:sz="0" w:color="0F2C59"/>
+              <w:right w:val="nil" w:sz="0" w:color="0F2C59"/>
+            </w:tcBorders>
           </w:tcPr>
           <w:p>
             <w:r/>
@@ -366,970 +1083,47 @@
                 <w:rFonts w:ascii="Calibri" w:hAnsi="Calibri" w:eastAsia="Calibri"/>
                 <w:b/>
                 <w:color w:val="FFFFFF"/>
-                <w:sz w:val="18"/>
+                <w:sz w:val="24"/>
               </w:rPr>
-              <w:t>Impacto no negócio</w:t>
-            </w:r>
-          </w:p>
-        </w:tc>
-        <w:tc>
-          <w:tcPr>
-            <w:tcW w:type="dxa" w:w="1949"/>
-            <w:shd w:fill="1F4E79" w:val="clear"/>
-          </w:tcPr>
-          <w:p>
-            <w:r/>
-            <w:r>
-              <w:rPr>
-                <w:rFonts w:ascii="Calibri" w:hAnsi="Calibri" w:eastAsia="Calibri"/>
-                <w:b/>
-                <w:color w:val="FFFFFF"/>
-                <w:sz w:val="18"/>
-              </w:rPr>
-              <w:t>Responsabilidade primária</w:t>
-            </w:r>
-          </w:p>
-        </w:tc>
-        <w:tc>
-          <w:tcPr>
-            <w:tcW w:type="dxa" w:w="1949"/>
-            <w:shd w:fill="1F4E79" w:val="clear"/>
-          </w:tcPr>
-          <w:p>
-            <w:r/>
-            <w:r>
-              <w:rPr>
-                <w:rFonts w:ascii="Calibri" w:hAnsi="Calibri" w:eastAsia="Calibri"/>
-                <w:b/>
-                <w:color w:val="FFFFFF"/>
-                <w:sz w:val="18"/>
-              </w:rPr>
-              <w:t>Decisão necessária</w:t>
-            </w:r>
-          </w:p>
-        </w:tc>
-      </w:tr>
-      <w:tr>
-        <w:tc>
-          <w:tcPr>
-            <w:tcW w:type="dxa" w:w="1949"/>
-          </w:tcPr>
-          <w:p>
-            <w:r/>
-            <w:r>
-              <w:rPr>
-                <w:rFonts w:ascii="Calibri" w:hAnsi="Calibri" w:eastAsia="Calibri"/>
-                <w:b w:val="0"/>
-                <w:sz w:val="18"/>
-              </w:rPr>
-              <w:t>1</w:t>
-            </w:r>
-          </w:p>
-        </w:tc>
-        <w:tc>
-          <w:tcPr>
-            <w:tcW w:type="dxa" w:w="1949"/>
-          </w:tcPr>
-          <w:p>
-            <w:r/>
-            <w:r>
-              <w:rPr>
-                <w:rFonts w:ascii="Calibri" w:hAnsi="Calibri" w:eastAsia="Calibri"/>
-                <w:b w:val="0"/>
-                <w:sz w:val="18"/>
-              </w:rPr>
-              <w:t>RAPs com baixa eficiência</w:t>
-            </w:r>
-          </w:p>
-        </w:tc>
-        <w:tc>
-          <w:tcPr>
-            <w:tcW w:type="dxa" w:w="1949"/>
-          </w:tcPr>
-          <w:p>
-            <w:r/>
-            <w:r>
-              <w:rPr>
-                <w:rFonts w:ascii="Calibri" w:hAnsi="Calibri" w:eastAsia="Calibri"/>
-                <w:b w:val="0"/>
-                <w:sz w:val="18"/>
-              </w:rPr>
-              <w:t>Perda de ciclo, fila e falsa percepção de “sistema lento”</w:t>
-            </w:r>
-          </w:p>
-        </w:tc>
-        <w:tc>
-          <w:tcPr>
-            <w:tcW w:type="dxa" w:w="1949"/>
-          </w:tcPr>
-          <w:p>
-            <w:r/>
-            <w:r>
-              <w:rPr>
-                <w:rFonts w:ascii="Calibri" w:hAnsi="Calibri" w:eastAsia="Calibri"/>
-                <w:b w:val="0"/>
-                <w:sz w:val="18"/>
-              </w:rPr>
-              <w:t>Área Técnica / Engenharia</w:t>
-            </w:r>
-          </w:p>
-        </w:tc>
-        <w:tc>
-          <w:tcPr>
-            <w:tcW w:type="dxa" w:w="1949"/>
-          </w:tcPr>
-          <w:p>
-            <w:r/>
-            <w:r>
-              <w:rPr>
-                <w:rFonts w:ascii="Calibri" w:hAnsi="Calibri" w:eastAsia="Calibri"/>
-                <w:b w:val="0"/>
-                <w:sz w:val="18"/>
-              </w:rPr>
-              <w:t>Definir spec mínima e plano de upgrade/substituição</w:t>
-            </w:r>
-          </w:p>
-        </w:tc>
-      </w:tr>
-      <w:tr>
-        <w:tc>
-          <w:tcPr>
-            <w:tcW w:type="dxa" w:w="1949"/>
-          </w:tcPr>
-          <w:p>
-            <w:r/>
-            <w:r>
-              <w:rPr>
-                <w:rFonts w:ascii="Calibri" w:hAnsi="Calibri" w:eastAsia="Calibri"/>
-                <w:b w:val="0"/>
-                <w:sz w:val="18"/>
-              </w:rPr>
-              <w:t>2</w:t>
-            </w:r>
-          </w:p>
-        </w:tc>
-        <w:tc>
-          <w:tcPr>
-            <w:tcW w:type="dxa" w:w="1949"/>
-          </w:tcPr>
-          <w:p>
-            <w:r/>
-            <w:r>
-              <w:rPr>
-                <w:rFonts w:ascii="Calibri" w:hAnsi="Calibri" w:eastAsia="Calibri"/>
-                <w:b w:val="0"/>
-                <w:sz w:val="18"/>
-              </w:rPr>
-              <w:t>Cabos Categoria 5</w:t>
-            </w:r>
-          </w:p>
-        </w:tc>
-        <w:tc>
-          <w:tcPr>
-            <w:tcW w:type="dxa" w:w="1949"/>
-          </w:tcPr>
-          <w:p>
-            <w:r/>
-            <w:r>
-              <w:rPr>
-                <w:rFonts w:ascii="Calibri" w:hAnsi="Calibri" w:eastAsia="Calibri"/>
-                <w:b w:val="0"/>
-                <w:sz w:val="18"/>
-              </w:rPr>
-              <w:t>Instabilidade de comunicação e paradas intermitentes</w:t>
-            </w:r>
-          </w:p>
-        </w:tc>
-        <w:tc>
-          <w:tcPr>
-            <w:tcW w:type="dxa" w:w="1949"/>
-          </w:tcPr>
-          <w:p>
-            <w:r/>
-            <w:r>
-              <w:rPr>
-                <w:rFonts w:ascii="Calibri" w:hAnsi="Calibri" w:eastAsia="Calibri"/>
-                <w:b w:val="0"/>
-                <w:sz w:val="18"/>
-              </w:rPr>
-              <w:t>Área Técnica / Engenharia</w:t>
-            </w:r>
-          </w:p>
-        </w:tc>
-        <w:tc>
-          <w:tcPr>
-            <w:tcW w:type="dxa" w:w="1949"/>
-          </w:tcPr>
-          <w:p>
-            <w:r/>
-            <w:r>
-              <w:rPr>
-                <w:rFonts w:ascii="Calibri" w:hAnsi="Calibri" w:eastAsia="Calibri"/>
-                <w:b w:val="0"/>
-                <w:sz w:val="18"/>
-              </w:rPr>
-              <w:t>Padronizar e substituir trechos críticos</w:t>
-            </w:r>
-          </w:p>
-        </w:tc>
-      </w:tr>
-      <w:tr>
-        <w:tc>
-          <w:tcPr>
-            <w:tcW w:type="dxa" w:w="1949"/>
-          </w:tcPr>
-          <w:p>
-            <w:r/>
-            <w:r>
-              <w:rPr>
-                <w:rFonts w:ascii="Calibri" w:hAnsi="Calibri" w:eastAsia="Calibri"/>
-                <w:b w:val="0"/>
-                <w:sz w:val="18"/>
-              </w:rPr>
-              <w:t>3</w:t>
-            </w:r>
-          </w:p>
-        </w:tc>
-        <w:tc>
-          <w:tcPr>
-            <w:tcW w:type="dxa" w:w="1949"/>
-          </w:tcPr>
-          <w:p>
-            <w:r/>
-            <w:r>
-              <w:rPr>
-                <w:rFonts w:ascii="Calibri" w:hAnsi="Calibri" w:eastAsia="Calibri"/>
-                <w:b w:val="0"/>
-                <w:sz w:val="18"/>
-              </w:rPr>
-              <w:t>Erro de configuração de roteiro</w:t>
-            </w:r>
-          </w:p>
-        </w:tc>
-        <w:tc>
-          <w:tcPr>
-            <w:tcW w:type="dxa" w:w="1949"/>
-          </w:tcPr>
-          <w:p>
-            <w:r/>
-            <w:r>
-              <w:rPr>
-                <w:rFonts w:ascii="Calibri" w:hAnsi="Calibri" w:eastAsia="Calibri"/>
-                <w:b w:val="0"/>
-                <w:sz w:val="18"/>
-              </w:rPr>
-              <w:t>Parada imediata, retrabalho e atraso de liberação</w:t>
-            </w:r>
-          </w:p>
-        </w:tc>
-        <w:tc>
-          <w:tcPr>
-            <w:tcW w:type="dxa" w:w="1949"/>
-          </w:tcPr>
-          <w:p>
-            <w:r/>
-            <w:r>
-              <w:rPr>
-                <w:rFonts w:ascii="Calibri" w:hAnsi="Calibri" w:eastAsia="Calibri"/>
-                <w:b w:val="0"/>
-                <w:sz w:val="18"/>
-              </w:rPr>
-              <w:t>Engenharia / Área Técnica</w:t>
-            </w:r>
-          </w:p>
-        </w:tc>
-        <w:tc>
-          <w:tcPr>
-            <w:tcW w:type="dxa" w:w="1949"/>
-          </w:tcPr>
-          <w:p>
-            <w:r/>
-            <w:r>
-              <w:rPr>
-                <w:rFonts w:ascii="Calibri" w:hAnsi="Calibri" w:eastAsia="Calibri"/>
-                <w:b w:val="0"/>
-                <w:sz w:val="18"/>
-              </w:rPr>
-              <w:t>Controle de liberação (checklist + dupla verificação)</w:t>
-            </w:r>
-          </w:p>
-        </w:tc>
-      </w:tr>
-      <w:tr>
-        <w:tc>
-          <w:tcPr>
-            <w:tcW w:type="dxa" w:w="1949"/>
-          </w:tcPr>
-          <w:p>
-            <w:r/>
-            <w:r>
-              <w:rPr>
-                <w:rFonts w:ascii="Calibri" w:hAnsi="Calibri" w:eastAsia="Calibri"/>
-                <w:b w:val="0"/>
-                <w:sz w:val="18"/>
-              </w:rPr>
-              <w:t>4</w:t>
-            </w:r>
-          </w:p>
-        </w:tc>
-        <w:tc>
-          <w:tcPr>
-            <w:tcW w:type="dxa" w:w="1949"/>
-          </w:tcPr>
-          <w:p>
-            <w:r/>
-            <w:r>
-              <w:rPr>
-                <w:rFonts w:ascii="Calibri" w:hAnsi="Calibri" w:eastAsia="Calibri"/>
-                <w:b w:val="0"/>
-                <w:sz w:val="18"/>
-              </w:rPr>
-              <w:t>IP duplicado na linha</w:t>
-            </w:r>
-          </w:p>
-        </w:tc>
-        <w:tc>
-          <w:tcPr>
-            <w:tcW w:type="dxa" w:w="1949"/>
-          </w:tcPr>
-          <w:p>
-            <w:r/>
-            <w:r>
-              <w:rPr>
-                <w:rFonts w:ascii="Calibri" w:hAnsi="Calibri" w:eastAsia="Calibri"/>
-                <w:b w:val="0"/>
-                <w:sz w:val="18"/>
-              </w:rPr>
-              <w:t>Queda de comunicação e interrupção crítica</w:t>
-            </w:r>
-          </w:p>
-        </w:tc>
-        <w:tc>
-          <w:tcPr>
-            <w:tcW w:type="dxa" w:w="1949"/>
-          </w:tcPr>
-          <w:p>
-            <w:r/>
-            <w:r>
-              <w:rPr>
-                <w:rFonts w:ascii="Calibri" w:hAnsi="Calibri" w:eastAsia="Calibri"/>
-                <w:b w:val="0"/>
-                <w:sz w:val="18"/>
-              </w:rPr>
-              <w:t>Área Técnica / Engenharia</w:t>
-            </w:r>
-          </w:p>
-        </w:tc>
-        <w:tc>
-          <w:tcPr>
-            <w:tcW w:type="dxa" w:w="1949"/>
-          </w:tcPr>
-          <w:p>
-            <w:r/>
-            <w:r>
-              <w:rPr>
-                <w:rFonts w:ascii="Calibri" w:hAnsi="Calibri" w:eastAsia="Calibri"/>
-                <w:b w:val="0"/>
-                <w:sz w:val="18"/>
-              </w:rPr>
-              <w:t>Plano de endereçamento e bloqueio de alteração informal</w:t>
-            </w:r>
-          </w:p>
-        </w:tc>
-      </w:tr>
-      <w:tr>
-        <w:tc>
-          <w:tcPr>
-            <w:tcW w:type="dxa" w:w="1949"/>
-          </w:tcPr>
-          <w:p>
-            <w:r/>
-            <w:r>
-              <w:rPr>
-                <w:rFonts w:ascii="Calibri" w:hAnsi="Calibri" w:eastAsia="Calibri"/>
-                <w:b w:val="0"/>
-                <w:sz w:val="18"/>
-              </w:rPr>
-              <w:t>5</w:t>
-            </w:r>
-          </w:p>
-        </w:tc>
-        <w:tc>
-          <w:tcPr>
-            <w:tcW w:type="dxa" w:w="1949"/>
-          </w:tcPr>
-          <w:p>
-            <w:r/>
-            <w:r>
-              <w:rPr>
-                <w:rFonts w:ascii="Calibri" w:hAnsi="Calibri" w:eastAsia="Calibri"/>
-                <w:b w:val="0"/>
-                <w:sz w:val="18"/>
-              </w:rPr>
-              <w:t>PCs com baixa memória/CPU</w:t>
-            </w:r>
-          </w:p>
-        </w:tc>
-        <w:tc>
-          <w:tcPr>
-            <w:tcW w:type="dxa" w:w="1949"/>
-          </w:tcPr>
-          <w:p>
-            <w:r/>
-            <w:r>
-              <w:rPr>
-                <w:rFonts w:ascii="Calibri" w:hAnsi="Calibri" w:eastAsia="Calibri"/>
-                <w:b w:val="0"/>
-                <w:sz w:val="18"/>
-              </w:rPr>
-              <w:t>Travamento de posto e perda de produtividade</w:t>
-            </w:r>
-          </w:p>
-        </w:tc>
-        <w:tc>
-          <w:tcPr>
-            <w:tcW w:type="dxa" w:w="1949"/>
-          </w:tcPr>
-          <w:p>
-            <w:r/>
-            <w:r>
-              <w:rPr>
-                <w:rFonts w:ascii="Calibri" w:hAnsi="Calibri" w:eastAsia="Calibri"/>
-                <w:b w:val="0"/>
-                <w:sz w:val="18"/>
-              </w:rPr>
-              <w:t>Área Técnica / Engenharia</w:t>
-            </w:r>
-          </w:p>
-        </w:tc>
-        <w:tc>
-          <w:tcPr>
-            <w:tcW w:type="dxa" w:w="1949"/>
-          </w:tcPr>
-          <w:p>
-            <w:r/>
-            <w:r>
-              <w:rPr>
-                <w:rFonts w:ascii="Calibri" w:hAnsi="Calibri" w:eastAsia="Calibri"/>
-                <w:b w:val="0"/>
-                <w:sz w:val="18"/>
-              </w:rPr>
-              <w:t>Adequar hardware ao software/processo atual</w:t>
-            </w:r>
-          </w:p>
-        </w:tc>
-      </w:tr>
-      <w:tr>
-        <w:tc>
-          <w:tcPr>
-            <w:tcW w:type="dxa" w:w="1949"/>
-          </w:tcPr>
-          <w:p>
-            <w:r/>
-            <w:r>
-              <w:rPr>
-                <w:rFonts w:ascii="Calibri" w:hAnsi="Calibri" w:eastAsia="Calibri"/>
-                <w:b w:val="0"/>
-                <w:sz w:val="18"/>
-              </w:rPr>
-              <w:t>6</w:t>
-            </w:r>
-          </w:p>
-        </w:tc>
-        <w:tc>
-          <w:tcPr>
-            <w:tcW w:type="dxa" w:w="1949"/>
-          </w:tcPr>
-          <w:p>
-            <w:r/>
-            <w:r>
-              <w:rPr>
-                <w:rFonts w:ascii="Calibri" w:hAnsi="Calibri" w:eastAsia="Calibri"/>
-                <w:b w:val="0"/>
-                <w:sz w:val="18"/>
-              </w:rPr>
-              <w:t>Desorganização passou/não passou</w:t>
-            </w:r>
-          </w:p>
-        </w:tc>
-        <w:tc>
-          <w:tcPr>
-            <w:tcW w:type="dxa" w:w="1949"/>
-          </w:tcPr>
-          <w:p>
-            <w:r/>
-            <w:r>
-              <w:rPr>
-                <w:rFonts w:ascii="Calibri" w:hAnsi="Calibri" w:eastAsia="Calibri"/>
-                <w:b w:val="0"/>
-                <w:sz w:val="18"/>
-              </w:rPr>
-              <w:t>Retrabalho, perda de rastreabilidade e tempo improdutivo</w:t>
-            </w:r>
-          </w:p>
-        </w:tc>
-        <w:tc>
-          <w:tcPr>
-            <w:tcW w:type="dxa" w:w="1949"/>
-          </w:tcPr>
-          <w:p>
-            <w:r/>
-            <w:r>
-              <w:rPr>
-                <w:rFonts w:ascii="Calibri" w:hAnsi="Calibri" w:eastAsia="Calibri"/>
-                <w:b w:val="0"/>
-                <w:sz w:val="18"/>
-              </w:rPr>
-              <w:t>Engenharia / Área Técnica</w:t>
-            </w:r>
-          </w:p>
-        </w:tc>
-        <w:tc>
-          <w:tcPr>
-            <w:tcW w:type="dxa" w:w="1949"/>
-          </w:tcPr>
-          <w:p>
-            <w:r/>
-            <w:r>
-              <w:rPr>
-                <w:rFonts w:ascii="Calibri" w:hAnsi="Calibri" w:eastAsia="Calibri"/>
-                <w:b w:val="0"/>
-                <w:sz w:val="18"/>
-              </w:rPr>
-              <w:t>Padronizar status e disciplina de apontamento</w:t>
+              <w:t xml:space="preserve">  4. Papéis</w:t>
             </w:r>
           </w:p>
         </w:tc>
       </w:tr>
     </w:tbl>
-    <w:p/>
     <w:p>
       <w:pPr>
-        <w:pStyle w:val="Heading1"/>
+        <w:spacing w:before="40" w:after="80"/>
       </w:pPr>
-      <w:r>
-        <w:rPr>
-          <w:rFonts w:ascii="Calibri" w:hAnsi="Calibri" w:eastAsia="Calibri"/>
-          <w:b/>
-          <w:sz w:val="30"/>
-        </w:rPr>
-        <w:t>5. Evidências (anexos)</w:t>
-      </w:r>
-    </w:p>
-    <w:p>
-      <w:pPr>
-        <w:spacing w:after="160"/>
-      </w:pPr>
-      <w:r>
-        <w:rPr>
-          <w:rFonts w:ascii="Calibri" w:hAnsi="Calibri" w:eastAsia="Calibri"/>
-          <w:b w:val="0"/>
-          <w:sz w:val="22"/>
-        </w:rPr>
-        <w:t>As evidências (prints/fotos) serão anexadas para comprovar cada ofensor e sustentar a discussão gerencial:</w:t>
-      </w:r>
     </w:p>
     <w:tbl>
       <w:tblPr>
-        <w:tblStyle w:val="TableGrid"/>
         <w:tblW w:type="auto" w:w="0"/>
-        <w:jc w:val="center"/>
         <w:tblLook w:firstColumn="1" w:firstRow="1" w:lastColumn="0" w:lastRow="0" w:noHBand="0" w:noVBand="1" w:val="04A0"/>
+        <w:tblBorders>
+          <w:top w:val="single" w:sz="4" w:color="D0D7DE"/>
+          <w:left w:val="single" w:sz="4" w:color="D0D7DE"/>
+          <w:bottom w:val="single" w:sz="4" w:color="D0D7DE"/>
+          <w:right w:val="single" w:sz="4" w:color="D0D7DE"/>
+          <w:insideH w:val="single" w:sz="4" w:color="D0D7DE"/>
+          <w:insideV w:val="single" w:sz="4" w:color="D0D7DE"/>
+        </w:tblBorders>
       </w:tblPr>
       <w:tblGrid>
-        <w:gridCol w:w="3249"/>
-        <w:gridCol w:w="3249"/>
-        <w:gridCol w:w="3249"/>
+        <w:gridCol w:w="4933"/>
+        <w:gridCol w:w="4933"/>
       </w:tblGrid>
       <w:tr>
         <w:tc>
           <w:tcPr>
-            <w:tcW w:type="dxa" w:w="3249"/>
-            <w:shd w:fill="1F4E79" w:val="clear"/>
+            <w:tcW w:type="dxa" w:w="4933"/>
+            <w:vAlign w:val="center"/>
+            <w:shd w:fill="0F2C59" w:val="clear"/>
           </w:tcPr>
           <w:p>
-            <w:r/>
-            <w:r>
-              <w:rPr>
-                <w:rFonts w:ascii="Calibri" w:hAnsi="Calibri" w:eastAsia="Calibri"/>
-                <w:b/>
-                <w:color w:val="FFFFFF"/>
-                <w:sz w:val="18"/>
-              </w:rPr>
-              <w:t>Anexo</w:t>
-            </w:r>
-          </w:p>
-        </w:tc>
-        <w:tc>
-          <w:tcPr>
-            <w:tcW w:type="dxa" w:w="3249"/>
-            <w:shd w:fill="1F4E79" w:val="clear"/>
-          </w:tcPr>
-          <w:p>
-            <w:r/>
-            <w:r>
-              <w:rPr>
-                <w:rFonts w:ascii="Calibri" w:hAnsi="Calibri" w:eastAsia="Calibri"/>
-                <w:b/>
-                <w:color w:val="FFFFFF"/>
-                <w:sz w:val="18"/>
-              </w:rPr>
-              <w:t>Ofensor</w:t>
-            </w:r>
-          </w:p>
-        </w:tc>
-        <w:tc>
-          <w:tcPr>
-            <w:tcW w:type="dxa" w:w="3249"/>
-            <w:shd w:fill="1F4E79" w:val="clear"/>
-          </w:tcPr>
-          <w:p>
-            <w:r/>
-            <w:r>
-              <w:rPr>
-                <w:rFonts w:ascii="Calibri" w:hAnsi="Calibri" w:eastAsia="Calibri"/>
-                <w:b/>
-                <w:color w:val="FFFFFF"/>
-                <w:sz w:val="18"/>
-              </w:rPr>
-              <w:t>Evidência</w:t>
-            </w:r>
-          </w:p>
-        </w:tc>
-      </w:tr>
-      <w:tr>
-        <w:tc>
-          <w:tcPr>
-            <w:tcW w:type="dxa" w:w="3249"/>
-          </w:tcPr>
-          <w:p>
-            <w:r/>
-            <w:r>
-              <w:rPr>
-                <w:rFonts w:ascii="Calibri" w:hAnsi="Calibri" w:eastAsia="Calibri"/>
-                <w:b w:val="0"/>
-                <w:sz w:val="18"/>
-              </w:rPr>
-              <w:t>A</w:t>
-            </w:r>
-          </w:p>
-        </w:tc>
-        <w:tc>
-          <w:tcPr>
-            <w:tcW w:type="dxa" w:w="3249"/>
-          </w:tcPr>
-          <w:p>
-            <w:r/>
-            <w:r>
-              <w:rPr>
-                <w:rFonts w:ascii="Calibri" w:hAnsi="Calibri" w:eastAsia="Calibri"/>
-                <w:b w:val="0"/>
-                <w:sz w:val="18"/>
-              </w:rPr>
-              <w:t>RAPs baixa eficiência</w:t>
-            </w:r>
-          </w:p>
-        </w:tc>
-        <w:tc>
-          <w:tcPr>
-            <w:tcW w:type="dxa" w:w="3249"/>
-          </w:tcPr>
-          <w:p>
-            <w:r/>
-            <w:r>
-              <w:rPr>
-                <w:rFonts w:ascii="Calibri" w:hAnsi="Calibri" w:eastAsia="Calibri"/>
-                <w:b w:val="0"/>
-                <w:sz w:val="18"/>
-              </w:rPr>
-              <w:t>[ ] Print/foto</w:t>
-            </w:r>
-          </w:p>
-        </w:tc>
-      </w:tr>
-      <w:tr>
-        <w:tc>
-          <w:tcPr>
-            <w:tcW w:type="dxa" w:w="3249"/>
-          </w:tcPr>
-          <w:p>
-            <w:r/>
-            <w:r>
-              <w:rPr>
-                <w:rFonts w:ascii="Calibri" w:hAnsi="Calibri" w:eastAsia="Calibri"/>
-                <w:b w:val="0"/>
-                <w:sz w:val="18"/>
-              </w:rPr>
-              <w:t>B</w:t>
-            </w:r>
-          </w:p>
-        </w:tc>
-        <w:tc>
-          <w:tcPr>
-            <w:tcW w:type="dxa" w:w="3249"/>
-          </w:tcPr>
-          <w:p>
-            <w:r/>
-            <w:r>
-              <w:rPr>
-                <w:rFonts w:ascii="Calibri" w:hAnsi="Calibri" w:eastAsia="Calibri"/>
-                <w:b w:val="0"/>
-                <w:sz w:val="18"/>
-              </w:rPr>
-              <w:t>Cabos Cat5</w:t>
-            </w:r>
-          </w:p>
-        </w:tc>
-        <w:tc>
-          <w:tcPr>
-            <w:tcW w:type="dxa" w:w="3249"/>
-          </w:tcPr>
-          <w:p>
-            <w:r/>
-            <w:r>
-              <w:rPr>
-                <w:rFonts w:ascii="Calibri" w:hAnsi="Calibri" w:eastAsia="Calibri"/>
-                <w:b w:val="0"/>
-                <w:sz w:val="18"/>
-              </w:rPr>
-              <w:t>[ ] Print/foto</w:t>
-            </w:r>
-          </w:p>
-        </w:tc>
-      </w:tr>
-      <w:tr>
-        <w:tc>
-          <w:tcPr>
-            <w:tcW w:type="dxa" w:w="3249"/>
-          </w:tcPr>
-          <w:p>
-            <w:r/>
-            <w:r>
-              <w:rPr>
-                <w:rFonts w:ascii="Calibri" w:hAnsi="Calibri" w:eastAsia="Calibri"/>
-                <w:b w:val="0"/>
-                <w:sz w:val="18"/>
-              </w:rPr>
-              <w:t>C</w:t>
-            </w:r>
-          </w:p>
-        </w:tc>
-        <w:tc>
-          <w:tcPr>
-            <w:tcW w:type="dxa" w:w="3249"/>
-          </w:tcPr>
-          <w:p>
-            <w:r/>
-            <w:r>
-              <w:rPr>
-                <w:rFonts w:ascii="Calibri" w:hAnsi="Calibri" w:eastAsia="Calibri"/>
-                <w:b w:val="0"/>
-                <w:sz w:val="18"/>
-              </w:rPr>
-              <w:t>Erro de roteiro</w:t>
-            </w:r>
-          </w:p>
-        </w:tc>
-        <w:tc>
-          <w:tcPr>
-            <w:tcW w:type="dxa" w:w="3249"/>
-          </w:tcPr>
-          <w:p>
-            <w:r/>
-            <w:r>
-              <w:rPr>
-                <w:rFonts w:ascii="Calibri" w:hAnsi="Calibri" w:eastAsia="Calibri"/>
-                <w:b w:val="0"/>
-                <w:sz w:val="18"/>
-              </w:rPr>
-              <w:t>[ ] Print/foto</w:t>
-            </w:r>
-          </w:p>
-        </w:tc>
-      </w:tr>
-      <w:tr>
-        <w:tc>
-          <w:tcPr>
-            <w:tcW w:type="dxa" w:w="3249"/>
-          </w:tcPr>
-          <w:p>
-            <w:r/>
-            <w:r>
-              <w:rPr>
-                <w:rFonts w:ascii="Calibri" w:hAnsi="Calibri" w:eastAsia="Calibri"/>
-                <w:b w:val="0"/>
-                <w:sz w:val="18"/>
-              </w:rPr>
-              <w:t>D</w:t>
-            </w:r>
-          </w:p>
-        </w:tc>
-        <w:tc>
-          <w:tcPr>
-            <w:tcW w:type="dxa" w:w="3249"/>
-          </w:tcPr>
-          <w:p>
-            <w:r/>
-            <w:r>
-              <w:rPr>
-                <w:rFonts w:ascii="Calibri" w:hAnsi="Calibri" w:eastAsia="Calibri"/>
-                <w:b w:val="0"/>
-                <w:sz w:val="18"/>
-              </w:rPr>
-              <w:t>IP duplicado</w:t>
-            </w:r>
-          </w:p>
-        </w:tc>
-        <w:tc>
-          <w:tcPr>
-            <w:tcW w:type="dxa" w:w="3249"/>
-          </w:tcPr>
-          <w:p>
-            <w:r/>
-            <w:r>
-              <w:rPr>
-                <w:rFonts w:ascii="Calibri" w:hAnsi="Calibri" w:eastAsia="Calibri"/>
-                <w:b w:val="0"/>
-                <w:sz w:val="18"/>
-              </w:rPr>
-              <w:t>[ ] Print/foto</w:t>
-            </w:r>
-          </w:p>
-        </w:tc>
-      </w:tr>
-      <w:tr>
-        <w:tc>
-          <w:tcPr>
-            <w:tcW w:type="dxa" w:w="3249"/>
-          </w:tcPr>
-          <w:p>
-            <w:r/>
-            <w:r>
-              <w:rPr>
-                <w:rFonts w:ascii="Calibri" w:hAnsi="Calibri" w:eastAsia="Calibri"/>
-                <w:b w:val="0"/>
-                <w:sz w:val="18"/>
-              </w:rPr>
-              <w:t>E</w:t>
-            </w:r>
-          </w:p>
-        </w:tc>
-        <w:tc>
-          <w:tcPr>
-            <w:tcW w:type="dxa" w:w="3249"/>
-          </w:tcPr>
-          <w:p>
-            <w:r/>
-            <w:r>
-              <w:rPr>
-                <w:rFonts w:ascii="Calibri" w:hAnsi="Calibri" w:eastAsia="Calibri"/>
-                <w:b w:val="0"/>
-                <w:sz w:val="18"/>
-              </w:rPr>
-              <w:t>PCs baixa performance</w:t>
-            </w:r>
-          </w:p>
-        </w:tc>
-        <w:tc>
-          <w:tcPr>
-            <w:tcW w:type="dxa" w:w="3249"/>
-          </w:tcPr>
-          <w:p>
-            <w:r/>
-            <w:r>
-              <w:rPr>
-                <w:rFonts w:ascii="Calibri" w:hAnsi="Calibri" w:eastAsia="Calibri"/>
-                <w:b w:val="0"/>
-                <w:sz w:val="18"/>
-              </w:rPr>
-              <w:t>[ ] Print/foto</w:t>
-            </w:r>
-          </w:p>
-        </w:tc>
-      </w:tr>
-      <w:tr>
-        <w:tc>
-          <w:tcPr>
-            <w:tcW w:type="dxa" w:w="3249"/>
-          </w:tcPr>
-          <w:p>
-            <w:r/>
-            <w:r>
-              <w:rPr>
-                <w:rFonts w:ascii="Calibri" w:hAnsi="Calibri" w:eastAsia="Calibri"/>
-                <w:b w:val="0"/>
-                <w:sz w:val="18"/>
-              </w:rPr>
-              <w:t>F</w:t>
-            </w:r>
-          </w:p>
-        </w:tc>
-        <w:tc>
-          <w:tcPr>
-            <w:tcW w:type="dxa" w:w="3249"/>
-          </w:tcPr>
-          <w:p>
-            <w:r/>
-            <w:r>
-              <w:rPr>
-                <w:rFonts w:ascii="Calibri" w:hAnsi="Calibri" w:eastAsia="Calibri"/>
-                <w:b w:val="0"/>
-                <w:sz w:val="18"/>
-              </w:rPr>
-              <w:t>Passou / não passou</w:t>
-            </w:r>
-          </w:p>
-        </w:tc>
-        <w:tc>
-          <w:tcPr>
-            <w:tcW w:type="dxa" w:w="3249"/>
-          </w:tcPr>
-          <w:p>
-            <w:r/>
-            <w:r>
-              <w:rPr>
-                <w:rFonts w:ascii="Calibri" w:hAnsi="Calibri" w:eastAsia="Calibri"/>
-                <w:b w:val="0"/>
-                <w:sz w:val="18"/>
-              </w:rPr>
-              <w:t>[ ] Print/foto</w:t>
-            </w:r>
-          </w:p>
-        </w:tc>
-      </w:tr>
-    </w:tbl>
-    <w:p/>
-    <w:p>
-      <w:pPr>
-        <w:pStyle w:val="Heading1"/>
-      </w:pPr>
-      <w:r>
-        <w:rPr>
-          <w:rFonts w:ascii="Calibri" w:hAnsi="Calibri" w:eastAsia="Calibri"/>
-          <w:b/>
-          <w:sz w:val="30"/>
-        </w:rPr>
-        <w:t>6. Papéis e responsabilidades</w:t>
-      </w:r>
-    </w:p>
-    <w:tbl>
-      <w:tblPr>
-        <w:tblStyle w:val="TableGrid"/>
-        <w:tblW w:type="auto" w:w="0"/>
-        <w:jc w:val="center"/>
-        <w:tblLook w:firstColumn="1" w:firstRow="1" w:lastColumn="0" w:lastRow="0" w:noHBand="0" w:noVBand="1" w:val="04A0"/>
-      </w:tblPr>
-      <w:tblGrid>
-        <w:gridCol w:w="4873"/>
-        <w:gridCol w:w="4873"/>
-      </w:tblGrid>
-      <w:tr>
-        <w:tc>
-          <w:tcPr>
-            <w:tcW w:type="dxa" w:w="4873"/>
-            <w:shd w:fill="1F4E79" w:val="clear"/>
-          </w:tcPr>
-          <w:p>
+            <w:pPr>
+              <w:jc w:val="center"/>
+            </w:pPr>
             <w:r/>
             <w:r>
               <w:rPr>
@@ -1344,8 +1138,183 @@
         </w:tc>
         <w:tc>
           <w:tcPr>
-            <w:tcW w:type="dxa" w:w="4873"/>
-            <w:shd w:fill="1F4E79" w:val="clear"/>
+            <w:tcW w:type="dxa" w:w="4933"/>
+            <w:vAlign w:val="center"/>
+            <w:shd w:fill="0F2C59" w:val="clear"/>
+          </w:tcPr>
+          <w:p>
+            <w:pPr>
+              <w:jc w:val="center"/>
+            </w:pPr>
+            <w:r/>
+            <w:r>
+              <w:rPr>
+                <w:rFonts w:ascii="Calibri" w:hAnsi="Calibri" w:eastAsia="Calibri"/>
+                <w:b/>
+                <w:color w:val="FFFFFF"/>
+                <w:sz w:val="18"/>
+              </w:rPr>
+              <w:t>Responsabilidade estratégica</w:t>
+            </w:r>
+          </w:p>
+        </w:tc>
+      </w:tr>
+      <w:tr>
+        <w:tc>
+          <w:tcPr>
+            <w:tcW w:type="dxa" w:w="4933"/>
+            <w:vAlign w:val="center"/>
+            <w:shd w:fill="F7F9FC" w:val="clear"/>
+          </w:tcPr>
+          <w:p>
+            <w:pPr>
+              <w:jc w:val="center"/>
+            </w:pPr>
+            <w:r/>
+            <w:r>
+              <w:rPr>
+                <w:rFonts w:ascii="Calibri" w:hAnsi="Calibri" w:eastAsia="Calibri"/>
+                <w:b w:val="0"/>
+                <w:color w:val="4A4A4A"/>
+                <w:sz w:val="18"/>
+              </w:rPr>
+              <w:t>Engenharia</w:t>
+            </w:r>
+          </w:p>
+        </w:tc>
+        <w:tc>
+          <w:tcPr>
+            <w:tcW w:type="dxa" w:w="4933"/>
+            <w:vAlign w:val="center"/>
+            <w:shd w:fill="F7F9FC" w:val="clear"/>
+          </w:tcPr>
+          <w:p>
+            <w:r/>
+            <w:r>
+              <w:rPr>
+                <w:rFonts w:ascii="Calibri" w:hAnsi="Calibri" w:eastAsia="Calibri"/>
+                <w:b w:val="0"/>
+                <w:color w:val="4A4A4A"/>
+                <w:sz w:val="18"/>
+              </w:rPr>
+              <w:t>Roteiro, modelo, postos e padronização de processo</w:t>
+            </w:r>
+          </w:p>
+        </w:tc>
+      </w:tr>
+      <w:tr>
+        <w:tc>
+          <w:tcPr>
+            <w:tcW w:type="dxa" w:w="4933"/>
+            <w:vAlign w:val="center"/>
+            <w:shd w:fill="FFFFFF" w:val="clear"/>
+          </w:tcPr>
+          <w:p>
+            <w:pPr>
+              <w:jc w:val="center"/>
+            </w:pPr>
+            <w:r/>
+            <w:r>
+              <w:rPr>
+                <w:rFonts w:ascii="Calibri" w:hAnsi="Calibri" w:eastAsia="Calibri"/>
+                <w:b w:val="0"/>
+                <w:color w:val="4A4A4A"/>
+                <w:sz w:val="18"/>
+              </w:rPr>
+              <w:t>Área Técnica</w:t>
+            </w:r>
+          </w:p>
+        </w:tc>
+        <w:tc>
+          <w:tcPr>
+            <w:tcW w:type="dxa" w:w="4933"/>
+            <w:vAlign w:val="center"/>
+            <w:shd w:fill="FFFFFF" w:val="clear"/>
+          </w:tcPr>
+          <w:p>
+            <w:r/>
+            <w:r>
+              <w:rPr>
+                <w:rFonts w:ascii="Calibri" w:hAnsi="Calibri" w:eastAsia="Calibri"/>
+                <w:b w:val="0"/>
+                <w:color w:val="4A4A4A"/>
+                <w:sz w:val="18"/>
+              </w:rPr>
+              <w:t>Condição do posto: equipamento, cabo, IP e desempenho</w:t>
+            </w:r>
+          </w:p>
+        </w:tc>
+      </w:tr>
+      <w:tr>
+        <w:tc>
+          <w:tcPr>
+            <w:tcW w:type="dxa" w:w="4933"/>
+            <w:vAlign w:val="center"/>
+            <w:shd w:fill="F7F9FC" w:val="clear"/>
+          </w:tcPr>
+          <w:p>
+            <w:pPr>
+              <w:jc w:val="center"/>
+            </w:pPr>
+            <w:r/>
+            <w:r>
+              <w:rPr>
+                <w:rFonts w:ascii="Calibri" w:hAnsi="Calibri" w:eastAsia="Calibri"/>
+                <w:b w:val="0"/>
+                <w:color w:val="4A4A4A"/>
+                <w:sz w:val="18"/>
+              </w:rPr>
+              <w:t>TI</w:t>
+            </w:r>
+          </w:p>
+        </w:tc>
+        <w:tc>
+          <w:tcPr>
+            <w:tcW w:type="dxa" w:w="4933"/>
+            <w:vAlign w:val="center"/>
+            <w:shd w:fill="F7F9FC" w:val="clear"/>
+          </w:tcPr>
+          <w:p>
+            <w:r/>
+            <w:r>
+              <w:rPr>
+                <w:rFonts w:ascii="Calibri" w:hAnsi="Calibri" w:eastAsia="Calibri"/>
+                <w:b w:val="0"/>
+                <w:color w:val="4A4A4A"/>
+                <w:sz w:val="18"/>
+              </w:rPr>
+              <w:t>Diagnóstico com evidência, rede/sistema e capacitação</w:t>
+            </w:r>
+          </w:p>
+        </w:tc>
+      </w:tr>
+    </w:tbl>
+    <w:p>
+      <w:pPr>
+        <w:spacing w:after="120"/>
+      </w:pPr>
+    </w:p>
+    <w:tbl>
+      <w:tblPr>
+        <w:tblW w:type="auto" w:w="0"/>
+        <w:tblLayout w:type="autofit"/>
+        <w:tblLook w:firstColumn="1" w:firstRow="1" w:lastColumn="0" w:lastRow="0" w:noHBand="0" w:noVBand="1" w:val="04A0"/>
+      </w:tblPr>
+      <w:tblGrid>
+        <w:gridCol w:w="9866"/>
+      </w:tblGrid>
+      <w:tr>
+        <w:tc>
+          <w:tcPr>
+            <w:tcW w:type="dxa" w:w="9866"/>
+            <w:shd w:fill="0F2C59" w:val="clear"/>
+            <w:vAlign w:val="center"/>
+            <w:tcBorders>
+              <w:top w:val="nil" w:sz="0" w:color="0F2C59"/>
+              <w:left w:val="nil" w:sz="0" w:color="0F2C59"/>
+              <w:bottom w:val="nil" w:sz="0" w:color="0F2C59"/>
+              <w:right w:val="nil" w:sz="0" w:color="0F2C59"/>
+            </w:tcBorders>
           </w:tcPr>
           <w:p>
             <w:r/>
@@ -1354,141 +1323,31 @@
                 <w:rFonts w:ascii="Calibri" w:hAnsi="Calibri" w:eastAsia="Calibri"/>
                 <w:b/>
                 <w:color w:val="FFFFFF"/>
-                <w:sz w:val="18"/>
+                <w:sz w:val="24"/>
               </w:rPr>
-              <w:t>Papel estratégico</w:t>
-            </w:r>
-          </w:p>
-        </w:tc>
-      </w:tr>
-      <w:tr>
-        <w:tc>
-          <w:tcPr>
-            <w:tcW w:type="dxa" w:w="4873"/>
-          </w:tcPr>
-          <w:p>
-            <w:r/>
-            <w:r>
-              <w:rPr>
-                <w:rFonts w:ascii="Calibri" w:hAnsi="Calibri" w:eastAsia="Calibri"/>
-                <w:b w:val="0"/>
-                <w:sz w:val="18"/>
-              </w:rPr>
-              <w:t>Engenharia</w:t>
-            </w:r>
-          </w:p>
-        </w:tc>
-        <w:tc>
-          <w:tcPr>
-            <w:tcW w:type="dxa" w:w="4873"/>
-          </w:tcPr>
-          <w:p>
-            <w:r/>
-            <w:r>
-              <w:rPr>
-                <w:rFonts w:ascii="Calibri" w:hAnsi="Calibri" w:eastAsia="Calibri"/>
-                <w:b w:val="0"/>
-                <w:sz w:val="18"/>
-              </w:rPr>
-              <w:t>Garantir configuração correta de roteiro/modelo/postos e padronização de processo</w:t>
-            </w:r>
-          </w:p>
-        </w:tc>
-      </w:tr>
-      <w:tr>
-        <w:tc>
-          <w:tcPr>
-            <w:tcW w:type="dxa" w:w="4873"/>
-          </w:tcPr>
-          <w:p>
-            <w:r/>
-            <w:r>
-              <w:rPr>
-                <w:rFonts w:ascii="Calibri" w:hAnsi="Calibri" w:eastAsia="Calibri"/>
-                <w:b w:val="0"/>
-                <w:sz w:val="18"/>
-              </w:rPr>
-              <w:t>Área Técnica</w:t>
-            </w:r>
-          </w:p>
-        </w:tc>
-        <w:tc>
-          <w:tcPr>
-            <w:tcW w:type="dxa" w:w="4873"/>
-          </w:tcPr>
-          <w:p>
-            <w:r/>
-            <w:r>
-              <w:rPr>
-                <w:rFonts w:ascii="Calibri" w:hAnsi="Calibri" w:eastAsia="Calibri"/>
-                <w:b w:val="0"/>
-                <w:sz w:val="18"/>
-              </w:rPr>
-              <w:t>Garantir condição do posto (equipamento, cabo, IP, desempenho) e disciplina operacional</w:t>
-            </w:r>
-          </w:p>
-        </w:tc>
-      </w:tr>
-      <w:tr>
-        <w:tc>
-          <w:tcPr>
-            <w:tcW w:type="dxa" w:w="4873"/>
-          </w:tcPr>
-          <w:p>
-            <w:r/>
-            <w:r>
-              <w:rPr>
-                <w:rFonts w:ascii="Calibri" w:hAnsi="Calibri" w:eastAsia="Calibri"/>
-                <w:b w:val="0"/>
-                <w:sz w:val="18"/>
-              </w:rPr>
-              <w:t>TI</w:t>
-            </w:r>
-          </w:p>
-        </w:tc>
-        <w:tc>
-          <w:tcPr>
-            <w:tcW w:type="dxa" w:w="4873"/>
-          </w:tcPr>
-          <w:p>
-            <w:r/>
-            <w:r>
-              <w:rPr>
-                <w:rFonts w:ascii="Calibri" w:hAnsi="Calibri" w:eastAsia="Calibri"/>
-                <w:b w:val="0"/>
-                <w:sz w:val="18"/>
-              </w:rPr>
-              <w:t>Apoiar diagnóstico com evidência, mapear conflitos de rede/sistema e capacitar as áreas</w:t>
+              <w:t xml:space="preserve">  5. Compromisso da TI — Treinamento</w:t>
             </w:r>
           </w:p>
         </w:tc>
       </w:tr>
     </w:tbl>
-    <w:p/>
     <w:p>
       <w:pPr>
-        <w:pStyle w:val="Heading1"/>
+        <w:spacing w:before="40" w:after="80"/>
       </w:pPr>
-      <w:r>
-        <w:rPr>
-          <w:rFonts w:ascii="Calibri" w:hAnsi="Calibri" w:eastAsia="Calibri"/>
-          <w:b/>
-          <w:sz w:val="30"/>
-        </w:rPr>
-        <w:t>7. Compromisso da TI — Treinamento</w:t>
-      </w:r>
     </w:p>
     <w:p>
       <w:pPr>
-        <w:spacing w:after="160"/>
+        <w:spacing w:after="40" w:before="0"/>
       </w:pPr>
       <w:r>
         <w:rPr>
           <w:rFonts w:ascii="Calibri" w:hAnsi="Calibri" w:eastAsia="Calibri"/>
           <w:b w:val="0"/>
-          <w:sz w:val="22"/>
+          <w:color w:val="4A4A4A"/>
+          <w:sz w:val="21"/>
         </w:rPr>
-        <w:t>Para reduzir reincidência e melhorar a qualidade do primeiro diagnóstico, a TI realizará treinamento direcionado à Área Técnica e Engenharia, cobrindo:</w:t>
+        <w:t>A TI capacitará Área Técnica e Engenharia em:</w:t>
       </w:r>
     </w:p>
     <w:p>
@@ -1499,9 +1358,10 @@
         <w:rPr>
           <w:rFonts w:ascii="Calibri" w:hAnsi="Calibri" w:eastAsia="Calibri"/>
           <w:b w:val="0"/>
-          <w:sz w:val="22"/>
+          <w:color w:val="4A4A4A"/>
+          <w:sz w:val="21"/>
         </w:rPr>
-        <w:t>Configuração de IP em RAPs (padronização e prevenção de IP duplicado)</w:t>
+        <w:t>Configuração de IP em RAPs (padronização e prevenção de duplicidade)</w:t>
       </w:r>
     </w:p>
     <w:p>
@@ -1512,9 +1372,10 @@
         <w:rPr>
           <w:rFonts w:ascii="Calibri" w:hAnsi="Calibri" w:eastAsia="Calibri"/>
           <w:b w:val="0"/>
-          <w:sz w:val="22"/>
+          <w:color w:val="4A4A4A"/>
+          <w:sz w:val="21"/>
         </w:rPr>
-        <w:t>Configuração e uso do Filebeat (coleta/envio de logs e boas práticas)</w:t>
+        <w:t>Filebeat — coleta/envio de logs e boas práticas</w:t>
       </w:r>
     </w:p>
     <w:p>
@@ -1525,136 +1386,382 @@
         <w:rPr>
           <w:rFonts w:ascii="Calibri" w:hAnsi="Calibri" w:eastAsia="Calibri"/>
           <w:b w:val="0"/>
-          <w:sz w:val="22"/>
+          <w:color w:val="4A4A4A"/>
+          <w:sz w:val="21"/>
         </w:rPr>
-        <w:t>Checklist mínimo antes de classificar a ocorrência como “falha de TI”</w:t>
+        <w:t>Checklist mínimo antes de classificar ocorrência como “falha de TI”</w:t>
       </w:r>
     </w:p>
     <w:p>
       <w:pPr>
-        <w:spacing w:after="160"/>
+        <w:spacing w:after="120" w:before="80"/>
       </w:pPr>
       <w:r>
         <w:rPr>
           <w:rFonts w:ascii="Calibri" w:hAnsi="Calibri" w:eastAsia="Calibri"/>
           <w:b w:val="0"/>
-          <w:sz w:val="22"/>
+          <w:color w:val="4A4A4A"/>
+          <w:sz w:val="20"/>
         </w:rPr>
-        <w:t>Data prevista: ____/____/________    |    Responsável TI: ____________________</w:t>
-      </w:r>
-    </w:p>
-    <w:p>
-      <w:pPr>
-        <w:pStyle w:val="Heading1"/>
-      </w:pPr>
-      <w:r>
-        <w:rPr>
-          <w:rFonts w:ascii="Calibri" w:hAnsi="Calibri" w:eastAsia="Calibri"/>
-          <w:b/>
-          <w:sz w:val="30"/>
-        </w:rPr>
-        <w:t>8. Decisões solicitadas à gerência</w:t>
-      </w:r>
-    </w:p>
-    <w:p>
-      <w:pPr>
-        <w:spacing w:after="160"/>
-      </w:pPr>
-      <w:r>
-        <w:rPr>
-          <w:rFonts w:ascii="Calibri" w:hAnsi="Calibri" w:eastAsia="Calibri"/>
-          <w:b w:val="0"/>
-          <w:sz w:val="22"/>
-        </w:rPr>
-        <w:t>Para sair do empasse e reduzir a lentidão de forma sustentável, solicitamos alinhamento formal sobre:</w:t>
-      </w:r>
-    </w:p>
-    <w:p>
-      <w:pPr>
-        <w:pStyle w:val="ListBullet"/>
-      </w:pPr>
-      <w:r>
-        <w:rPr>
-          <w:rFonts w:ascii="Calibri" w:hAnsi="Calibri" w:eastAsia="Calibri"/>
-          <w:b w:val="0"/>
-          <w:sz w:val="22"/>
-        </w:rPr>
-        <w:t>Reconhecer os ofensores acima como prioritários de Engenharia e Área Técnica</w:t>
-      </w:r>
-    </w:p>
-    <w:p>
-      <w:pPr>
-        <w:pStyle w:val="ListBullet"/>
-      </w:pPr>
-      <w:r>
-        <w:rPr>
-          <w:rFonts w:ascii="Calibri" w:hAnsi="Calibri" w:eastAsia="Calibri"/>
-          <w:b w:val="0"/>
-          <w:sz w:val="22"/>
-        </w:rPr>
-        <w:t>Definir dono e prazo para cada ação do plano abaixo</w:t>
-      </w:r>
-    </w:p>
-    <w:p>
-      <w:pPr>
-        <w:pStyle w:val="ListBullet"/>
-      </w:pPr>
-      <w:r>
-        <w:rPr>
-          <w:rFonts w:ascii="Calibri" w:hAnsi="Calibri" w:eastAsia="Calibri"/>
-          <w:b w:val="0"/>
-          <w:sz w:val="22"/>
-        </w:rPr>
-        <w:t>Adotar triagem por causa raiz (com evidência) antes de escalar para TI</w:t>
-      </w:r>
-    </w:p>
-    <w:p>
-      <w:pPr>
-        <w:pStyle w:val="ListBullet"/>
-      </w:pPr>
-      <w:r>
-        <w:rPr>
-          <w:rFonts w:ascii="Calibri" w:hAnsi="Calibri" w:eastAsia="Calibri"/>
-          <w:b w:val="0"/>
-          <w:sz w:val="22"/>
-        </w:rPr>
-        <w:t>Apoiar o treinamento da TI e a padronização de IP/Filebeat nos postos</w:t>
-      </w:r>
-    </w:p>
-    <w:p>
-      <w:pPr>
-        <w:pStyle w:val="Heading1"/>
-      </w:pPr>
-      <w:r>
-        <w:rPr>
-          <w:rFonts w:ascii="Calibri" w:hAnsi="Calibri" w:eastAsia="Calibri"/>
-          <w:b/>
-          <w:sz w:val="30"/>
-        </w:rPr>
-        <w:t>9. Plano de ação (para acompanhamento gerencial)</w:t>
+        <w:t>Data: ____/____/________     Responsável TI: ____________________</w:t>
       </w:r>
     </w:p>
     <w:tbl>
       <w:tblPr>
-        <w:tblStyle w:val="TableGrid"/>
         <w:tblW w:type="auto" w:w="0"/>
-        <w:jc w:val="center"/>
+        <w:tblLayout w:type="autofit"/>
         <w:tblLook w:firstColumn="1" w:firstRow="1" w:lastColumn="0" w:lastRow="0" w:noHBand="0" w:noVBand="1" w:val="04A0"/>
       </w:tblPr>
       <w:tblGrid>
-        <w:gridCol w:w="1949"/>
-        <w:gridCol w:w="1949"/>
-        <w:gridCol w:w="1949"/>
-        <w:gridCol w:w="1949"/>
-        <w:gridCol w:w="1949"/>
+        <w:gridCol w:w="9866"/>
       </w:tblGrid>
       <w:tr>
         <w:tc>
           <w:tcPr>
-            <w:tcW w:type="dxa" w:w="1949"/>
-            <w:shd w:fill="1F4E79" w:val="clear"/>
+            <w:tcW w:type="dxa" w:w="9866"/>
+            <w:shd w:fill="0F2C59" w:val="clear"/>
+            <w:vAlign w:val="center"/>
+            <w:tcBorders>
+              <w:top w:val="nil" w:sz="0" w:color="0F2C59"/>
+              <w:left w:val="nil" w:sz="0" w:color="0F2C59"/>
+              <w:bottom w:val="nil" w:sz="0" w:color="0F2C59"/>
+              <w:right w:val="nil" w:sz="0" w:color="0F2C59"/>
+            </w:tcBorders>
           </w:tcPr>
           <w:p>
+            <w:r/>
+            <w:r>
+              <w:rPr>
+                <w:rFonts w:ascii="Calibri" w:hAnsi="Calibri" w:eastAsia="Calibri"/>
+                <w:b/>
+                <w:color w:val="FFFFFF"/>
+                <w:sz w:val="24"/>
+              </w:rPr>
+              <w:t xml:space="preserve">  6. Decisões solicitadas</w:t>
+            </w:r>
+          </w:p>
+        </w:tc>
+      </w:tr>
+    </w:tbl>
+    <w:p>
+      <w:pPr>
+        <w:spacing w:before="40" w:after="80"/>
+      </w:pPr>
+    </w:p>
+    <w:tbl>
+      <w:tblPr>
+        <w:tblW w:type="auto" w:w="0"/>
+        <w:tblLook w:firstColumn="1" w:firstRow="1" w:lastColumn="0" w:lastRow="0" w:noHBand="0" w:noVBand="1" w:val="04A0"/>
+        <w:tblBorders>
+          <w:top w:val="single" w:sz="4" w:color="D0D7DE"/>
+          <w:left w:val="single" w:sz="4" w:color="D0D7DE"/>
+          <w:bottom w:val="single" w:sz="4" w:color="D0D7DE"/>
+          <w:right w:val="single" w:sz="4" w:color="D0D7DE"/>
+          <w:insideH w:val="single" w:sz="4" w:color="D0D7DE"/>
+          <w:insideV w:val="single" w:sz="4" w:color="D0D7DE"/>
+        </w:tblBorders>
+      </w:tblPr>
+      <w:tblGrid>
+        <w:gridCol w:w="4933"/>
+        <w:gridCol w:w="4933"/>
+      </w:tblGrid>
+      <w:tr>
+        <w:tc>
+          <w:tcPr>
+            <w:tcW w:type="dxa" w:w="4933"/>
+            <w:vAlign w:val="center"/>
+            <w:shd w:fill="0F2C59" w:val="clear"/>
+          </w:tcPr>
+          <w:p>
+            <w:pPr>
+              <w:jc w:val="center"/>
+            </w:pPr>
+            <w:r/>
+            <w:r>
+              <w:rPr>
+                <w:rFonts w:ascii="Calibri" w:hAnsi="Calibri" w:eastAsia="Calibri"/>
+                <w:b/>
+                <w:color w:val="FFFFFF"/>
+                <w:sz w:val="18"/>
+              </w:rPr>
+              <w:t>#</w:t>
+            </w:r>
+          </w:p>
+        </w:tc>
+        <w:tc>
+          <w:tcPr>
+            <w:tcW w:type="dxa" w:w="4933"/>
+            <w:vAlign w:val="center"/>
+            <w:shd w:fill="0F2C59" w:val="clear"/>
+          </w:tcPr>
+          <w:p>
+            <w:pPr>
+              <w:jc w:val="center"/>
+            </w:pPr>
+            <w:r/>
+            <w:r>
+              <w:rPr>
+                <w:rFonts w:ascii="Calibri" w:hAnsi="Calibri" w:eastAsia="Calibri"/>
+                <w:b/>
+                <w:color w:val="FFFFFF"/>
+                <w:sz w:val="18"/>
+              </w:rPr>
+              <w:t>Decisão</w:t>
+            </w:r>
+          </w:p>
+        </w:tc>
+      </w:tr>
+      <w:tr>
+        <w:tc>
+          <w:tcPr>
+            <w:tcW w:type="dxa" w:w="4933"/>
+            <w:vAlign w:val="center"/>
+            <w:shd w:fill="F7F9FC" w:val="clear"/>
+          </w:tcPr>
+          <w:p>
+            <w:pPr>
+              <w:jc w:val="center"/>
+            </w:pPr>
+            <w:r/>
+            <w:r>
+              <w:rPr>
+                <w:rFonts w:ascii="Calibri" w:hAnsi="Calibri" w:eastAsia="Calibri"/>
+                <w:b w:val="0"/>
+                <w:color w:val="4A4A4A"/>
+                <w:sz w:val="18"/>
+              </w:rPr>
+              <w:t>1</w:t>
+            </w:r>
+          </w:p>
+        </w:tc>
+        <w:tc>
+          <w:tcPr>
+            <w:tcW w:type="dxa" w:w="4933"/>
+            <w:vAlign w:val="center"/>
+            <w:shd w:fill="F7F9FC" w:val="clear"/>
+          </w:tcPr>
+          <w:p>
+            <w:r/>
+            <w:r>
+              <w:rPr>
+                <w:rFonts w:ascii="Calibri" w:hAnsi="Calibri" w:eastAsia="Calibri"/>
+                <w:b w:val="0"/>
+                <w:color w:val="4A4A4A"/>
+                <w:sz w:val="18"/>
+              </w:rPr>
+              <w:t>Reconhecer os ofensores como prioridade de Engenharia e Área Técnica</w:t>
+            </w:r>
+          </w:p>
+        </w:tc>
+      </w:tr>
+      <w:tr>
+        <w:tc>
+          <w:tcPr>
+            <w:tcW w:type="dxa" w:w="4933"/>
+            <w:vAlign w:val="center"/>
+            <w:shd w:fill="FFFFFF" w:val="clear"/>
+          </w:tcPr>
+          <w:p>
+            <w:pPr>
+              <w:jc w:val="center"/>
+            </w:pPr>
+            <w:r/>
+            <w:r>
+              <w:rPr>
+                <w:rFonts w:ascii="Calibri" w:hAnsi="Calibri" w:eastAsia="Calibri"/>
+                <w:b w:val="0"/>
+                <w:color w:val="4A4A4A"/>
+                <w:sz w:val="18"/>
+              </w:rPr>
+              <w:t>2</w:t>
+            </w:r>
+          </w:p>
+        </w:tc>
+        <w:tc>
+          <w:tcPr>
+            <w:tcW w:type="dxa" w:w="4933"/>
+            <w:vAlign w:val="center"/>
+            <w:shd w:fill="FFFFFF" w:val="clear"/>
+          </w:tcPr>
+          <w:p>
+            <w:r/>
+            <w:r>
+              <w:rPr>
+                <w:rFonts w:ascii="Calibri" w:hAnsi="Calibri" w:eastAsia="Calibri"/>
+                <w:b w:val="0"/>
+                <w:color w:val="4A4A4A"/>
+                <w:sz w:val="18"/>
+              </w:rPr>
+              <w:t>Definir dono e prazo para cada ação do plano</w:t>
+            </w:r>
+          </w:p>
+        </w:tc>
+      </w:tr>
+      <w:tr>
+        <w:tc>
+          <w:tcPr>
+            <w:tcW w:type="dxa" w:w="4933"/>
+            <w:vAlign w:val="center"/>
+            <w:shd w:fill="F7F9FC" w:val="clear"/>
+          </w:tcPr>
+          <w:p>
+            <w:pPr>
+              <w:jc w:val="center"/>
+            </w:pPr>
+            <w:r/>
+            <w:r>
+              <w:rPr>
+                <w:rFonts w:ascii="Calibri" w:hAnsi="Calibri" w:eastAsia="Calibri"/>
+                <w:b w:val="0"/>
+                <w:color w:val="4A4A4A"/>
+                <w:sz w:val="18"/>
+              </w:rPr>
+              <w:t>3</w:t>
+            </w:r>
+          </w:p>
+        </w:tc>
+        <w:tc>
+          <w:tcPr>
+            <w:tcW w:type="dxa" w:w="4933"/>
+            <w:vAlign w:val="center"/>
+            <w:shd w:fill="F7F9FC" w:val="clear"/>
+          </w:tcPr>
+          <w:p>
+            <w:r/>
+            <w:r>
+              <w:rPr>
+                <w:rFonts w:ascii="Calibri" w:hAnsi="Calibri" w:eastAsia="Calibri"/>
+                <w:b w:val="0"/>
+                <w:color w:val="4A4A4A"/>
+                <w:sz w:val="18"/>
+              </w:rPr>
+              <w:t>Exigir evidência antes de escalar ocorrência para TI</w:t>
+            </w:r>
+          </w:p>
+        </w:tc>
+      </w:tr>
+      <w:tr>
+        <w:tc>
+          <w:tcPr>
+            <w:tcW w:type="dxa" w:w="4933"/>
+            <w:vAlign w:val="center"/>
+            <w:shd w:fill="FFFFFF" w:val="clear"/>
+          </w:tcPr>
+          <w:p>
+            <w:pPr>
+              <w:jc w:val="center"/>
+            </w:pPr>
+            <w:r/>
+            <w:r>
+              <w:rPr>
+                <w:rFonts w:ascii="Calibri" w:hAnsi="Calibri" w:eastAsia="Calibri"/>
+                <w:b w:val="0"/>
+                <w:color w:val="4A4A4A"/>
+                <w:sz w:val="18"/>
+              </w:rPr>
+              <w:t>4</w:t>
+            </w:r>
+          </w:p>
+        </w:tc>
+        <w:tc>
+          <w:tcPr>
+            <w:tcW w:type="dxa" w:w="4933"/>
+            <w:vAlign w:val="center"/>
+            <w:shd w:fill="FFFFFF" w:val="clear"/>
+          </w:tcPr>
+          <w:p>
+            <w:r/>
+            <w:r>
+              <w:rPr>
+                <w:rFonts w:ascii="Calibri" w:hAnsi="Calibri" w:eastAsia="Calibri"/>
+                <w:b w:val="0"/>
+                <w:color w:val="4A4A4A"/>
+                <w:sz w:val="18"/>
+              </w:rPr>
+              <w:t>Apoiar o treinamento e a padronização de IP / Filebeat</w:t>
+            </w:r>
+          </w:p>
+        </w:tc>
+      </w:tr>
+    </w:tbl>
+    <w:p>
+      <w:pPr>
+        <w:spacing w:after="120"/>
+      </w:pPr>
+    </w:p>
+    <w:tbl>
+      <w:tblPr>
+        <w:tblW w:type="auto" w:w="0"/>
+        <w:tblLayout w:type="autofit"/>
+        <w:tblLook w:firstColumn="1" w:firstRow="1" w:lastColumn="0" w:lastRow="0" w:noHBand="0" w:noVBand="1" w:val="04A0"/>
+      </w:tblPr>
+      <w:tblGrid>
+        <w:gridCol w:w="9866"/>
+      </w:tblGrid>
+      <w:tr>
+        <w:tc>
+          <w:tcPr>
+            <w:tcW w:type="dxa" w:w="9866"/>
+            <w:shd w:fill="0F2C59" w:val="clear"/>
+            <w:vAlign w:val="center"/>
+            <w:tcBorders>
+              <w:top w:val="nil" w:sz="0" w:color="0F2C59"/>
+              <w:left w:val="nil" w:sz="0" w:color="0F2C59"/>
+              <w:bottom w:val="nil" w:sz="0" w:color="0F2C59"/>
+              <w:right w:val="nil" w:sz="0" w:color="0F2C59"/>
+            </w:tcBorders>
+          </w:tcPr>
+          <w:p>
+            <w:r/>
+            <w:r>
+              <w:rPr>
+                <w:rFonts w:ascii="Calibri" w:hAnsi="Calibri" w:eastAsia="Calibri"/>
+                <w:b/>
+                <w:color w:val="FFFFFF"/>
+                <w:sz w:val="24"/>
+              </w:rPr>
+              <w:t xml:space="preserve">  7. Plano de ação</w:t>
+            </w:r>
+          </w:p>
+        </w:tc>
+      </w:tr>
+    </w:tbl>
+    <w:p>
+      <w:pPr>
+        <w:spacing w:before="40" w:after="80"/>
+      </w:pPr>
+    </w:p>
+    <w:tbl>
+      <w:tblPr>
+        <w:tblW w:type="auto" w:w="0"/>
+        <w:tblLook w:firstColumn="1" w:firstRow="1" w:lastColumn="0" w:lastRow="0" w:noHBand="0" w:noVBand="1" w:val="04A0"/>
+        <w:tblBorders>
+          <w:top w:val="single" w:sz="4" w:color="D0D7DE"/>
+          <w:left w:val="single" w:sz="4" w:color="D0D7DE"/>
+          <w:bottom w:val="single" w:sz="4" w:color="D0D7DE"/>
+          <w:right w:val="single" w:sz="4" w:color="D0D7DE"/>
+          <w:insideH w:val="single" w:sz="4" w:color="D0D7DE"/>
+          <w:insideV w:val="single" w:sz="4" w:color="D0D7DE"/>
+        </w:tblBorders>
+      </w:tblPr>
+      <w:tblGrid>
+        <w:gridCol w:w="1973"/>
+        <w:gridCol w:w="1973"/>
+        <w:gridCol w:w="1973"/>
+        <w:gridCol w:w="1973"/>
+        <w:gridCol w:w="1973"/>
+      </w:tblGrid>
+      <w:tr>
+        <w:tc>
+          <w:tcPr>
+            <w:tcW w:type="dxa" w:w="1973"/>
+            <w:vAlign w:val="center"/>
+            <w:shd w:fill="0F2C59" w:val="clear"/>
+          </w:tcPr>
+          <w:p>
+            <w:pPr>
+              <w:jc w:val="center"/>
+            </w:pPr>
             <w:r/>
             <w:r>
               <w:rPr>
@@ -1669,10 +1776,14 @@
         </w:tc>
         <w:tc>
           <w:tcPr>
-            <w:tcW w:type="dxa" w:w="1949"/>
-            <w:shd w:fill="1F4E79" w:val="clear"/>
+            <w:tcW w:type="dxa" w:w="1973"/>
+            <w:vAlign w:val="center"/>
+            <w:shd w:fill="0F2C59" w:val="clear"/>
           </w:tcPr>
           <w:p>
+            <w:pPr>
+              <w:jc w:val="center"/>
+            </w:pPr>
             <w:r/>
             <w:r>
               <w:rPr>
@@ -1687,10 +1798,14 @@
         </w:tc>
         <w:tc>
           <w:tcPr>
-            <w:tcW w:type="dxa" w:w="1949"/>
-            <w:shd w:fill="1F4E79" w:val="clear"/>
+            <w:tcW w:type="dxa" w:w="1973"/>
+            <w:vAlign w:val="center"/>
+            <w:shd w:fill="0F2C59" w:val="clear"/>
           </w:tcPr>
           <w:p>
+            <w:pPr>
+              <w:jc w:val="center"/>
+            </w:pPr>
             <w:r/>
             <w:r>
               <w:rPr>
@@ -1705,10 +1820,14 @@
         </w:tc>
         <w:tc>
           <w:tcPr>
-            <w:tcW w:type="dxa" w:w="1949"/>
-            <w:shd w:fill="1F4E79" w:val="clear"/>
+            <w:tcW w:type="dxa" w:w="1973"/>
+            <w:vAlign w:val="center"/>
+            <w:shd w:fill="0F2C59" w:val="clear"/>
           </w:tcPr>
           <w:p>
+            <w:pPr>
+              <w:jc w:val="center"/>
+            </w:pPr>
             <w:r/>
             <w:r>
               <w:rPr>
@@ -1723,10 +1842,14 @@
         </w:tc>
         <w:tc>
           <w:tcPr>
-            <w:tcW w:type="dxa" w:w="1949"/>
-            <w:shd w:fill="1F4E79" w:val="clear"/>
+            <w:tcW w:type="dxa" w:w="1973"/>
+            <w:vAlign w:val="center"/>
+            <w:shd w:fill="0F2C59" w:val="clear"/>
           </w:tcPr>
           <w:p>
+            <w:pPr>
+              <w:jc w:val="center"/>
+            </w:pPr>
             <w:r/>
             <w:r>
               <w:rPr>
@@ -1743,14 +1866,20 @@
       <w:tr>
         <w:tc>
           <w:tcPr>
-            <w:tcW w:type="dxa" w:w="1949"/>
+            <w:tcW w:type="dxa" w:w="1973"/>
+            <w:vAlign w:val="center"/>
+            <w:shd w:fill="F7F9FC" w:val="clear"/>
           </w:tcPr>
           <w:p>
+            <w:pPr>
+              <w:jc w:val="center"/>
+            </w:pPr>
             <w:r/>
             <w:r>
               <w:rPr>
                 <w:rFonts w:ascii="Calibri" w:hAnsi="Calibri" w:eastAsia="Calibri"/>
                 <w:b w:val="0"/>
+                <w:color w:val="4A4A4A"/>
                 <w:sz w:val="18"/>
               </w:rPr>
               <w:t>PA-01</w:t>
@@ -1759,7 +1888,9 @@
         </w:tc>
         <w:tc>
           <w:tcPr>
-            <w:tcW w:type="dxa" w:w="1949"/>
+            <w:tcW w:type="dxa" w:w="1973"/>
+            <w:vAlign w:val="center"/>
+            <w:shd w:fill="F7F9FC" w:val="clear"/>
           </w:tcPr>
           <w:p>
             <w:r/>
@@ -1767,15 +1898,18 @@
               <w:rPr>
                 <w:rFonts w:ascii="Calibri" w:hAnsi="Calibri" w:eastAsia="Calibri"/>
                 <w:b w:val="0"/>
+                <w:color w:val="4A4A4A"/>
                 <w:sz w:val="18"/>
               </w:rPr>
-              <w:t>Substituir/padronizar cabos Cat5 nos trechos críticos</w:t>
+              <w:t>Padronizar/substituir cabos e conectores críticos</w:t>
             </w:r>
           </w:p>
         </w:tc>
         <w:tc>
           <w:tcPr>
-            <w:tcW w:type="dxa" w:w="1949"/>
+            <w:tcW w:type="dxa" w:w="1973"/>
+            <w:vAlign w:val="center"/>
+            <w:shd w:fill="F7F9FC" w:val="clear"/>
           </w:tcPr>
           <w:p>
             <w:r/>
@@ -1783,6 +1917,7 @@
               <w:rPr>
                 <w:rFonts w:ascii="Calibri" w:hAnsi="Calibri" w:eastAsia="Calibri"/>
                 <w:b w:val="0"/>
+                <w:color w:val="4A4A4A"/>
                 <w:sz w:val="18"/>
               </w:rPr>
               <w:t>Área Técnica / Engenharia</w:t>
@@ -1791,7 +1926,9 @@
         </w:tc>
         <w:tc>
           <w:tcPr>
-            <w:tcW w:type="dxa" w:w="1949"/>
+            <w:tcW w:type="dxa" w:w="1973"/>
+            <w:vAlign w:val="center"/>
+            <w:shd w:fill="F7F9FC" w:val="clear"/>
           </w:tcPr>
           <w:p>
             <w:r/>
@@ -1799,6 +1936,7 @@
               <w:rPr>
                 <w:rFonts w:ascii="Calibri" w:hAnsi="Calibri" w:eastAsia="Calibri"/>
                 <w:b w:val="0"/>
+                <w:color w:val="4A4A4A"/>
                 <w:sz w:val="18"/>
               </w:rPr>
               <w:t>__/__/____</w:t>
@@ -1807,7 +1945,9 @@
         </w:tc>
         <w:tc>
           <w:tcPr>
-            <w:tcW w:type="dxa" w:w="1949"/>
+            <w:tcW w:type="dxa" w:w="1973"/>
+            <w:vAlign w:val="center"/>
+            <w:shd w:fill="F7F9FC" w:val="clear"/>
           </w:tcPr>
           <w:p>
             <w:r/>
@@ -1815,6 +1955,7 @@
               <w:rPr>
                 <w:rFonts w:ascii="Calibri" w:hAnsi="Calibri" w:eastAsia="Calibri"/>
                 <w:b w:val="0"/>
+                <w:color w:val="4A4A4A"/>
                 <w:sz w:val="18"/>
               </w:rPr>
               <w:t>Aberto</w:t>
@@ -1825,14 +1966,20 @@
       <w:tr>
         <w:tc>
           <w:tcPr>
-            <w:tcW w:type="dxa" w:w="1949"/>
+            <w:tcW w:type="dxa" w:w="1973"/>
+            <w:vAlign w:val="center"/>
+            <w:shd w:fill="FFFFFF" w:val="clear"/>
           </w:tcPr>
           <w:p>
+            <w:pPr>
+              <w:jc w:val="center"/>
+            </w:pPr>
             <w:r/>
             <w:r>
               <w:rPr>
                 <w:rFonts w:ascii="Calibri" w:hAnsi="Calibri" w:eastAsia="Calibri"/>
                 <w:b w:val="0"/>
+                <w:color w:val="4A4A4A"/>
                 <w:sz w:val="18"/>
               </w:rPr>
               <w:t>PA-02</w:t>
@@ -1841,7 +1988,9 @@
         </w:tc>
         <w:tc>
           <w:tcPr>
-            <w:tcW w:type="dxa" w:w="1949"/>
+            <w:tcW w:type="dxa" w:w="1973"/>
+            <w:vAlign w:val="center"/>
+            <w:shd w:fill="FFFFFF" w:val="clear"/>
           </w:tcPr>
           <w:p>
             <w:r/>
@@ -1849,6 +1998,7 @@
               <w:rPr>
                 <w:rFonts w:ascii="Calibri" w:hAnsi="Calibri" w:eastAsia="Calibri"/>
                 <w:b w:val="0"/>
+                <w:color w:val="4A4A4A"/>
                 <w:sz w:val="18"/>
               </w:rPr>
               <w:t>Eliminar IPs duplicados e oficializar endereçamento</w:t>
@@ -1857,7 +2007,9 @@
         </w:tc>
         <w:tc>
           <w:tcPr>
-            <w:tcW w:type="dxa" w:w="1949"/>
+            <w:tcW w:type="dxa" w:w="1973"/>
+            <w:vAlign w:val="center"/>
+            <w:shd w:fill="FFFFFF" w:val="clear"/>
           </w:tcPr>
           <w:p>
             <w:r/>
@@ -1865,6 +2017,7 @@
               <w:rPr>
                 <w:rFonts w:ascii="Calibri" w:hAnsi="Calibri" w:eastAsia="Calibri"/>
                 <w:b w:val="0"/>
+                <w:color w:val="4A4A4A"/>
                 <w:sz w:val="18"/>
               </w:rPr>
               <w:t>Área Técnica / Engenharia</w:t>
@@ -1873,7 +2026,9 @@
         </w:tc>
         <w:tc>
           <w:tcPr>
-            <w:tcW w:type="dxa" w:w="1949"/>
+            <w:tcW w:type="dxa" w:w="1973"/>
+            <w:vAlign w:val="center"/>
+            <w:shd w:fill="FFFFFF" w:val="clear"/>
           </w:tcPr>
           <w:p>
             <w:r/>
@@ -1881,6 +2036,7 @@
               <w:rPr>
                 <w:rFonts w:ascii="Calibri" w:hAnsi="Calibri" w:eastAsia="Calibri"/>
                 <w:b w:val="0"/>
+                <w:color w:val="4A4A4A"/>
                 <w:sz w:val="18"/>
               </w:rPr>
               <w:t>__/__/____</w:t>
@@ -1889,7 +2045,9 @@
         </w:tc>
         <w:tc>
           <w:tcPr>
-            <w:tcW w:type="dxa" w:w="1949"/>
+            <w:tcW w:type="dxa" w:w="1973"/>
+            <w:vAlign w:val="center"/>
+            <w:shd w:fill="FFFFFF" w:val="clear"/>
           </w:tcPr>
           <w:p>
             <w:r/>
@@ -1897,6 +2055,7 @@
               <w:rPr>
                 <w:rFonts w:ascii="Calibri" w:hAnsi="Calibri" w:eastAsia="Calibri"/>
                 <w:b w:val="0"/>
+                <w:color w:val="4A4A4A"/>
                 <w:sz w:val="18"/>
               </w:rPr>
               <w:t>Aberto</w:t>
@@ -1907,14 +2066,20 @@
       <w:tr>
         <w:tc>
           <w:tcPr>
-            <w:tcW w:type="dxa" w:w="1949"/>
+            <w:tcW w:type="dxa" w:w="1973"/>
+            <w:vAlign w:val="center"/>
+            <w:shd w:fill="F7F9FC" w:val="clear"/>
           </w:tcPr>
           <w:p>
+            <w:pPr>
+              <w:jc w:val="center"/>
+            </w:pPr>
             <w:r/>
             <w:r>
               <w:rPr>
                 <w:rFonts w:ascii="Calibri" w:hAnsi="Calibri" w:eastAsia="Calibri"/>
                 <w:b w:val="0"/>
+                <w:color w:val="4A4A4A"/>
                 <w:sz w:val="18"/>
               </w:rPr>
               <w:t>PA-03</w:t>
@@ -1923,7 +2088,9 @@
         </w:tc>
         <w:tc>
           <w:tcPr>
-            <w:tcW w:type="dxa" w:w="1949"/>
+            <w:tcW w:type="dxa" w:w="1973"/>
+            <w:vAlign w:val="center"/>
+            <w:shd w:fill="F7F9FC" w:val="clear"/>
           </w:tcPr>
           <w:p>
             <w:r/>
@@ -1931,15 +2098,18 @@
               <w:rPr>
                 <w:rFonts w:ascii="Calibri" w:hAnsi="Calibri" w:eastAsia="Calibri"/>
                 <w:b w:val="0"/>
+                <w:color w:val="4A4A4A"/>
                 <w:sz w:val="18"/>
               </w:rPr>
-              <w:t>Implantar controle de liberação de roteiro</w:t>
+              <w:t>Controle de liberação de roteiro (dupla verificação)</w:t>
             </w:r>
           </w:p>
         </w:tc>
         <w:tc>
           <w:tcPr>
-            <w:tcW w:type="dxa" w:w="1949"/>
+            <w:tcW w:type="dxa" w:w="1973"/>
+            <w:vAlign w:val="center"/>
+            <w:shd w:fill="F7F9FC" w:val="clear"/>
           </w:tcPr>
           <w:p>
             <w:r/>
@@ -1947,6 +2117,7 @@
               <w:rPr>
                 <w:rFonts w:ascii="Calibri" w:hAnsi="Calibri" w:eastAsia="Calibri"/>
                 <w:b w:val="0"/>
+                <w:color w:val="4A4A4A"/>
                 <w:sz w:val="18"/>
               </w:rPr>
               <w:t>Engenharia / Área Técnica</w:t>
@@ -1955,7 +2126,9 @@
         </w:tc>
         <w:tc>
           <w:tcPr>
-            <w:tcW w:type="dxa" w:w="1949"/>
+            <w:tcW w:type="dxa" w:w="1973"/>
+            <w:vAlign w:val="center"/>
+            <w:shd w:fill="F7F9FC" w:val="clear"/>
           </w:tcPr>
           <w:p>
             <w:r/>
@@ -1963,6 +2136,7 @@
               <w:rPr>
                 <w:rFonts w:ascii="Calibri" w:hAnsi="Calibri" w:eastAsia="Calibri"/>
                 <w:b w:val="0"/>
+                <w:color w:val="4A4A4A"/>
                 <w:sz w:val="18"/>
               </w:rPr>
               <w:t>__/__/____</w:t>
@@ -1971,7 +2145,9 @@
         </w:tc>
         <w:tc>
           <w:tcPr>
-            <w:tcW w:type="dxa" w:w="1949"/>
+            <w:tcW w:type="dxa" w:w="1973"/>
+            <w:vAlign w:val="center"/>
+            <w:shd w:fill="F7F9FC" w:val="clear"/>
           </w:tcPr>
           <w:p>
             <w:r/>
@@ -1979,6 +2155,7 @@
               <w:rPr>
                 <w:rFonts w:ascii="Calibri" w:hAnsi="Calibri" w:eastAsia="Calibri"/>
                 <w:b w:val="0"/>
+                <w:color w:val="4A4A4A"/>
                 <w:sz w:val="18"/>
               </w:rPr>
               <w:t>Aberto</w:t>
@@ -1989,14 +2166,20 @@
       <w:tr>
         <w:tc>
           <w:tcPr>
-            <w:tcW w:type="dxa" w:w="1949"/>
+            <w:tcW w:type="dxa" w:w="1973"/>
+            <w:vAlign w:val="center"/>
+            <w:shd w:fill="FFFFFF" w:val="clear"/>
           </w:tcPr>
           <w:p>
+            <w:pPr>
+              <w:jc w:val="center"/>
+            </w:pPr>
             <w:r/>
             <w:r>
               <w:rPr>
                 <w:rFonts w:ascii="Calibri" w:hAnsi="Calibri" w:eastAsia="Calibri"/>
                 <w:b w:val="0"/>
+                <w:color w:val="4A4A4A"/>
                 <w:sz w:val="18"/>
               </w:rPr>
               <w:t>PA-04</w:t>
@@ -2005,7 +2188,9 @@
         </w:tc>
         <w:tc>
           <w:tcPr>
-            <w:tcW w:type="dxa" w:w="1949"/>
+            <w:tcW w:type="dxa" w:w="1973"/>
+            <w:vAlign w:val="center"/>
+            <w:shd w:fill="FFFFFF" w:val="clear"/>
           </w:tcPr>
           <w:p>
             <w:r/>
@@ -2013,15 +2198,18 @@
               <w:rPr>
                 <w:rFonts w:ascii="Calibri" w:hAnsi="Calibri" w:eastAsia="Calibri"/>
                 <w:b w:val="0"/>
+                <w:color w:val="4A4A4A"/>
                 <w:sz w:val="18"/>
               </w:rPr>
-              <w:t>Plano de adequação de RAPs/PCs abaixo da spec</w:t>
+              <w:t>Adequação de RASPs/PCs com baixa performance</w:t>
             </w:r>
           </w:p>
         </w:tc>
         <w:tc>
           <w:tcPr>
-            <w:tcW w:type="dxa" w:w="1949"/>
+            <w:tcW w:type="dxa" w:w="1973"/>
+            <w:vAlign w:val="center"/>
+            <w:shd w:fill="FFFFFF" w:val="clear"/>
           </w:tcPr>
           <w:p>
             <w:r/>
@@ -2029,6 +2217,7 @@
               <w:rPr>
                 <w:rFonts w:ascii="Calibri" w:hAnsi="Calibri" w:eastAsia="Calibri"/>
                 <w:b w:val="0"/>
+                <w:color w:val="4A4A4A"/>
                 <w:sz w:val="18"/>
               </w:rPr>
               <w:t>Área Técnica / Engenharia</w:t>
@@ -2037,7 +2226,9 @@
         </w:tc>
         <w:tc>
           <w:tcPr>
-            <w:tcW w:type="dxa" w:w="1949"/>
+            <w:tcW w:type="dxa" w:w="1973"/>
+            <w:vAlign w:val="center"/>
+            <w:shd w:fill="FFFFFF" w:val="clear"/>
           </w:tcPr>
           <w:p>
             <w:r/>
@@ -2045,6 +2236,7 @@
               <w:rPr>
                 <w:rFonts w:ascii="Calibri" w:hAnsi="Calibri" w:eastAsia="Calibri"/>
                 <w:b w:val="0"/>
+                <w:color w:val="4A4A4A"/>
                 <w:sz w:val="18"/>
               </w:rPr>
               <w:t>__/__/____</w:t>
@@ -2053,7 +2245,9 @@
         </w:tc>
         <w:tc>
           <w:tcPr>
-            <w:tcW w:type="dxa" w:w="1949"/>
+            <w:tcW w:type="dxa" w:w="1973"/>
+            <w:vAlign w:val="center"/>
+            <w:shd w:fill="FFFFFF" w:val="clear"/>
           </w:tcPr>
           <w:p>
             <w:r/>
@@ -2061,6 +2255,7 @@
               <w:rPr>
                 <w:rFonts w:ascii="Calibri" w:hAnsi="Calibri" w:eastAsia="Calibri"/>
                 <w:b w:val="0"/>
+                <w:color w:val="4A4A4A"/>
                 <w:sz w:val="18"/>
               </w:rPr>
               <w:t>Aberto</w:t>
@@ -2071,14 +2266,20 @@
       <w:tr>
         <w:tc>
           <w:tcPr>
-            <w:tcW w:type="dxa" w:w="1949"/>
+            <w:tcW w:type="dxa" w:w="1973"/>
+            <w:vAlign w:val="center"/>
+            <w:shd w:fill="F7F9FC" w:val="clear"/>
           </w:tcPr>
           <w:p>
+            <w:pPr>
+              <w:jc w:val="center"/>
+            </w:pPr>
             <w:r/>
             <w:r>
               <w:rPr>
                 <w:rFonts w:ascii="Calibri" w:hAnsi="Calibri" w:eastAsia="Calibri"/>
                 <w:b w:val="0"/>
+                <w:color w:val="4A4A4A"/>
                 <w:sz w:val="18"/>
               </w:rPr>
               <w:t>PA-05</w:t>
@@ -2087,7 +2288,9 @@
         </w:tc>
         <w:tc>
           <w:tcPr>
-            <w:tcW w:type="dxa" w:w="1949"/>
+            <w:tcW w:type="dxa" w:w="1973"/>
+            <w:vAlign w:val="center"/>
+            <w:shd w:fill="F7F9FC" w:val="clear"/>
           </w:tcPr>
           <w:p>
             <w:r/>
@@ -2095,6 +2298,7 @@
               <w:rPr>
                 <w:rFonts w:ascii="Calibri" w:hAnsi="Calibri" w:eastAsia="Calibri"/>
                 <w:b w:val="0"/>
+                <w:color w:val="4A4A4A"/>
                 <w:sz w:val="18"/>
               </w:rPr>
               <w:t>Padronizar status passou/não passou</w:t>
@@ -2103,7 +2307,9 @@
         </w:tc>
         <w:tc>
           <w:tcPr>
-            <w:tcW w:type="dxa" w:w="1949"/>
+            <w:tcW w:type="dxa" w:w="1973"/>
+            <w:vAlign w:val="center"/>
+            <w:shd w:fill="F7F9FC" w:val="clear"/>
           </w:tcPr>
           <w:p>
             <w:r/>
@@ -2111,6 +2317,7 @@
               <w:rPr>
                 <w:rFonts w:ascii="Calibri" w:hAnsi="Calibri" w:eastAsia="Calibri"/>
                 <w:b w:val="0"/>
+                <w:color w:val="4A4A4A"/>
                 <w:sz w:val="18"/>
               </w:rPr>
               <w:t>Engenharia / Área Técnica</w:t>
@@ -2119,7 +2326,9 @@
         </w:tc>
         <w:tc>
           <w:tcPr>
-            <w:tcW w:type="dxa" w:w="1949"/>
+            <w:tcW w:type="dxa" w:w="1973"/>
+            <w:vAlign w:val="center"/>
+            <w:shd w:fill="F7F9FC" w:val="clear"/>
           </w:tcPr>
           <w:p>
             <w:r/>
@@ -2127,6 +2336,7 @@
               <w:rPr>
                 <w:rFonts w:ascii="Calibri" w:hAnsi="Calibri" w:eastAsia="Calibri"/>
                 <w:b w:val="0"/>
+                <w:color w:val="4A4A4A"/>
                 <w:sz w:val="18"/>
               </w:rPr>
               <w:t>__/__/____</w:t>
@@ -2135,7 +2345,9 @@
         </w:tc>
         <w:tc>
           <w:tcPr>
-            <w:tcW w:type="dxa" w:w="1949"/>
+            <w:tcW w:type="dxa" w:w="1973"/>
+            <w:vAlign w:val="center"/>
+            <w:shd w:fill="F7F9FC" w:val="clear"/>
           </w:tcPr>
           <w:p>
             <w:r/>
@@ -2143,6 +2355,7 @@
               <w:rPr>
                 <w:rFonts w:ascii="Calibri" w:hAnsi="Calibri" w:eastAsia="Calibri"/>
                 <w:b w:val="0"/>
+                <w:color w:val="4A4A4A"/>
                 <w:sz w:val="18"/>
               </w:rPr>
               <w:t>Aberto</w:t>
@@ -2153,14 +2366,20 @@
       <w:tr>
         <w:tc>
           <w:tcPr>
-            <w:tcW w:type="dxa" w:w="1949"/>
+            <w:tcW w:type="dxa" w:w="1973"/>
+            <w:vAlign w:val="center"/>
+            <w:shd w:fill="FFFFFF" w:val="clear"/>
           </w:tcPr>
           <w:p>
+            <w:pPr>
+              <w:jc w:val="center"/>
+            </w:pPr>
             <w:r/>
             <w:r>
               <w:rPr>
                 <w:rFonts w:ascii="Calibri" w:hAnsi="Calibri" w:eastAsia="Calibri"/>
                 <w:b w:val="0"/>
+                <w:color w:val="4A4A4A"/>
                 <w:sz w:val="18"/>
               </w:rPr>
               <w:t>PA-06</w:t>
@@ -2169,7 +2388,9 @@
         </w:tc>
         <w:tc>
           <w:tcPr>
-            <w:tcW w:type="dxa" w:w="1949"/>
+            <w:tcW w:type="dxa" w:w="1973"/>
+            <w:vAlign w:val="center"/>
+            <w:shd w:fill="FFFFFF" w:val="clear"/>
           </w:tcPr>
           <w:p>
             <w:r/>
@@ -2177,15 +2398,18 @@
               <w:rPr>
                 <w:rFonts w:ascii="Calibri" w:hAnsi="Calibri" w:eastAsia="Calibri"/>
                 <w:b w:val="0"/>
+                <w:color w:val="4A4A4A"/>
                 <w:sz w:val="18"/>
               </w:rPr>
-              <w:t>Executar treinamento TI (IP RAP + Filebeat + checklist)</w:t>
+              <w:t>Treinamento TI (IP RAP + Filebeat + checklist)</w:t>
             </w:r>
           </w:p>
         </w:tc>
         <w:tc>
           <w:tcPr>
-            <w:tcW w:type="dxa" w:w="1949"/>
+            <w:tcW w:type="dxa" w:w="1973"/>
+            <w:vAlign w:val="center"/>
+            <w:shd w:fill="FFFFFF" w:val="clear"/>
           </w:tcPr>
           <w:p>
             <w:r/>
@@ -2193,6 +2417,7 @@
               <w:rPr>
                 <w:rFonts w:ascii="Calibri" w:hAnsi="Calibri" w:eastAsia="Calibri"/>
                 <w:b w:val="0"/>
+                <w:color w:val="4A4A4A"/>
                 <w:sz w:val="18"/>
               </w:rPr>
               <w:t>TI</w:t>
@@ -2201,7 +2426,9 @@
         </w:tc>
         <w:tc>
           <w:tcPr>
-            <w:tcW w:type="dxa" w:w="1949"/>
+            <w:tcW w:type="dxa" w:w="1973"/>
+            <w:vAlign w:val="center"/>
+            <w:shd w:fill="FFFFFF" w:val="clear"/>
           </w:tcPr>
           <w:p>
             <w:r/>
@@ -2209,6 +2436,7 @@
               <w:rPr>
                 <w:rFonts w:ascii="Calibri" w:hAnsi="Calibri" w:eastAsia="Calibri"/>
                 <w:b w:val="0"/>
+                <w:color w:val="4A4A4A"/>
                 <w:sz w:val="18"/>
               </w:rPr>
               <w:t>__/__/____</w:t>
@@ -2217,7 +2445,9 @@
         </w:tc>
         <w:tc>
           <w:tcPr>
-            <w:tcW w:type="dxa" w:w="1949"/>
+            <w:tcW w:type="dxa" w:w="1973"/>
+            <w:vAlign w:val="center"/>
+            <w:shd w:fill="FFFFFF" w:val="clear"/>
           </w:tcPr>
           <w:p>
             <w:r/>
@@ -2225,6 +2455,7 @@
               <w:rPr>
                 <w:rFonts w:ascii="Calibri" w:hAnsi="Calibri" w:eastAsia="Calibri"/>
                 <w:b w:val="0"/>
+                <w:color w:val="4A4A4A"/>
                 <w:sz w:val="18"/>
               </w:rPr>
               <w:t>Aberto</w:t>
@@ -2233,66 +2464,180 @@
         </w:tc>
       </w:tr>
     </w:tbl>
-    <w:p/>
     <w:p>
       <w:pPr>
-        <w:pStyle w:val="Heading1"/>
+        <w:spacing w:after="120"/>
       </w:pPr>
-      <w:r>
-        <w:rPr>
-          <w:rFonts w:ascii="Calibri" w:hAnsi="Calibri" w:eastAsia="Calibri"/>
-          <w:b/>
-          <w:sz w:val="30"/>
-        </w:rPr>
-        <w:t>10. Conclusão</w:t>
-      </w:r>
     </w:p>
+    <w:tbl>
+      <w:tblPr>
+        <w:tblW w:type="auto" w:w="0"/>
+        <w:tblLayout w:type="autofit"/>
+        <w:tblLook w:firstColumn="1" w:firstRow="1" w:lastColumn="0" w:lastRow="0" w:noHBand="0" w:noVBand="1" w:val="04A0"/>
+      </w:tblPr>
+      <w:tblGrid>
+        <w:gridCol w:w="9866"/>
+      </w:tblGrid>
+      <w:tr>
+        <w:tc>
+          <w:tcPr>
+            <w:tcW w:type="dxa" w:w="9866"/>
+            <w:shd w:fill="0F2C59" w:val="clear"/>
+            <w:vAlign w:val="center"/>
+            <w:tcBorders>
+              <w:top w:val="nil" w:sz="0" w:color="0F2C59"/>
+              <w:left w:val="nil" w:sz="0" w:color="0F2C59"/>
+              <w:bottom w:val="nil" w:sz="0" w:color="0F2C59"/>
+              <w:right w:val="nil" w:sz="0" w:color="0F2C59"/>
+            </w:tcBorders>
+          </w:tcPr>
+          <w:p>
+            <w:r/>
+            <w:r>
+              <w:rPr>
+                <w:rFonts w:ascii="Calibri" w:hAnsi="Calibri" w:eastAsia="Calibri"/>
+                <w:b/>
+                <w:color w:val="FFFFFF"/>
+                <w:sz w:val="24"/>
+              </w:rPr>
+              <w:t xml:space="preserve">  8. Fechamento</w:t>
+            </w:r>
+          </w:p>
+        </w:tc>
+      </w:tr>
+    </w:tbl>
+    <w:p>
+      <w:pPr>
+        <w:spacing w:before="40" w:after="80"/>
+      </w:pPr>
+    </w:p>
+    <w:tbl>
+      <w:tblPr>
+        <w:tblW w:type="auto" w:w="0"/>
+        <w:tblLook w:firstColumn="1" w:firstRow="1" w:lastColumn="0" w:lastRow="0" w:noHBand="0" w:noVBand="1" w:val="04A0"/>
+        <w:tblBorders>
+          <w:top w:val="single" w:sz="12" w:color="0F2C59"/>
+          <w:left w:val="single" w:sz="12" w:color="0F2C59"/>
+          <w:bottom w:val="single" w:sz="12" w:color="0F2C59"/>
+          <w:right w:val="single" w:sz="12" w:color="0F2C59"/>
+          <w:insideH w:val="single" w:sz="12" w:color="0F2C59"/>
+          <w:insideV w:val="single" w:sz="12" w:color="0F2C59"/>
+        </w:tblBorders>
+      </w:tblPr>
+      <w:tblGrid>
+        <w:gridCol w:w="9866"/>
+      </w:tblGrid>
+      <w:tr>
+        <w:tc>
+          <w:tcPr>
+            <w:tcW w:type="dxa" w:w="9866"/>
+            <w:shd w:fill="0F2C59" w:val="clear"/>
+          </w:tcPr>
+          <w:p>
+            <w:pPr>
+              <w:jc w:val="center"/>
+            </w:pPr>
+            <w:r/>
+            <w:r>
+              <w:rPr>
+                <w:rFonts w:ascii="Calibri" w:hAnsi="Calibri" w:eastAsia="Calibri"/>
+                <w:b/>
+                <w:color w:val="FFFFFF"/>
+                <w:sz w:val="24"/>
+              </w:rPr>
+              <w:t>Problema de processo não se resolve com chamado de TI.</w:t>
+              <w:br/>
+            </w:r>
+            <w:r>
+              <w:rPr>
+                <w:rFonts w:ascii="Calibri" w:hAnsi="Calibri" w:eastAsia="Calibri"/>
+                <w:b w:val="0"/>
+                <w:color w:val="9BC9E0"/>
+                <w:sz w:val="20"/>
+              </w:rPr>
+              <w:t>Disciplina de processo  ·  Padronização de posto  ·  Dono claro</w:t>
+            </w:r>
+          </w:p>
+        </w:tc>
+      </w:tr>
+    </w:tbl>
     <w:p>
       <w:pPr>
         <w:spacing w:after="160"/>
       </w:pPr>
-      <w:r>
-        <w:rPr>
-          <w:rFonts w:ascii="Calibri" w:hAnsi="Calibri" w:eastAsia="Calibri"/>
-          <w:b w:val="0"/>
-          <w:sz w:val="22"/>
-        </w:rPr>
-        <w:t>Este não é um relatório operacional de chamado: é um posicionamento estratégico para alinhar as áreas. A TI continuará apoiando com diagnóstico e capacitação, mas a correção definitiva dos principais ofensores depende de decisão e execução da Engenharia e da Área Técnica.</w:t>
-      </w:r>
-    </w:p>
-    <w:p>
-      <w:pPr>
-        <w:pStyle w:val="Heading1"/>
-      </w:pPr>
-      <w:r>
-        <w:rPr>
-          <w:rFonts w:ascii="Calibri" w:hAnsi="Calibri" w:eastAsia="Calibri"/>
-          <w:b/>
-          <w:sz w:val="30"/>
-        </w:rPr>
-        <w:t>11. Aprovações</w:t>
-      </w:r>
     </w:p>
     <w:tbl>
       <w:tblPr>
-        <w:tblStyle w:val="TableGrid"/>
         <w:tblW w:type="auto" w:w="0"/>
-        <w:jc w:val="center"/>
+        <w:tblLayout w:type="autofit"/>
         <w:tblLook w:firstColumn="1" w:firstRow="1" w:lastColumn="0" w:lastRow="0" w:noHBand="0" w:noVBand="1" w:val="04A0"/>
       </w:tblPr>
       <w:tblGrid>
-        <w:gridCol w:w="2436"/>
-        <w:gridCol w:w="2436"/>
-        <w:gridCol w:w="2436"/>
-        <w:gridCol w:w="2436"/>
+        <w:gridCol w:w="9866"/>
       </w:tblGrid>
       <w:tr>
         <w:tc>
           <w:tcPr>
-            <w:tcW w:type="dxa" w:w="2436"/>
-            <w:shd w:fill="1F4E79" w:val="clear"/>
+            <w:tcW w:type="dxa" w:w="9866"/>
+            <w:shd w:fill="0F2C59" w:val="clear"/>
+            <w:vAlign w:val="center"/>
+            <w:tcBorders>
+              <w:top w:val="nil" w:sz="0" w:color="0F2C59"/>
+              <w:left w:val="nil" w:sz="0" w:color="0F2C59"/>
+              <w:bottom w:val="nil" w:sz="0" w:color="0F2C59"/>
+              <w:right w:val="nil" w:sz="0" w:color="0F2C59"/>
+            </w:tcBorders>
           </w:tcPr>
           <w:p>
+            <w:r/>
+            <w:r>
+              <w:rPr>
+                <w:rFonts w:ascii="Calibri" w:hAnsi="Calibri" w:eastAsia="Calibri"/>
+                <w:b/>
+                <w:color w:val="FFFFFF"/>
+                <w:sz w:val="24"/>
+              </w:rPr>
+              <w:t xml:space="preserve">  9. Aprovações</w:t>
+            </w:r>
+          </w:p>
+        </w:tc>
+      </w:tr>
+    </w:tbl>
+    <w:p>
+      <w:pPr>
+        <w:spacing w:before="40" w:after="80"/>
+      </w:pPr>
+    </w:p>
+    <w:tbl>
+      <w:tblPr>
+        <w:tblW w:type="auto" w:w="0"/>
+        <w:tblLook w:firstColumn="1" w:firstRow="1" w:lastColumn="0" w:lastRow="0" w:noHBand="0" w:noVBand="1" w:val="04A0"/>
+        <w:tblBorders>
+          <w:top w:val="single" w:sz="4" w:color="D0D7DE"/>
+          <w:left w:val="single" w:sz="4" w:color="D0D7DE"/>
+          <w:bottom w:val="single" w:sz="4" w:color="D0D7DE"/>
+          <w:right w:val="single" w:sz="4" w:color="D0D7DE"/>
+          <w:insideH w:val="single" w:sz="4" w:color="D0D7DE"/>
+          <w:insideV w:val="single" w:sz="4" w:color="D0D7DE"/>
+        </w:tblBorders>
+      </w:tblPr>
+      <w:tblGrid>
+        <w:gridCol w:w="2466"/>
+        <w:gridCol w:w="2466"/>
+        <w:gridCol w:w="2466"/>
+        <w:gridCol w:w="2466"/>
+      </w:tblGrid>
+      <w:tr>
+        <w:tc>
+          <w:tcPr>
+            <w:tcW w:type="dxa" w:w="2466"/>
+            <w:vAlign w:val="center"/>
+            <w:shd w:fill="0F2C59" w:val="clear"/>
+          </w:tcPr>
+          <w:p>
+            <w:pPr>
+              <w:jc w:val="center"/>
+            </w:pPr>
             <w:r/>
             <w:r>
               <w:rPr>
@@ -2307,10 +2652,14 @@
         </w:tc>
         <w:tc>
           <w:tcPr>
-            <w:tcW w:type="dxa" w:w="2436"/>
-            <w:shd w:fill="1F4E79" w:val="clear"/>
+            <w:tcW w:type="dxa" w:w="2466"/>
+            <w:vAlign w:val="center"/>
+            <w:shd w:fill="0F2C59" w:val="clear"/>
           </w:tcPr>
           <w:p>
+            <w:pPr>
+              <w:jc w:val="center"/>
+            </w:pPr>
             <w:r/>
             <w:r>
               <w:rPr>
@@ -2325,10 +2674,14 @@
         </w:tc>
         <w:tc>
           <w:tcPr>
-            <w:tcW w:type="dxa" w:w="2436"/>
-            <w:shd w:fill="1F4E79" w:val="clear"/>
+            <w:tcW w:type="dxa" w:w="2466"/>
+            <w:vAlign w:val="center"/>
+            <w:shd w:fill="0F2C59" w:val="clear"/>
           </w:tcPr>
           <w:p>
+            <w:pPr>
+              <w:jc w:val="center"/>
+            </w:pPr>
             <w:r/>
             <w:r>
               <w:rPr>
@@ -2343,10 +2696,14 @@
         </w:tc>
         <w:tc>
           <w:tcPr>
-            <w:tcW w:type="dxa" w:w="2436"/>
-            <w:shd w:fill="1F4E79" w:val="clear"/>
+            <w:tcW w:type="dxa" w:w="2466"/>
+            <w:vAlign w:val="center"/>
+            <w:shd w:fill="0F2C59" w:val="clear"/>
           </w:tcPr>
           <w:p>
+            <w:pPr>
+              <w:jc w:val="center"/>
+            </w:pPr>
             <w:r/>
             <w:r>
               <w:rPr>
@@ -2363,14 +2720,20 @@
       <w:tr>
         <w:tc>
           <w:tcPr>
-            <w:tcW w:type="dxa" w:w="2436"/>
+            <w:tcW w:type="dxa" w:w="2466"/>
+            <w:vAlign w:val="center"/>
+            <w:shd w:fill="F7F9FC" w:val="clear"/>
           </w:tcPr>
           <w:p>
+            <w:pPr>
+              <w:jc w:val="center"/>
+            </w:pPr>
             <w:r/>
             <w:r>
               <w:rPr>
                 <w:rFonts w:ascii="Calibri" w:hAnsi="Calibri" w:eastAsia="Calibri"/>
                 <w:b w:val="0"/>
+                <w:color w:val="4A4A4A"/>
                 <w:sz w:val="18"/>
               </w:rPr>
               <w:t>TI</w:t>
@@ -2379,7 +2742,9 @@
         </w:tc>
         <w:tc>
           <w:tcPr>
-            <w:tcW w:type="dxa" w:w="2436"/>
+            <w:tcW w:type="dxa" w:w="2466"/>
+            <w:vAlign w:val="center"/>
+            <w:shd w:fill="F7F9FC" w:val="clear"/>
           </w:tcPr>
           <w:p>
             <w:r/>
@@ -2387,6 +2752,7 @@
               <w:rPr>
                 <w:rFonts w:ascii="Calibri" w:hAnsi="Calibri" w:eastAsia="Calibri"/>
                 <w:b w:val="0"/>
+                <w:color w:val="4A4A4A"/>
                 <w:sz w:val="18"/>
               </w:rPr>
             </w:r>
@@ -2394,7 +2760,9 @@
         </w:tc>
         <w:tc>
           <w:tcPr>
-            <w:tcW w:type="dxa" w:w="2436"/>
+            <w:tcW w:type="dxa" w:w="2466"/>
+            <w:vAlign w:val="center"/>
+            <w:shd w:fill="F7F9FC" w:val="clear"/>
           </w:tcPr>
           <w:p>
             <w:r/>
@@ -2402,6 +2770,7 @@
               <w:rPr>
                 <w:rFonts w:ascii="Calibri" w:hAnsi="Calibri" w:eastAsia="Calibri"/>
                 <w:b w:val="0"/>
+                <w:color w:val="4A4A4A"/>
                 <w:sz w:val="18"/>
               </w:rPr>
             </w:r>
@@ -2409,7 +2778,9 @@
         </w:tc>
         <w:tc>
           <w:tcPr>
-            <w:tcW w:type="dxa" w:w="2436"/>
+            <w:tcW w:type="dxa" w:w="2466"/>
+            <w:vAlign w:val="center"/>
+            <w:shd w:fill="F7F9FC" w:val="clear"/>
           </w:tcPr>
           <w:p>
             <w:r/>
@@ -2417,6 +2788,7 @@
               <w:rPr>
                 <w:rFonts w:ascii="Calibri" w:hAnsi="Calibri" w:eastAsia="Calibri"/>
                 <w:b w:val="0"/>
+                <w:color w:val="4A4A4A"/>
                 <w:sz w:val="18"/>
               </w:rPr>
               <w:t>__/__/____</w:t>
@@ -2427,14 +2799,20 @@
       <w:tr>
         <w:tc>
           <w:tcPr>
-            <w:tcW w:type="dxa" w:w="2436"/>
+            <w:tcW w:type="dxa" w:w="2466"/>
+            <w:vAlign w:val="center"/>
+            <w:shd w:fill="FFFFFF" w:val="clear"/>
           </w:tcPr>
           <w:p>
+            <w:pPr>
+              <w:jc w:val="center"/>
+            </w:pPr>
             <w:r/>
             <w:r>
               <w:rPr>
                 <w:rFonts w:ascii="Calibri" w:hAnsi="Calibri" w:eastAsia="Calibri"/>
                 <w:b w:val="0"/>
+                <w:color w:val="4A4A4A"/>
                 <w:sz w:val="18"/>
               </w:rPr>
               <w:t>Área Técnica</w:t>
@@ -2443,7 +2821,9 @@
         </w:tc>
         <w:tc>
           <w:tcPr>
-            <w:tcW w:type="dxa" w:w="2436"/>
+            <w:tcW w:type="dxa" w:w="2466"/>
+            <w:vAlign w:val="center"/>
+            <w:shd w:fill="FFFFFF" w:val="clear"/>
           </w:tcPr>
           <w:p>
             <w:r/>
@@ -2451,6 +2831,7 @@
               <w:rPr>
                 <w:rFonts w:ascii="Calibri" w:hAnsi="Calibri" w:eastAsia="Calibri"/>
                 <w:b w:val="0"/>
+                <w:color w:val="4A4A4A"/>
                 <w:sz w:val="18"/>
               </w:rPr>
             </w:r>
@@ -2458,7 +2839,9 @@
         </w:tc>
         <w:tc>
           <w:tcPr>
-            <w:tcW w:type="dxa" w:w="2436"/>
+            <w:tcW w:type="dxa" w:w="2466"/>
+            <w:vAlign w:val="center"/>
+            <w:shd w:fill="FFFFFF" w:val="clear"/>
           </w:tcPr>
           <w:p>
             <w:r/>
@@ -2466,6 +2849,7 @@
               <w:rPr>
                 <w:rFonts w:ascii="Calibri" w:hAnsi="Calibri" w:eastAsia="Calibri"/>
                 <w:b w:val="0"/>
+                <w:color w:val="4A4A4A"/>
                 <w:sz w:val="18"/>
               </w:rPr>
             </w:r>
@@ -2473,7 +2857,9 @@
         </w:tc>
         <w:tc>
           <w:tcPr>
-            <w:tcW w:type="dxa" w:w="2436"/>
+            <w:tcW w:type="dxa" w:w="2466"/>
+            <w:vAlign w:val="center"/>
+            <w:shd w:fill="FFFFFF" w:val="clear"/>
           </w:tcPr>
           <w:p>
             <w:r/>
@@ -2481,6 +2867,7 @@
               <w:rPr>
                 <w:rFonts w:ascii="Calibri" w:hAnsi="Calibri" w:eastAsia="Calibri"/>
                 <w:b w:val="0"/>
+                <w:color w:val="4A4A4A"/>
                 <w:sz w:val="18"/>
               </w:rPr>
               <w:t>__/__/____</w:t>
@@ -2491,14 +2878,20 @@
       <w:tr>
         <w:tc>
           <w:tcPr>
-            <w:tcW w:type="dxa" w:w="2436"/>
+            <w:tcW w:type="dxa" w:w="2466"/>
+            <w:vAlign w:val="center"/>
+            <w:shd w:fill="F7F9FC" w:val="clear"/>
           </w:tcPr>
           <w:p>
+            <w:pPr>
+              <w:jc w:val="center"/>
+            </w:pPr>
             <w:r/>
             <w:r>
               <w:rPr>
                 <w:rFonts w:ascii="Calibri" w:hAnsi="Calibri" w:eastAsia="Calibri"/>
                 <w:b w:val="0"/>
+                <w:color w:val="4A4A4A"/>
                 <w:sz w:val="18"/>
               </w:rPr>
               <w:t>Engenharia</w:t>
@@ -2507,7 +2900,9 @@
         </w:tc>
         <w:tc>
           <w:tcPr>
-            <w:tcW w:type="dxa" w:w="2436"/>
+            <w:tcW w:type="dxa" w:w="2466"/>
+            <w:vAlign w:val="center"/>
+            <w:shd w:fill="F7F9FC" w:val="clear"/>
           </w:tcPr>
           <w:p>
             <w:r/>
@@ -2515,6 +2910,7 @@
               <w:rPr>
                 <w:rFonts w:ascii="Calibri" w:hAnsi="Calibri" w:eastAsia="Calibri"/>
                 <w:b w:val="0"/>
+                <w:color w:val="4A4A4A"/>
                 <w:sz w:val="18"/>
               </w:rPr>
             </w:r>
@@ -2522,7 +2918,9 @@
         </w:tc>
         <w:tc>
           <w:tcPr>
-            <w:tcW w:type="dxa" w:w="2436"/>
+            <w:tcW w:type="dxa" w:w="2466"/>
+            <w:vAlign w:val="center"/>
+            <w:shd w:fill="F7F9FC" w:val="clear"/>
           </w:tcPr>
           <w:p>
             <w:r/>
@@ -2530,6 +2928,7 @@
               <w:rPr>
                 <w:rFonts w:ascii="Calibri" w:hAnsi="Calibri" w:eastAsia="Calibri"/>
                 <w:b w:val="0"/>
+                <w:color w:val="4A4A4A"/>
                 <w:sz w:val="18"/>
               </w:rPr>
             </w:r>
@@ -2537,7 +2936,9 @@
         </w:tc>
         <w:tc>
           <w:tcPr>
-            <w:tcW w:type="dxa" w:w="2436"/>
+            <w:tcW w:type="dxa" w:w="2466"/>
+            <w:vAlign w:val="center"/>
+            <w:shd w:fill="F7F9FC" w:val="clear"/>
           </w:tcPr>
           <w:p>
             <w:r/>
@@ -2545,6 +2946,7 @@
               <w:rPr>
                 <w:rFonts w:ascii="Calibri" w:hAnsi="Calibri" w:eastAsia="Calibri"/>
                 <w:b w:val="0"/>
+                <w:color w:val="4A4A4A"/>
                 <w:sz w:val="18"/>
               </w:rPr>
               <w:t>__/__/____</w:t>
@@ -2553,10 +2955,14 @@
         </w:tc>
       </w:tr>
     </w:tbl>
-    <w:p/>
+    <w:p>
+      <w:pPr>
+        <w:spacing w:after="120"/>
+      </w:pPr>
+    </w:p>
     <w:sectPr>
-      <w:pgSz w:w="12240" w:h="15840"/>
-      <w:pgMar w:top="1020" w:right="1247" w:bottom="1020" w:left="1247" w:header="720" w:footer="720" w:gutter="0"/>
+      <w:pgSz w:w="11906" w:h="16838"/>
+      <w:pgMar w:top="850" w:right="1020" w:bottom="850" w:left="1020" w:header="720" w:footer="720" w:gutter="0"/>
       <w:cols w:space="720"/>
       <w:docGrid w:linePitch="360"/>
     </w:sectPr>

</xml_diff>